<commit_message>
Date: 26 Mar 2026
</commit_message>
<xml_diff>
--- a/Notes_SA2512006.docx
+++ b/Notes_SA2512006.docx
@@ -15340,6 +15340,407 @@
           </wp:inline>
         </w:drawing>
       </w:r>
+    </w:p>
+    <w:p>
+      <w:pPr>
+        <w:tabs>
+          <w:tab w:val="left" w:pos="1560"/>
+        </w:tabs>
+        <w:rPr>
+          <w:sz w:val="28"/>
+          <w:szCs w:val="24"/>
+          <w:lang w:val="en-US"/>
+        </w:rPr>
+      </w:pPr>
+    </w:p>
+    <w:p>
+      <w:pPr>
+        <w:tabs>
+          <w:tab w:val="left" w:pos="1560"/>
+        </w:tabs>
+        <w:rPr>
+          <w:b/>
+          <w:bCs/>
+          <w:sz w:val="28"/>
+          <w:szCs w:val="24"/>
+          <w:lang w:val="en-US"/>
+        </w:rPr>
+      </w:pPr>
+      <w:r>
+        <w:rPr>
+          <w:b/>
+          <w:bCs/>
+          <w:sz w:val="28"/>
+          <w:szCs w:val="24"/>
+          <w:lang w:val="en-US"/>
+        </w:rPr>
+        <w:t>Data Driven Framework</w:t>
+      </w:r>
+    </w:p>
+    <w:p>
+      <w:pPr>
+        <w:pStyle w:val="ListParagraph"/>
+        <w:numPr>
+          <w:ilvl w:val="0"/>
+          <w:numId w:val="39"/>
+        </w:numPr>
+        <w:tabs>
+          <w:tab w:val="left" w:pos="1560"/>
+        </w:tabs>
+        <w:rPr>
+          <w:sz w:val="28"/>
+          <w:szCs w:val="24"/>
+          <w:lang w:val="en-US"/>
+        </w:rPr>
+      </w:pPr>
+      <w:r>
+        <w:rPr>
+          <w:sz w:val="28"/>
+          <w:szCs w:val="24"/>
+          <w:lang w:val="en-US"/>
+        </w:rPr>
+        <w:t xml:space="preserve">Launch </w:t>
+      </w:r>
+      <w:hyperlink r:id="rId14" w:history="1">
+        <w:r>
+          <w:rPr>
+            <w:rStyle w:val="Hyperlink"/>
+            <w:sz w:val="28"/>
+            <w:szCs w:val="24"/>
+            <w:lang w:val="en-US"/>
+          </w:rPr>
+          <w:t>https://archive.apache.org/dist/poi/release/bin/</w:t>
+        </w:r>
+      </w:hyperlink>
+    </w:p>
+    <w:p>
+      <w:pPr>
+        <w:pStyle w:val="ListParagraph"/>
+        <w:numPr>
+          <w:ilvl w:val="0"/>
+          <w:numId w:val="39"/>
+        </w:numPr>
+        <w:tabs>
+          <w:tab w:val="left" w:pos="1560"/>
+        </w:tabs>
+        <w:rPr>
+          <w:sz w:val="28"/>
+          <w:szCs w:val="24"/>
+          <w:lang w:val="en-US"/>
+        </w:rPr>
+      </w:pPr>
+      <w:r>
+        <w:rPr>
+          <w:sz w:val="28"/>
+          <w:szCs w:val="24"/>
+          <w:lang w:val="en-US"/>
+        </w:rPr>
+        <w:t xml:space="preserve">Download </w:t>
+      </w:r>
+      <w:hyperlink r:id="rId15" w:history="1">
+        <w:r>
+          <w:rPr>
+            <w:sz w:val="28"/>
+            <w:szCs w:val="24"/>
+            <w:lang w:val="en-US"/>
+          </w:rPr>
+          <w:t>poi-bin-5.2.3-20220909.zip</w:t>
+        </w:r>
+      </w:hyperlink>
+      <w:r>
+        <w:rPr>
+          <w:sz w:val="28"/>
+          <w:szCs w:val="24"/>
+          <w:lang w:val="en-US"/>
+        </w:rPr>
+        <w:t xml:space="preserve"> file (last 4</w:t>
+      </w:r>
+      <w:r>
+        <w:rPr>
+          <w:sz w:val="28"/>
+          <w:szCs w:val="24"/>
+          <w:vertAlign w:val="superscript"/>
+          <w:lang w:val="en-US"/>
+        </w:rPr>
+        <w:t>th</w:t>
+      </w:r>
+      <w:r>
+        <w:rPr>
+          <w:sz w:val="28"/>
+          <w:szCs w:val="24"/>
+          <w:lang w:val="en-US"/>
+        </w:rPr>
+        <w:t xml:space="preserve"> position)</w:t>
+      </w:r>
+    </w:p>
+    <w:p>
+      <w:pPr>
+        <w:pStyle w:val="ListParagraph"/>
+        <w:numPr>
+          <w:ilvl w:val="0"/>
+          <w:numId w:val="39"/>
+        </w:numPr>
+        <w:tabs>
+          <w:tab w:val="left" w:pos="1560"/>
+        </w:tabs>
+        <w:rPr>
+          <w:sz w:val="28"/>
+          <w:szCs w:val="24"/>
+          <w:lang w:val="en-US"/>
+        </w:rPr>
+      </w:pPr>
+      <w:r>
+        <w:rPr>
+          <w:sz w:val="28"/>
+          <w:szCs w:val="24"/>
+          <w:lang w:val="en-US"/>
+        </w:rPr>
+        <w:t>File is downloaded in Downloads folder</w:t>
+      </w:r>
+    </w:p>
+    <w:p>
+      <w:pPr>
+        <w:pStyle w:val="ListParagraph"/>
+        <w:numPr>
+          <w:ilvl w:val="0"/>
+          <w:numId w:val="39"/>
+        </w:numPr>
+        <w:tabs>
+          <w:tab w:val="left" w:pos="1560"/>
+        </w:tabs>
+        <w:rPr>
+          <w:sz w:val="28"/>
+          <w:szCs w:val="24"/>
+          <w:lang w:val="en-US"/>
+        </w:rPr>
+      </w:pPr>
+      <w:r>
+        <w:rPr>
+          <w:sz w:val="28"/>
+          <w:szCs w:val="24"/>
+          <w:lang w:val="en-US"/>
+        </w:rPr>
+        <w:t>Copy from this folder and paste in 2</w:t>
+      </w:r>
+      <w:r>
+        <w:rPr>
+          <w:sz w:val="28"/>
+          <w:szCs w:val="24"/>
+          <w:vertAlign w:val="superscript"/>
+          <w:lang w:val="en-US"/>
+        </w:rPr>
+        <w:t>nd</w:t>
+      </w:r>
+      <w:r>
+        <w:rPr>
+          <w:sz w:val="28"/>
+          <w:szCs w:val="24"/>
+          <w:lang w:val="en-US"/>
+        </w:rPr>
+        <w:t xml:space="preserve"> folder which we created in 1</w:t>
+      </w:r>
+      <w:r>
+        <w:rPr>
+          <w:sz w:val="28"/>
+          <w:szCs w:val="24"/>
+          <w:vertAlign w:val="superscript"/>
+          <w:lang w:val="en-US"/>
+        </w:rPr>
+        <w:t>st</w:t>
+      </w:r>
+      <w:r>
+        <w:rPr>
+          <w:sz w:val="28"/>
+          <w:szCs w:val="24"/>
+          <w:lang w:val="en-US"/>
+        </w:rPr>
+        <w:t xml:space="preserve"> lecture. (Selenium Jar Files)</w:t>
+      </w:r>
+    </w:p>
+    <w:p>
+      <w:pPr>
+        <w:pStyle w:val="ListParagraph"/>
+        <w:numPr>
+          <w:ilvl w:val="0"/>
+          <w:numId w:val="39"/>
+        </w:numPr>
+        <w:tabs>
+          <w:tab w:val="left" w:pos="1560"/>
+        </w:tabs>
+        <w:rPr>
+          <w:sz w:val="28"/>
+          <w:szCs w:val="24"/>
+          <w:lang w:val="en-US"/>
+        </w:rPr>
+      </w:pPr>
+      <w:r>
+        <w:rPr>
+          <w:sz w:val="28"/>
+          <w:szCs w:val="24"/>
+          <w:lang w:val="en-US"/>
+        </w:rPr>
+        <w:t>Unzip / Extract this zip file</w:t>
+      </w:r>
+    </w:p>
+    <w:p>
+      <w:pPr>
+        <w:pStyle w:val="ListParagraph"/>
+        <w:numPr>
+          <w:ilvl w:val="0"/>
+          <w:numId w:val="39"/>
+        </w:numPr>
+        <w:tabs>
+          <w:tab w:val="left" w:pos="1560"/>
+        </w:tabs>
+        <w:rPr>
+          <w:sz w:val="28"/>
+          <w:szCs w:val="24"/>
+          <w:lang w:val="en-US"/>
+        </w:rPr>
+      </w:pPr>
+      <w:r>
+        <w:rPr>
+          <w:sz w:val="28"/>
+          <w:szCs w:val="24"/>
+          <w:lang w:val="en-US"/>
+        </w:rPr>
+        <w:t>There are total 21 files</w:t>
+      </w:r>
+    </w:p>
+    <w:p>
+      <w:pPr>
+        <w:pStyle w:val="ListParagraph"/>
+        <w:numPr>
+          <w:ilvl w:val="1"/>
+          <w:numId w:val="39"/>
+        </w:numPr>
+        <w:tabs>
+          <w:tab w:val="left" w:pos="1560"/>
+        </w:tabs>
+        <w:rPr>
+          <w:sz w:val="28"/>
+          <w:szCs w:val="24"/>
+          <w:lang w:val="en-US"/>
+        </w:rPr>
+      </w:pPr>
+      <w:r>
+        <w:rPr>
+          <w:sz w:val="28"/>
+          <w:szCs w:val="24"/>
+          <w:lang w:val="en-US"/>
+        </w:rPr>
+        <w:t>8 jar files in root folder</w:t>
+      </w:r>
+    </w:p>
+    <w:p>
+      <w:pPr>
+        <w:pStyle w:val="ListParagraph"/>
+        <w:numPr>
+          <w:ilvl w:val="1"/>
+          <w:numId w:val="39"/>
+        </w:numPr>
+        <w:tabs>
+          <w:tab w:val="left" w:pos="1560"/>
+        </w:tabs>
+        <w:rPr>
+          <w:sz w:val="28"/>
+          <w:szCs w:val="24"/>
+          <w:lang w:val="en-US"/>
+        </w:rPr>
+      </w:pPr>
+      <w:r>
+        <w:rPr>
+          <w:sz w:val="28"/>
+          <w:szCs w:val="24"/>
+          <w:lang w:val="en-US"/>
+        </w:rPr>
+        <w:t>6 files in lib folder</w:t>
+      </w:r>
+    </w:p>
+    <w:p>
+      <w:pPr>
+        <w:pStyle w:val="ListParagraph"/>
+        <w:numPr>
+          <w:ilvl w:val="1"/>
+          <w:numId w:val="39"/>
+        </w:numPr>
+        <w:tabs>
+          <w:tab w:val="left" w:pos="1560"/>
+        </w:tabs>
+        <w:rPr>
+          <w:sz w:val="28"/>
+          <w:szCs w:val="24"/>
+          <w:lang w:val="en-US"/>
+        </w:rPr>
+      </w:pPr>
+      <w:r>
+        <w:rPr>
+          <w:sz w:val="28"/>
+          <w:szCs w:val="24"/>
+          <w:lang w:val="en-US"/>
+        </w:rPr>
+        <w:t xml:space="preserve">7 files in </w:t>
+      </w:r>
+      <w:proofErr w:type="spellStart"/>
+      <w:r>
+        <w:rPr>
+          <w:sz w:val="28"/>
+          <w:szCs w:val="24"/>
+          <w:lang w:val="en-US"/>
+        </w:rPr>
+        <w:t>ooxml</w:t>
+      </w:r>
+      <w:proofErr w:type="spellEnd"/>
+      <w:r>
+        <w:rPr>
+          <w:sz w:val="28"/>
+          <w:szCs w:val="24"/>
+          <w:lang w:val="en-US"/>
+        </w:rPr>
+        <w:t>-lib folder</w:t>
+      </w:r>
+    </w:p>
+    <w:p>
+      <w:pPr>
+        <w:pStyle w:val="ListParagraph"/>
+        <w:numPr>
+          <w:ilvl w:val="0"/>
+          <w:numId w:val="39"/>
+        </w:numPr>
+        <w:tabs>
+          <w:tab w:val="left" w:pos="1560"/>
+        </w:tabs>
+        <w:rPr>
+          <w:sz w:val="28"/>
+          <w:szCs w:val="24"/>
+          <w:lang w:val="en-US"/>
+        </w:rPr>
+      </w:pPr>
+      <w:r>
+        <w:rPr>
+          <w:sz w:val="28"/>
+          <w:szCs w:val="24"/>
+          <w:lang w:val="en-US"/>
+        </w:rPr>
+        <w:t>Add all these 21 files in the project. Follow the same steps which we did in the 1</w:t>
+      </w:r>
+      <w:r>
+        <w:rPr>
+          <w:sz w:val="28"/>
+          <w:szCs w:val="24"/>
+          <w:vertAlign w:val="superscript"/>
+          <w:lang w:val="en-US"/>
+        </w:rPr>
+        <w:t>st</w:t>
+      </w:r>
+      <w:r>
+        <w:rPr>
+          <w:sz w:val="28"/>
+          <w:szCs w:val="24"/>
+          <w:lang w:val="en-US"/>
+        </w:rPr>
+        <w:t xml:space="preserve"> lecture.</w:t>
+      </w:r>
       <w:bookmarkStart w:id="0" w:name="_GoBack"/>
       <w:bookmarkEnd w:id="0"/>
     </w:p>
@@ -15784,6 +16185,95 @@
     </w:lvl>
   </w:abstractNum>
   <w:abstractNum w:abstractNumId="4">
+    <w:nsid w:val="15855398"/>
+    <w:multiLevelType w:val="hybridMultilevel"/>
+    <w:tmpl w:val="42BA2EF8"/>
+    <w:lvl w:ilvl="0" w:tplc="4009000F">
+      <w:start w:val="1"/>
+      <w:numFmt w:val="decimal"/>
+      <w:lvlText w:val="%1."/>
+      <w:lvlJc w:val="left"/>
+      <w:pPr>
+        <w:ind w:left="720" w:hanging="360"/>
+      </w:pPr>
+      <w:rPr>
+        <w:rFonts w:hint="default"/>
+      </w:rPr>
+    </w:lvl>
+    <w:lvl w:ilvl="1" w:tplc="40090019">
+      <w:start w:val="1"/>
+      <w:numFmt w:val="lowerLetter"/>
+      <w:lvlText w:val="%2."/>
+      <w:lvlJc w:val="left"/>
+      <w:pPr>
+        <w:ind w:left="1440" w:hanging="360"/>
+      </w:pPr>
+    </w:lvl>
+    <w:lvl w:ilvl="2" w:tplc="4009001B" w:tentative="1">
+      <w:start w:val="1"/>
+      <w:numFmt w:val="lowerRoman"/>
+      <w:lvlText w:val="%3."/>
+      <w:lvlJc w:val="right"/>
+      <w:pPr>
+        <w:ind w:left="2160" w:hanging="180"/>
+      </w:pPr>
+    </w:lvl>
+    <w:lvl w:ilvl="3" w:tplc="4009000F" w:tentative="1">
+      <w:start w:val="1"/>
+      <w:numFmt w:val="decimal"/>
+      <w:lvlText w:val="%4."/>
+      <w:lvlJc w:val="left"/>
+      <w:pPr>
+        <w:ind w:left="2880" w:hanging="360"/>
+      </w:pPr>
+    </w:lvl>
+    <w:lvl w:ilvl="4" w:tplc="40090019" w:tentative="1">
+      <w:start w:val="1"/>
+      <w:numFmt w:val="lowerLetter"/>
+      <w:lvlText w:val="%5."/>
+      <w:lvlJc w:val="left"/>
+      <w:pPr>
+        <w:ind w:left="3600" w:hanging="360"/>
+      </w:pPr>
+    </w:lvl>
+    <w:lvl w:ilvl="5" w:tplc="4009001B" w:tentative="1">
+      <w:start w:val="1"/>
+      <w:numFmt w:val="lowerRoman"/>
+      <w:lvlText w:val="%6."/>
+      <w:lvlJc w:val="right"/>
+      <w:pPr>
+        <w:ind w:left="4320" w:hanging="180"/>
+      </w:pPr>
+    </w:lvl>
+    <w:lvl w:ilvl="6" w:tplc="4009000F" w:tentative="1">
+      <w:start w:val="1"/>
+      <w:numFmt w:val="decimal"/>
+      <w:lvlText w:val="%7."/>
+      <w:lvlJc w:val="left"/>
+      <w:pPr>
+        <w:ind w:left="5040" w:hanging="360"/>
+      </w:pPr>
+    </w:lvl>
+    <w:lvl w:ilvl="7" w:tplc="40090019" w:tentative="1">
+      <w:start w:val="1"/>
+      <w:numFmt w:val="lowerLetter"/>
+      <w:lvlText w:val="%8."/>
+      <w:lvlJc w:val="left"/>
+      <w:pPr>
+        <w:ind w:left="5760" w:hanging="360"/>
+      </w:pPr>
+    </w:lvl>
+    <w:lvl w:ilvl="8" w:tplc="4009001B" w:tentative="1">
+      <w:start w:val="1"/>
+      <w:numFmt w:val="lowerRoman"/>
+      <w:lvlText w:val="%9."/>
+      <w:lvlJc w:val="right"/>
+      <w:pPr>
+        <w:ind w:left="6480" w:hanging="180"/>
+      </w:pPr>
+    </w:lvl>
+  </w:abstractNum>
+  <w:abstractNum w:abstractNumId="5">
     <w:nsid w:val="164D34B1"/>
     <w:multiLevelType w:val="hybridMultilevel"/>
     <w:tmpl w:val="31AACE24"/>
@@ -15896,7 +16386,7 @@
       </w:rPr>
     </w:lvl>
   </w:abstractNum>
-  <w:abstractNum w:abstractNumId="5">
+  <w:abstractNum w:abstractNumId="6">
     <w:nsid w:val="16AA1F84"/>
     <w:multiLevelType w:val="hybridMultilevel"/>
     <w:tmpl w:val="2DC0991A"/>
@@ -16009,7 +16499,7 @@
       </w:rPr>
     </w:lvl>
   </w:abstractNum>
-  <w:abstractNum w:abstractNumId="6">
+  <w:abstractNum w:abstractNumId="7">
     <w:nsid w:val="1F5D6F6F"/>
     <w:multiLevelType w:val="hybridMultilevel"/>
     <w:tmpl w:val="2C66BBE6"/>
@@ -16122,7 +16612,7 @@
       </w:rPr>
     </w:lvl>
   </w:abstractNum>
-  <w:abstractNum w:abstractNumId="7">
+  <w:abstractNum w:abstractNumId="8">
     <w:nsid w:val="1FFE0324"/>
     <w:multiLevelType w:val="hybridMultilevel"/>
     <w:tmpl w:val="562439F6"/>
@@ -16235,7 +16725,7 @@
       </w:rPr>
     </w:lvl>
   </w:abstractNum>
-  <w:abstractNum w:abstractNumId="8">
+  <w:abstractNum w:abstractNumId="9">
     <w:nsid w:val="21270C12"/>
     <w:multiLevelType w:val="hybridMultilevel"/>
     <w:tmpl w:val="77C8B216"/>
@@ -16348,7 +16838,7 @@
       </w:rPr>
     </w:lvl>
   </w:abstractNum>
-  <w:abstractNum w:abstractNumId="9">
+  <w:abstractNum w:abstractNumId="10">
     <w:nsid w:val="26EA2626"/>
     <w:multiLevelType w:val="hybridMultilevel"/>
     <w:tmpl w:val="6D525678"/>
@@ -16434,7 +16924,7 @@
       </w:pPr>
     </w:lvl>
   </w:abstractNum>
-  <w:abstractNum w:abstractNumId="10">
+  <w:abstractNum w:abstractNumId="11">
     <w:nsid w:val="2BD5541D"/>
     <w:multiLevelType w:val="hybridMultilevel"/>
     <w:tmpl w:val="45505B90"/>
@@ -16547,7 +17037,7 @@
       </w:rPr>
     </w:lvl>
   </w:abstractNum>
-  <w:abstractNum w:abstractNumId="11">
+  <w:abstractNum w:abstractNumId="12">
     <w:nsid w:val="2C310AF1"/>
     <w:multiLevelType w:val="hybridMultilevel"/>
     <w:tmpl w:val="D80E52EC"/>
@@ -16660,7 +17150,7 @@
       </w:rPr>
     </w:lvl>
   </w:abstractNum>
-  <w:abstractNum w:abstractNumId="12">
+  <w:abstractNum w:abstractNumId="13">
     <w:nsid w:val="2DF83EE9"/>
     <w:multiLevelType w:val="hybridMultilevel"/>
     <w:tmpl w:val="5C824650"/>
@@ -16773,7 +17263,7 @@
       </w:rPr>
     </w:lvl>
   </w:abstractNum>
-  <w:abstractNum w:abstractNumId="13">
+  <w:abstractNum w:abstractNumId="14">
     <w:nsid w:val="2ED85F35"/>
     <w:multiLevelType w:val="hybridMultilevel"/>
     <w:tmpl w:val="D396C416"/>
@@ -16862,7 +17352,7 @@
       </w:pPr>
     </w:lvl>
   </w:abstractNum>
-  <w:abstractNum w:abstractNumId="14">
+  <w:abstractNum w:abstractNumId="15">
     <w:nsid w:val="2F5B6010"/>
     <w:multiLevelType w:val="hybridMultilevel"/>
     <w:tmpl w:val="303E3506"/>
@@ -16975,7 +17465,7 @@
       </w:rPr>
     </w:lvl>
   </w:abstractNum>
-  <w:abstractNum w:abstractNumId="15">
+  <w:abstractNum w:abstractNumId="16">
     <w:nsid w:val="344C7AD5"/>
     <w:multiLevelType w:val="hybridMultilevel"/>
     <w:tmpl w:val="3AB6C236"/>
@@ -17088,7 +17578,7 @@
       </w:rPr>
     </w:lvl>
   </w:abstractNum>
-  <w:abstractNum w:abstractNumId="16">
+  <w:abstractNum w:abstractNumId="17">
     <w:nsid w:val="372A7643"/>
     <w:multiLevelType w:val="hybridMultilevel"/>
     <w:tmpl w:val="72661F18"/>
@@ -17201,7 +17691,7 @@
       </w:rPr>
     </w:lvl>
   </w:abstractNum>
-  <w:abstractNum w:abstractNumId="17">
+  <w:abstractNum w:abstractNumId="18">
     <w:nsid w:val="398E3101"/>
     <w:multiLevelType w:val="hybridMultilevel"/>
     <w:tmpl w:val="5972D984"/>
@@ -17287,7 +17777,7 @@
       </w:pPr>
     </w:lvl>
   </w:abstractNum>
-  <w:abstractNum w:abstractNumId="18">
+  <w:abstractNum w:abstractNumId="19">
     <w:nsid w:val="3CDB6A66"/>
     <w:multiLevelType w:val="hybridMultilevel"/>
     <w:tmpl w:val="64685F9A"/>
@@ -17376,7 +17866,7 @@
       </w:pPr>
     </w:lvl>
   </w:abstractNum>
-  <w:abstractNum w:abstractNumId="19">
+  <w:abstractNum w:abstractNumId="20">
     <w:nsid w:val="3CE011C3"/>
     <w:multiLevelType w:val="hybridMultilevel"/>
     <w:tmpl w:val="31EA3DA2"/>
@@ -17465,7 +17955,7 @@
       </w:pPr>
     </w:lvl>
   </w:abstractNum>
-  <w:abstractNum w:abstractNumId="20">
+  <w:abstractNum w:abstractNumId="21">
     <w:nsid w:val="42DB17C6"/>
     <w:multiLevelType w:val="hybridMultilevel"/>
     <w:tmpl w:val="B638096C"/>
@@ -17554,7 +18044,7 @@
       </w:pPr>
     </w:lvl>
   </w:abstractNum>
-  <w:abstractNum w:abstractNumId="21">
+  <w:abstractNum w:abstractNumId="22">
     <w:nsid w:val="44424C1B"/>
     <w:multiLevelType w:val="hybridMultilevel"/>
     <w:tmpl w:val="EBDAADA4"/>
@@ -17667,7 +18157,7 @@
       </w:rPr>
     </w:lvl>
   </w:abstractNum>
-  <w:abstractNum w:abstractNumId="22">
+  <w:abstractNum w:abstractNumId="23">
     <w:nsid w:val="46DF09B1"/>
     <w:multiLevelType w:val="hybridMultilevel"/>
     <w:tmpl w:val="FB0236F0"/>
@@ -17780,7 +18270,7 @@
       </w:rPr>
     </w:lvl>
   </w:abstractNum>
-  <w:abstractNum w:abstractNumId="23">
+  <w:abstractNum w:abstractNumId="24">
     <w:nsid w:val="47F70A7E"/>
     <w:multiLevelType w:val="hybridMultilevel"/>
     <w:tmpl w:val="BCF8131E"/>
@@ -17869,7 +18359,7 @@
       </w:pPr>
     </w:lvl>
   </w:abstractNum>
-  <w:abstractNum w:abstractNumId="24">
+  <w:abstractNum w:abstractNumId="25">
     <w:nsid w:val="4FAE1062"/>
     <w:multiLevelType w:val="hybridMultilevel"/>
     <w:tmpl w:val="C1A67A02"/>
@@ -17958,7 +18448,7 @@
       </w:pPr>
     </w:lvl>
   </w:abstractNum>
-  <w:abstractNum w:abstractNumId="25">
+  <w:abstractNum w:abstractNumId="26">
     <w:nsid w:val="50CF4F8C"/>
     <w:multiLevelType w:val="hybridMultilevel"/>
     <w:tmpl w:val="082E2B26"/>
@@ -18071,7 +18561,7 @@
       </w:rPr>
     </w:lvl>
   </w:abstractNum>
-  <w:abstractNum w:abstractNumId="26">
+  <w:abstractNum w:abstractNumId="27">
     <w:nsid w:val="56DC0393"/>
     <w:multiLevelType w:val="hybridMultilevel"/>
     <w:tmpl w:val="BFA6E070"/>
@@ -18184,7 +18674,7 @@
       </w:rPr>
     </w:lvl>
   </w:abstractNum>
-  <w:abstractNum w:abstractNumId="27">
+  <w:abstractNum w:abstractNumId="28">
     <w:nsid w:val="5D2E0595"/>
     <w:multiLevelType w:val="hybridMultilevel"/>
     <w:tmpl w:val="BD76ED2E"/>
@@ -18297,7 +18787,7 @@
       </w:rPr>
     </w:lvl>
   </w:abstractNum>
-  <w:abstractNum w:abstractNumId="28">
+  <w:abstractNum w:abstractNumId="29">
     <w:nsid w:val="64B248FF"/>
     <w:multiLevelType w:val="hybridMultilevel"/>
     <w:tmpl w:val="47BA2214"/>
@@ -18410,7 +18900,7 @@
       </w:rPr>
     </w:lvl>
   </w:abstractNum>
-  <w:abstractNum w:abstractNumId="29">
+  <w:abstractNum w:abstractNumId="30">
     <w:nsid w:val="64D75A0A"/>
     <w:multiLevelType w:val="hybridMultilevel"/>
     <w:tmpl w:val="F93653D8"/>
@@ -18523,7 +19013,7 @@
       </w:rPr>
     </w:lvl>
   </w:abstractNum>
-  <w:abstractNum w:abstractNumId="30">
+  <w:abstractNum w:abstractNumId="31">
     <w:nsid w:val="65A70915"/>
     <w:multiLevelType w:val="hybridMultilevel"/>
     <w:tmpl w:val="F4BEB16C"/>
@@ -18612,7 +19102,7 @@
       </w:pPr>
     </w:lvl>
   </w:abstractNum>
-  <w:abstractNum w:abstractNumId="31">
+  <w:abstractNum w:abstractNumId="32">
     <w:nsid w:val="667572E6"/>
     <w:multiLevelType w:val="hybridMultilevel"/>
     <w:tmpl w:val="375E6AAA"/>
@@ -18701,7 +19191,7 @@
       </w:pPr>
     </w:lvl>
   </w:abstractNum>
-  <w:abstractNum w:abstractNumId="32">
+  <w:abstractNum w:abstractNumId="33">
     <w:nsid w:val="6794711A"/>
     <w:multiLevelType w:val="hybridMultilevel"/>
     <w:tmpl w:val="7D58095C"/>
@@ -18814,7 +19304,7 @@
       </w:rPr>
     </w:lvl>
   </w:abstractNum>
-  <w:abstractNum w:abstractNumId="33">
+  <w:abstractNum w:abstractNumId="34">
     <w:nsid w:val="6D6046F6"/>
     <w:multiLevelType w:val="hybridMultilevel"/>
     <w:tmpl w:val="6644C14E"/>
@@ -18903,7 +19393,7 @@
       </w:pPr>
     </w:lvl>
   </w:abstractNum>
-  <w:abstractNum w:abstractNumId="34">
+  <w:abstractNum w:abstractNumId="35">
     <w:nsid w:val="6FB6583E"/>
     <w:multiLevelType w:val="hybridMultilevel"/>
     <w:tmpl w:val="F83A92A4"/>
@@ -19016,7 +19506,7 @@
       </w:rPr>
     </w:lvl>
   </w:abstractNum>
-  <w:abstractNum w:abstractNumId="35">
+  <w:abstractNum w:abstractNumId="36">
     <w:nsid w:val="7782158E"/>
     <w:multiLevelType w:val="hybridMultilevel"/>
     <w:tmpl w:val="6068CD52"/>
@@ -19129,7 +19619,7 @@
       </w:rPr>
     </w:lvl>
   </w:abstractNum>
-  <w:abstractNum w:abstractNumId="36">
+  <w:abstractNum w:abstractNumId="37">
     <w:nsid w:val="797C6995"/>
     <w:multiLevelType w:val="hybridMultilevel"/>
     <w:tmpl w:val="71483934"/>
@@ -19242,7 +19732,7 @@
       </w:rPr>
     </w:lvl>
   </w:abstractNum>
-  <w:abstractNum w:abstractNumId="37">
+  <w:abstractNum w:abstractNumId="38">
     <w:nsid w:val="7D1867D1"/>
     <w:multiLevelType w:val="hybridMultilevel"/>
     <w:tmpl w:val="378A0E78"/>
@@ -19356,19 +19846,19 @@
     </w:lvl>
   </w:abstractNum>
   <w:num w:numId="1">
-    <w:abstractNumId w:val="15"/>
+    <w:abstractNumId w:val="16"/>
   </w:num>
   <w:num w:numId="2">
-    <w:abstractNumId w:val="37"/>
+    <w:abstractNumId w:val="38"/>
   </w:num>
   <w:num w:numId="3">
     <w:abstractNumId w:val="0"/>
   </w:num>
   <w:num w:numId="4">
-    <w:abstractNumId w:val="17"/>
+    <w:abstractNumId w:val="18"/>
   </w:num>
   <w:num w:numId="5">
-    <w:abstractNumId w:val="14"/>
+    <w:abstractNumId w:val="15"/>
   </w:num>
   <w:num w:numId="6">
     <w:abstractNumId w:val="2"/>
@@ -19377,97 +19867,100 @@
     <w:abstractNumId w:val="1"/>
   </w:num>
   <w:num w:numId="8">
+    <w:abstractNumId w:val="11"/>
+  </w:num>
+  <w:num w:numId="9">
+    <w:abstractNumId w:val="35"/>
+  </w:num>
+  <w:num w:numId="10">
+    <w:abstractNumId w:val="8"/>
+  </w:num>
+  <w:num w:numId="11">
+    <w:abstractNumId w:val="27"/>
+  </w:num>
+  <w:num w:numId="12">
+    <w:abstractNumId w:val="29"/>
+  </w:num>
+  <w:num w:numId="13">
     <w:abstractNumId w:val="10"/>
   </w:num>
-  <w:num w:numId="9">
-    <w:abstractNumId w:val="34"/>
-  </w:num>
-  <w:num w:numId="10">
-    <w:abstractNumId w:val="7"/>
-  </w:num>
-  <w:num w:numId="11">
-    <w:abstractNumId w:val="26"/>
-  </w:num>
-  <w:num w:numId="12">
-    <w:abstractNumId w:val="28"/>
-  </w:num>
-  <w:num w:numId="13">
-    <w:abstractNumId w:val="9"/>
-  </w:num>
   <w:num w:numId="14">
-    <w:abstractNumId w:val="23"/>
+    <w:abstractNumId w:val="24"/>
   </w:num>
   <w:num w:numId="15">
     <w:abstractNumId w:val="3"/>
   </w:num>
   <w:num w:numId="16">
+    <w:abstractNumId w:val="32"/>
+  </w:num>
+  <w:num w:numId="17">
     <w:abstractNumId w:val="31"/>
   </w:num>
-  <w:num w:numId="17">
+  <w:num w:numId="18">
+    <w:abstractNumId w:val="33"/>
+  </w:num>
+  <w:num w:numId="19">
+    <w:abstractNumId w:val="36"/>
+  </w:num>
+  <w:num w:numId="20">
+    <w:abstractNumId w:val="7"/>
+  </w:num>
+  <w:num w:numId="21">
+    <w:abstractNumId w:val="37"/>
+  </w:num>
+  <w:num w:numId="22">
+    <w:abstractNumId w:val="26"/>
+  </w:num>
+  <w:num w:numId="23">
+    <w:abstractNumId w:val="23"/>
+  </w:num>
+  <w:num w:numId="24">
+    <w:abstractNumId w:val="28"/>
+  </w:num>
+  <w:num w:numId="25">
+    <w:abstractNumId w:val="9"/>
+  </w:num>
+  <w:num w:numId="26">
+    <w:abstractNumId w:val="34"/>
+  </w:num>
+  <w:num w:numId="27">
+    <w:abstractNumId w:val="13"/>
+  </w:num>
+  <w:num w:numId="28">
+    <w:abstractNumId w:val="6"/>
+  </w:num>
+  <w:num w:numId="29">
+    <w:abstractNumId w:val="21"/>
+  </w:num>
+  <w:num w:numId="30">
+    <w:abstractNumId w:val="20"/>
+  </w:num>
+  <w:num w:numId="31">
+    <w:abstractNumId w:val="25"/>
+  </w:num>
+  <w:num w:numId="32">
+    <w:abstractNumId w:val="5"/>
+  </w:num>
+  <w:num w:numId="33">
+    <w:abstractNumId w:val="14"/>
+  </w:num>
+  <w:num w:numId="34">
+    <w:abstractNumId w:val="19"/>
+  </w:num>
+  <w:num w:numId="35">
+    <w:abstractNumId w:val="17"/>
+  </w:num>
+  <w:num w:numId="36">
     <w:abstractNumId w:val="30"/>
   </w:num>
-  <w:num w:numId="18">
-    <w:abstractNumId w:val="32"/>
-  </w:num>
-  <w:num w:numId="19">
-    <w:abstractNumId w:val="35"/>
-  </w:num>
-  <w:num w:numId="20">
-    <w:abstractNumId w:val="6"/>
-  </w:num>
-  <w:num w:numId="21">
-    <w:abstractNumId w:val="36"/>
-  </w:num>
-  <w:num w:numId="22">
-    <w:abstractNumId w:val="25"/>
-  </w:num>
-  <w:num w:numId="23">
+  <w:num w:numId="37">
     <w:abstractNumId w:val="22"/>
   </w:num>
-  <w:num w:numId="24">
-    <w:abstractNumId w:val="27"/>
-  </w:num>
-  <w:num w:numId="25">
-    <w:abstractNumId w:val="8"/>
-  </w:num>
-  <w:num w:numId="26">
-    <w:abstractNumId w:val="33"/>
-  </w:num>
-  <w:num w:numId="27">
+  <w:num w:numId="38">
     <w:abstractNumId w:val="12"/>
   </w:num>
-  <w:num w:numId="28">
-    <w:abstractNumId w:val="5"/>
-  </w:num>
-  <w:num w:numId="29">
-    <w:abstractNumId w:val="20"/>
-  </w:num>
-  <w:num w:numId="30">
-    <w:abstractNumId w:val="19"/>
-  </w:num>
-  <w:num w:numId="31">
-    <w:abstractNumId w:val="24"/>
-  </w:num>
-  <w:num w:numId="32">
+  <w:num w:numId="39">
     <w:abstractNumId w:val="4"/>
-  </w:num>
-  <w:num w:numId="33">
-    <w:abstractNumId w:val="13"/>
-  </w:num>
-  <w:num w:numId="34">
-    <w:abstractNumId w:val="18"/>
-  </w:num>
-  <w:num w:numId="35">
-    <w:abstractNumId w:val="16"/>
-  </w:num>
-  <w:num w:numId="36">
-    <w:abstractNumId w:val="29"/>
-  </w:num>
-  <w:num w:numId="37">
-    <w:abstractNumId w:val="21"/>
-  </w:num>
-  <w:num w:numId="38">
-    <w:abstractNumId w:val="11"/>
   </w:num>
 </w:numbering>
 </file>
@@ -19910,7 +20403,6 @@
     <w:name w:val="Hyperlink"/>
     <w:basedOn w:val="DefaultParagraphFont"/>
     <w:uiPriority w:val="99"/>
-    <w:semiHidden/>
     <w:unhideWhenUsed/>
     <w:rsid w:val="00756FC3"/>
     <w:rPr>
@@ -19927,6 +20419,54 @@
     <w:name w:val="webkit-html-attribute-value"/>
     <w:basedOn w:val="DefaultParagraphFont"/>
     <w:rsid w:val="004C26F8"/>
+  </w:style>
+  <w:style w:type="paragraph" w:styleId="HTMLPreformatted">
+    <w:name w:val="HTML Preformatted"/>
+    <w:basedOn w:val="Normal"/>
+    <w:link w:val="HTMLPreformattedChar"/>
+    <w:uiPriority w:val="99"/>
+    <w:semiHidden/>
+    <w:unhideWhenUsed/>
+    <w:rsid w:val="00E02CD1"/>
+    <w:pPr>
+      <w:tabs>
+        <w:tab w:val="left" w:pos="916"/>
+        <w:tab w:val="left" w:pos="1832"/>
+        <w:tab w:val="left" w:pos="2748"/>
+        <w:tab w:val="left" w:pos="3664"/>
+        <w:tab w:val="left" w:pos="4580"/>
+        <w:tab w:val="left" w:pos="5496"/>
+        <w:tab w:val="left" w:pos="6412"/>
+        <w:tab w:val="left" w:pos="7328"/>
+        <w:tab w:val="left" w:pos="8244"/>
+        <w:tab w:val="left" w:pos="9160"/>
+        <w:tab w:val="left" w:pos="10076"/>
+        <w:tab w:val="left" w:pos="10992"/>
+        <w:tab w:val="left" w:pos="11908"/>
+        <w:tab w:val="left" w:pos="12824"/>
+        <w:tab w:val="left" w:pos="13740"/>
+        <w:tab w:val="left" w:pos="14656"/>
+      </w:tabs>
+      <w:spacing w:after="0" w:line="240" w:lineRule="auto"/>
+    </w:pPr>
+    <w:rPr>
+      <w:rFonts w:ascii="Courier New" w:eastAsia="Times New Roman" w:hAnsi="Courier New" w:cs="Courier New"/>
+      <w:sz w:val="20"/>
+      <w:lang w:eastAsia="en-IN"/>
+    </w:rPr>
+  </w:style>
+  <w:style w:type="character" w:customStyle="1" w:styleId="HTMLPreformattedChar">
+    <w:name w:val="HTML Preformatted Char"/>
+    <w:basedOn w:val="DefaultParagraphFont"/>
+    <w:link w:val="HTMLPreformatted"/>
+    <w:uiPriority w:val="99"/>
+    <w:semiHidden/>
+    <w:rsid w:val="00E02CD1"/>
+    <w:rPr>
+      <w:rFonts w:ascii="Courier New" w:eastAsia="Times New Roman" w:hAnsi="Courier New" w:cs="Courier New"/>
+      <w:sz w:val="20"/>
+      <w:lang w:eastAsia="en-IN"/>
+    </w:rPr>
   </w:style>
 </w:styles>
 </file>
@@ -21001,31 +21541,31 @@
     </dgm:pt>
   </dgm:ptLst>
   <dgm:cxnLst>
-    <dgm:cxn modelId="{E742DB2C-79EA-4800-98E8-64EDA7BC856F}" type="presOf" srcId="{66AF4BFC-0875-4B90-9E82-F0F301500281}" destId="{09BDDF38-02A3-46F0-94CF-D671EECCB993}" srcOrd="0" destOrd="0" presId="urn:microsoft.com/office/officeart/2005/8/layout/process1"/>
-    <dgm:cxn modelId="{822E9BE2-3A70-440E-8FB9-8E1D0CC0D2EB}" type="presOf" srcId="{363330DA-09EC-450B-A72E-6DA34D1AB715}" destId="{37E28D18-C070-47FF-8301-A041A91EDEF2}" srcOrd="0" destOrd="0" presId="urn:microsoft.com/office/officeart/2005/8/layout/process1"/>
-    <dgm:cxn modelId="{238093F1-E758-4615-8348-81A6858F461F}" type="presOf" srcId="{E9687206-84AC-4F83-A6A2-9EFDC3ABD0FB}" destId="{72E9BEC7-D7FE-4BD7-BACA-0668A095A9EF}" srcOrd="0" destOrd="0" presId="urn:microsoft.com/office/officeart/2005/8/layout/process1"/>
-    <dgm:cxn modelId="{5978DCCE-6D9B-4545-A809-4D8DA32F3856}" type="presOf" srcId="{66AF4BFC-0875-4B90-9E82-F0F301500281}" destId="{A0BD6892-BF4E-4D26-B32D-4AC8D13032DE}" srcOrd="1" destOrd="0" presId="urn:microsoft.com/office/officeart/2005/8/layout/process1"/>
-    <dgm:cxn modelId="{B8383A7D-78DD-404B-AFF5-63D4C565D520}" type="presOf" srcId="{6C124C00-0E2C-42A5-B356-FCFE12C422EE}" destId="{A5E00DF4-BEC8-4A62-B851-2A7F83FC9D35}" srcOrd="0" destOrd="0" presId="urn:microsoft.com/office/officeart/2005/8/layout/process1"/>
+    <dgm:cxn modelId="{8BADACC1-11B7-4449-8CEF-27159F593338}" srcId="{252D6598-1225-44AB-8AAB-B516106B59E1}" destId="{D8AAE93C-983F-46D6-ABF6-FC8E801A362E}" srcOrd="3" destOrd="0" parTransId="{E327365F-F469-481B-89E5-1C83ABC9E692}" sibTransId="{B97F4576-B840-4726-92AE-9C44A7C27E74}"/>
     <dgm:cxn modelId="{4E00299D-3BDF-41B7-A234-E37BB604D85F}" srcId="{252D6598-1225-44AB-8AAB-B516106B59E1}" destId="{49728974-DA1C-46AA-A2B0-D3394453E5CC}" srcOrd="1" destOrd="0" parTransId="{2F909F4C-E59D-48F8-B67A-5D6A03CEBAEE}" sibTransId="{E9687206-84AC-4F83-A6A2-9EFDC3ABD0FB}"/>
-    <dgm:cxn modelId="{9C16A34F-24E8-48FA-8DC2-8CB15174DC96}" type="presOf" srcId="{252D6598-1225-44AB-8AAB-B516106B59E1}" destId="{2446BD26-396F-420D-B091-265286D97786}" srcOrd="0" destOrd="0" presId="urn:microsoft.com/office/officeart/2005/8/layout/process1"/>
-    <dgm:cxn modelId="{CACAAA83-163B-4DB9-84ED-86C37D4AD9E7}" type="presOf" srcId="{49728974-DA1C-46AA-A2B0-D3394453E5CC}" destId="{CF1E89C8-AA78-4B1C-8D7C-AA8E38C034CE}" srcOrd="0" destOrd="0" presId="urn:microsoft.com/office/officeart/2005/8/layout/process1"/>
-    <dgm:cxn modelId="{9600CACA-04D6-48AF-8220-EAA7154541E5}" type="presOf" srcId="{6C124C00-0E2C-42A5-B356-FCFE12C422EE}" destId="{AEA95148-3CF9-4188-ACFA-34C472C532BE}" srcOrd="1" destOrd="0" presId="urn:microsoft.com/office/officeart/2005/8/layout/process1"/>
+    <dgm:cxn modelId="{1CD4372E-1F13-44FD-AB5F-96031C02C4F1}" type="presOf" srcId="{30AFFC78-5808-45ED-AAC6-491EC3980094}" destId="{F266C578-88AA-4EC2-8142-53A5B6139B0D}" srcOrd="0" destOrd="0" presId="urn:microsoft.com/office/officeart/2005/8/layout/process1"/>
+    <dgm:cxn modelId="{2874BE82-D33C-48DF-8EC6-7FC4FBCC2AA0}" type="presOf" srcId="{6C124C00-0E2C-42A5-B356-FCFE12C422EE}" destId="{AEA95148-3CF9-4188-ACFA-34C472C532BE}" srcOrd="1" destOrd="0" presId="urn:microsoft.com/office/officeart/2005/8/layout/process1"/>
+    <dgm:cxn modelId="{86DC515D-D9C6-47D2-A2DF-8862FD5C11CD}" type="presOf" srcId="{66AF4BFC-0875-4B90-9E82-F0F301500281}" destId="{A0BD6892-BF4E-4D26-B32D-4AC8D13032DE}" srcOrd="1" destOrd="0" presId="urn:microsoft.com/office/officeart/2005/8/layout/process1"/>
+    <dgm:cxn modelId="{224CAA17-2837-4710-A506-CC47626C0119}" type="presOf" srcId="{363330DA-09EC-450B-A72E-6DA34D1AB715}" destId="{37E28D18-C070-47FF-8301-A041A91EDEF2}" srcOrd="0" destOrd="0" presId="urn:microsoft.com/office/officeart/2005/8/layout/process1"/>
+    <dgm:cxn modelId="{D445FA38-70DE-4E6D-9324-46CF5DF78908}" type="presOf" srcId="{49728974-DA1C-46AA-A2B0-D3394453E5CC}" destId="{CF1E89C8-AA78-4B1C-8D7C-AA8E38C034CE}" srcOrd="0" destOrd="0" presId="urn:microsoft.com/office/officeart/2005/8/layout/process1"/>
+    <dgm:cxn modelId="{C1741D2C-CE1F-4277-92D3-C40C1462DB3C}" type="presOf" srcId="{66AF4BFC-0875-4B90-9E82-F0F301500281}" destId="{09BDDF38-02A3-46F0-94CF-D671EECCB993}" srcOrd="0" destOrd="0" presId="urn:microsoft.com/office/officeart/2005/8/layout/process1"/>
+    <dgm:cxn modelId="{2EA8453A-8229-46C5-B4D3-521D01069AAD}" type="presOf" srcId="{252D6598-1225-44AB-8AAB-B516106B59E1}" destId="{2446BD26-396F-420D-B091-265286D97786}" srcOrd="0" destOrd="0" presId="urn:microsoft.com/office/officeart/2005/8/layout/process1"/>
     <dgm:cxn modelId="{2659B5CA-FCEC-47A0-A347-15E4CED75EE1}" srcId="{252D6598-1225-44AB-8AAB-B516106B59E1}" destId="{30AFFC78-5808-45ED-AAC6-491EC3980094}" srcOrd="0" destOrd="0" parTransId="{15AA4179-7B4E-411C-A1D6-081E6042F5DA}" sibTransId="{6C124C00-0E2C-42A5-B356-FCFE12C422EE}"/>
-    <dgm:cxn modelId="{3162449F-9541-44F8-91FA-967B84D81CE8}" type="presOf" srcId="{30AFFC78-5808-45ED-AAC6-491EC3980094}" destId="{F266C578-88AA-4EC2-8142-53A5B6139B0D}" srcOrd="0" destOrd="0" presId="urn:microsoft.com/office/officeart/2005/8/layout/process1"/>
-    <dgm:cxn modelId="{8BADACC1-11B7-4449-8CEF-27159F593338}" srcId="{252D6598-1225-44AB-8AAB-B516106B59E1}" destId="{D8AAE93C-983F-46D6-ABF6-FC8E801A362E}" srcOrd="3" destOrd="0" parTransId="{E327365F-F469-481B-89E5-1C83ABC9E692}" sibTransId="{B97F4576-B840-4726-92AE-9C44A7C27E74}"/>
+    <dgm:cxn modelId="{27051F91-150F-4B22-8E81-CE70FC831F4F}" type="presOf" srcId="{6C124C00-0E2C-42A5-B356-FCFE12C422EE}" destId="{A5E00DF4-BEC8-4A62-B851-2A7F83FC9D35}" srcOrd="0" destOrd="0" presId="urn:microsoft.com/office/officeart/2005/8/layout/process1"/>
+    <dgm:cxn modelId="{1817F842-1CBF-4549-A66F-B8FE878D385A}" type="presOf" srcId="{E9687206-84AC-4F83-A6A2-9EFDC3ABD0FB}" destId="{6E444586-2D87-4F9A-9400-F626352FE57E}" srcOrd="1" destOrd="0" presId="urn:microsoft.com/office/officeart/2005/8/layout/process1"/>
+    <dgm:cxn modelId="{B8BA267A-9AF0-4756-B701-0ACE76628FCC}" type="presOf" srcId="{D8AAE93C-983F-46D6-ABF6-FC8E801A362E}" destId="{449D7EB5-0D9D-4DAC-B391-FB2402C39ABC}" srcOrd="0" destOrd="0" presId="urn:microsoft.com/office/officeart/2005/8/layout/process1"/>
+    <dgm:cxn modelId="{54696D25-6501-4F75-A343-A0D8F363437B}" type="presOf" srcId="{E9687206-84AC-4F83-A6A2-9EFDC3ABD0FB}" destId="{72E9BEC7-D7FE-4BD7-BACA-0668A095A9EF}" srcOrd="0" destOrd="0" presId="urn:microsoft.com/office/officeart/2005/8/layout/process1"/>
     <dgm:cxn modelId="{D0AB89FD-DD46-4E02-92EC-A604D66D139C}" srcId="{252D6598-1225-44AB-8AAB-B516106B59E1}" destId="{363330DA-09EC-450B-A72E-6DA34D1AB715}" srcOrd="2" destOrd="0" parTransId="{560647A9-7192-429E-B7E3-DFDF675B6572}" sibTransId="{66AF4BFC-0875-4B90-9E82-F0F301500281}"/>
-    <dgm:cxn modelId="{D81BCB55-6976-4085-9941-C4028C5CAC44}" type="presOf" srcId="{D8AAE93C-983F-46D6-ABF6-FC8E801A362E}" destId="{449D7EB5-0D9D-4DAC-B391-FB2402C39ABC}" srcOrd="0" destOrd="0" presId="urn:microsoft.com/office/officeart/2005/8/layout/process1"/>
-    <dgm:cxn modelId="{C94E5583-CCB7-4CF2-9888-1A511D3BC3B6}" type="presOf" srcId="{E9687206-84AC-4F83-A6A2-9EFDC3ABD0FB}" destId="{6E444586-2D87-4F9A-9400-F626352FE57E}" srcOrd="1" destOrd="0" presId="urn:microsoft.com/office/officeart/2005/8/layout/process1"/>
-    <dgm:cxn modelId="{4A6231F1-739C-4832-9323-8AC3C94AC3E7}" type="presParOf" srcId="{2446BD26-396F-420D-B091-265286D97786}" destId="{F266C578-88AA-4EC2-8142-53A5B6139B0D}" srcOrd="0" destOrd="0" presId="urn:microsoft.com/office/officeart/2005/8/layout/process1"/>
-    <dgm:cxn modelId="{9CE81922-0411-4340-A44C-502889AF087E}" type="presParOf" srcId="{2446BD26-396F-420D-B091-265286D97786}" destId="{A5E00DF4-BEC8-4A62-B851-2A7F83FC9D35}" srcOrd="1" destOrd="0" presId="urn:microsoft.com/office/officeart/2005/8/layout/process1"/>
-    <dgm:cxn modelId="{18D5979B-3999-4BFB-ACB1-3D2D89F0BB91}" type="presParOf" srcId="{A5E00DF4-BEC8-4A62-B851-2A7F83FC9D35}" destId="{AEA95148-3CF9-4188-ACFA-34C472C532BE}" srcOrd="0" destOrd="0" presId="urn:microsoft.com/office/officeart/2005/8/layout/process1"/>
-    <dgm:cxn modelId="{0BB1123F-7089-4745-B0A7-E11E5C1AE3A2}" type="presParOf" srcId="{2446BD26-396F-420D-B091-265286D97786}" destId="{CF1E89C8-AA78-4B1C-8D7C-AA8E38C034CE}" srcOrd="2" destOrd="0" presId="urn:microsoft.com/office/officeart/2005/8/layout/process1"/>
-    <dgm:cxn modelId="{88172D3D-39E2-48D9-BD8A-026FE61533C7}" type="presParOf" srcId="{2446BD26-396F-420D-B091-265286D97786}" destId="{72E9BEC7-D7FE-4BD7-BACA-0668A095A9EF}" srcOrd="3" destOrd="0" presId="urn:microsoft.com/office/officeart/2005/8/layout/process1"/>
-    <dgm:cxn modelId="{EB1F9726-55EE-4484-955A-701B348B339A}" type="presParOf" srcId="{72E9BEC7-D7FE-4BD7-BACA-0668A095A9EF}" destId="{6E444586-2D87-4F9A-9400-F626352FE57E}" srcOrd="0" destOrd="0" presId="urn:microsoft.com/office/officeart/2005/8/layout/process1"/>
-    <dgm:cxn modelId="{E116E3ED-975E-45B4-A5E9-C376ABEDAB5B}" type="presParOf" srcId="{2446BD26-396F-420D-B091-265286D97786}" destId="{37E28D18-C070-47FF-8301-A041A91EDEF2}" srcOrd="4" destOrd="0" presId="urn:microsoft.com/office/officeart/2005/8/layout/process1"/>
-    <dgm:cxn modelId="{AF4132D1-BAD7-4FCC-B93F-CDAB94D9583F}" type="presParOf" srcId="{2446BD26-396F-420D-B091-265286D97786}" destId="{09BDDF38-02A3-46F0-94CF-D671EECCB993}" srcOrd="5" destOrd="0" presId="urn:microsoft.com/office/officeart/2005/8/layout/process1"/>
-    <dgm:cxn modelId="{40627BE1-EACC-4128-9FC8-F48959A0106A}" type="presParOf" srcId="{09BDDF38-02A3-46F0-94CF-D671EECCB993}" destId="{A0BD6892-BF4E-4D26-B32D-4AC8D13032DE}" srcOrd="0" destOrd="0" presId="urn:microsoft.com/office/officeart/2005/8/layout/process1"/>
-    <dgm:cxn modelId="{ABE1BFB7-CB8F-4ED6-8B54-B8FEE4A2B2A3}" type="presParOf" srcId="{2446BD26-396F-420D-B091-265286D97786}" destId="{449D7EB5-0D9D-4DAC-B391-FB2402C39ABC}" srcOrd="6" destOrd="0" presId="urn:microsoft.com/office/officeart/2005/8/layout/process1"/>
+    <dgm:cxn modelId="{720361EB-C926-41A4-A60A-3A0B7BC25F99}" type="presParOf" srcId="{2446BD26-396F-420D-B091-265286D97786}" destId="{F266C578-88AA-4EC2-8142-53A5B6139B0D}" srcOrd="0" destOrd="0" presId="urn:microsoft.com/office/officeart/2005/8/layout/process1"/>
+    <dgm:cxn modelId="{8C725D83-2598-438E-9369-AAEA028EB740}" type="presParOf" srcId="{2446BD26-396F-420D-B091-265286D97786}" destId="{A5E00DF4-BEC8-4A62-B851-2A7F83FC9D35}" srcOrd="1" destOrd="0" presId="urn:microsoft.com/office/officeart/2005/8/layout/process1"/>
+    <dgm:cxn modelId="{A9F42CC2-F1CB-4AC1-93B6-F2EB4FDE52D8}" type="presParOf" srcId="{A5E00DF4-BEC8-4A62-B851-2A7F83FC9D35}" destId="{AEA95148-3CF9-4188-ACFA-34C472C532BE}" srcOrd="0" destOrd="0" presId="urn:microsoft.com/office/officeart/2005/8/layout/process1"/>
+    <dgm:cxn modelId="{B82EA475-4EEB-4680-8917-5E9D683F39E3}" type="presParOf" srcId="{2446BD26-396F-420D-B091-265286D97786}" destId="{CF1E89C8-AA78-4B1C-8D7C-AA8E38C034CE}" srcOrd="2" destOrd="0" presId="urn:microsoft.com/office/officeart/2005/8/layout/process1"/>
+    <dgm:cxn modelId="{A9C16F2D-8B85-4DAD-BD79-49A238D3A19E}" type="presParOf" srcId="{2446BD26-396F-420D-B091-265286D97786}" destId="{72E9BEC7-D7FE-4BD7-BACA-0668A095A9EF}" srcOrd="3" destOrd="0" presId="urn:microsoft.com/office/officeart/2005/8/layout/process1"/>
+    <dgm:cxn modelId="{A6516DB6-38F3-4E34-8C84-0E9FBEE2DFB1}" type="presParOf" srcId="{72E9BEC7-D7FE-4BD7-BACA-0668A095A9EF}" destId="{6E444586-2D87-4F9A-9400-F626352FE57E}" srcOrd="0" destOrd="0" presId="urn:microsoft.com/office/officeart/2005/8/layout/process1"/>
+    <dgm:cxn modelId="{A676343F-CCBE-4D77-A3A2-5E4A9371F974}" type="presParOf" srcId="{2446BD26-396F-420D-B091-265286D97786}" destId="{37E28D18-C070-47FF-8301-A041A91EDEF2}" srcOrd="4" destOrd="0" presId="urn:microsoft.com/office/officeart/2005/8/layout/process1"/>
+    <dgm:cxn modelId="{3360FDBB-E63A-4B52-ABB7-E4C2E16100A2}" type="presParOf" srcId="{2446BD26-396F-420D-B091-265286D97786}" destId="{09BDDF38-02A3-46F0-94CF-D671EECCB993}" srcOrd="5" destOrd="0" presId="urn:microsoft.com/office/officeart/2005/8/layout/process1"/>
+    <dgm:cxn modelId="{60D4DD04-B935-4B7E-A658-E51B15349452}" type="presParOf" srcId="{09BDDF38-02A3-46F0-94CF-D671EECCB993}" destId="{A0BD6892-BF4E-4D26-B32D-4AC8D13032DE}" srcOrd="0" destOrd="0" presId="urn:microsoft.com/office/officeart/2005/8/layout/process1"/>
+    <dgm:cxn modelId="{8CE1A004-F910-4556-AD9C-B3FF8EAB5B37}" type="presParOf" srcId="{2446BD26-396F-420D-B091-265286D97786}" destId="{449D7EB5-0D9D-4DAC-B391-FB2402C39ABC}" srcOrd="6" destOrd="0" presId="urn:microsoft.com/office/officeart/2005/8/layout/process1"/>
   </dgm:cxnLst>
   <dgm:bg/>
   <dgm:whole/>

</xml_diff>

<commit_message>
Date: 01 Apr 2026
</commit_message>
<xml_diff>
--- a/Notes_SA2512006.docx
+++ b/Notes_SA2512006.docx
@@ -16429,11 +16429,2076 @@
     </w:p>
     <w:p>
       <w:pPr>
+        <w:tabs>
+          <w:tab w:val="left" w:pos="1560"/>
+        </w:tabs>
+        <w:rPr>
+          <w:sz w:val="28"/>
+          <w:szCs w:val="24"/>
+          <w:lang w:val="en-US"/>
+        </w:rPr>
+      </w:pPr>
+    </w:p>
+    <w:p>
+      <w:pPr>
+        <w:tabs>
+          <w:tab w:val="left" w:pos="1560"/>
+        </w:tabs>
+        <w:rPr>
+          <w:b/>
+          <w:bCs/>
+          <w:sz w:val="28"/>
+          <w:szCs w:val="24"/>
+          <w:lang w:val="en-US"/>
+        </w:rPr>
+      </w:pPr>
+      <w:r>
+        <w:rPr>
+          <w:b/>
+          <w:bCs/>
+          <w:sz w:val="28"/>
+          <w:szCs w:val="24"/>
+          <w:lang w:val="en-US"/>
+        </w:rPr>
+        <w:t>Maven Execution</w:t>
+      </w:r>
+    </w:p>
+    <w:p>
+      <w:pPr>
+        <w:tabs>
+          <w:tab w:val="left" w:pos="1560"/>
+        </w:tabs>
+        <w:rPr>
+          <w:sz w:val="28"/>
+          <w:szCs w:val="24"/>
+          <w:lang w:val="en-US"/>
+        </w:rPr>
+      </w:pPr>
+      <w:r>
+        <w:rPr>
+          <w:sz w:val="28"/>
+          <w:szCs w:val="24"/>
+          <w:lang w:val="en-US"/>
+        </w:rPr>
+        <w:t>Add two plugins</w:t>
+      </w:r>
+    </w:p>
+    <w:p>
+      <w:pPr>
         <w:pStyle w:val="ListParagraph"/>
         <w:numPr>
           <w:ilvl w:val="0"/>
-          <w:numId w:val="41"/>
-        </w:numPr>
+          <w:numId w:val="42"/>
+        </w:numPr>
+        <w:tabs>
+          <w:tab w:val="left" w:pos="1560"/>
+        </w:tabs>
+        <w:rPr>
+          <w:sz w:val="28"/>
+          <w:szCs w:val="24"/>
+          <w:lang w:val="en-US"/>
+        </w:rPr>
+      </w:pPr>
+      <w:r>
+        <w:rPr>
+          <w:sz w:val="28"/>
+          <w:szCs w:val="24"/>
+          <w:lang w:val="en-US"/>
+        </w:rPr>
+        <w:t>Maven Compiler Plugin</w:t>
+      </w:r>
+    </w:p>
+    <w:p>
+      <w:pPr>
+        <w:pStyle w:val="ListParagraph"/>
+        <w:numPr>
+          <w:ilvl w:val="0"/>
+          <w:numId w:val="42"/>
+        </w:numPr>
+        <w:tabs>
+          <w:tab w:val="left" w:pos="1560"/>
+        </w:tabs>
+        <w:rPr>
+          <w:sz w:val="28"/>
+          <w:szCs w:val="24"/>
+          <w:lang w:val="en-US"/>
+        </w:rPr>
+      </w:pPr>
+      <w:r>
+        <w:rPr>
+          <w:sz w:val="28"/>
+          <w:szCs w:val="24"/>
+          <w:lang w:val="en-US"/>
+        </w:rPr>
+        <w:t>Maven Surefire Plugin</w:t>
+      </w:r>
+    </w:p>
+    <w:p>
+      <w:pPr>
+        <w:pStyle w:val="ListParagraph"/>
+        <w:tabs>
+          <w:tab w:val="left" w:pos="1560"/>
+        </w:tabs>
+        <w:rPr>
+          <w:sz w:val="28"/>
+          <w:szCs w:val="24"/>
+          <w:lang w:val="en-US"/>
+        </w:rPr>
+      </w:pPr>
+    </w:p>
+    <w:p>
+      <w:pPr>
+        <w:pStyle w:val="ListParagraph"/>
+        <w:tabs>
+          <w:tab w:val="left" w:pos="1560"/>
+        </w:tabs>
+        <w:rPr>
+          <w:sz w:val="28"/>
+          <w:szCs w:val="24"/>
+          <w:lang w:val="en-US"/>
+        </w:rPr>
+      </w:pPr>
+      <w:r>
+        <w:rPr>
+          <w:sz w:val="28"/>
+          <w:szCs w:val="24"/>
+          <w:lang w:val="en-US"/>
+        </w:rPr>
+        <w:t>Note that Java should be installed and needs to be added Environment variable</w:t>
+      </w:r>
+    </w:p>
+    <w:p>
+      <w:pPr>
+        <w:tabs>
+          <w:tab w:val="left" w:pos="1560"/>
+        </w:tabs>
+        <w:rPr>
+          <w:b/>
+          <w:bCs/>
+          <w:sz w:val="28"/>
+          <w:szCs w:val="24"/>
+          <w:lang w:val="en-US"/>
+        </w:rPr>
+      </w:pPr>
+      <w:r>
+        <w:rPr>
+          <w:b/>
+          <w:bCs/>
+          <w:sz w:val="28"/>
+          <w:szCs w:val="24"/>
+          <w:lang w:val="en-US"/>
+        </w:rPr>
+        <w:t>Execution Goals</w:t>
+      </w:r>
+    </w:p>
+    <w:p>
+      <w:pPr>
+        <w:pStyle w:val="ListParagraph"/>
+        <w:numPr>
+          <w:ilvl w:val="0"/>
+          <w:numId w:val="43"/>
+        </w:numPr>
+        <w:tabs>
+          <w:tab w:val="left" w:pos="1560"/>
+        </w:tabs>
+        <w:rPr>
+          <w:sz w:val="28"/>
+          <w:szCs w:val="24"/>
+          <w:lang w:val="en-US"/>
+        </w:rPr>
+      </w:pPr>
+      <w:r>
+        <w:rPr>
+          <w:sz w:val="28"/>
+          <w:szCs w:val="24"/>
+          <w:lang w:val="en-US"/>
+        </w:rPr>
+        <w:t>Clean</w:t>
+      </w:r>
+    </w:p>
+    <w:p>
+      <w:pPr>
+        <w:pStyle w:val="ListParagraph"/>
+        <w:numPr>
+          <w:ilvl w:val="0"/>
+          <w:numId w:val="43"/>
+        </w:numPr>
+        <w:tabs>
+          <w:tab w:val="left" w:pos="1560"/>
+        </w:tabs>
+        <w:rPr>
+          <w:sz w:val="28"/>
+          <w:szCs w:val="24"/>
+          <w:lang w:val="en-US"/>
+        </w:rPr>
+      </w:pPr>
+      <w:r>
+        <w:rPr>
+          <w:sz w:val="28"/>
+          <w:szCs w:val="24"/>
+          <w:lang w:val="en-US"/>
+        </w:rPr>
+        <w:t>Test</w:t>
+      </w:r>
+    </w:p>
+    <w:p>
+      <w:pPr>
+        <w:pStyle w:val="ListParagraph"/>
+        <w:numPr>
+          <w:ilvl w:val="0"/>
+          <w:numId w:val="43"/>
+        </w:numPr>
+        <w:tabs>
+          <w:tab w:val="left" w:pos="1560"/>
+        </w:tabs>
+        <w:rPr>
+          <w:sz w:val="28"/>
+          <w:szCs w:val="24"/>
+          <w:lang w:val="en-US"/>
+        </w:rPr>
+      </w:pPr>
+      <w:r>
+        <w:rPr>
+          <w:sz w:val="28"/>
+          <w:szCs w:val="24"/>
+          <w:lang w:val="en-US"/>
+        </w:rPr>
+        <w:lastRenderedPageBreak/>
+        <w:t>Install</w:t>
+      </w:r>
+    </w:p>
+    <w:p>
+      <w:pPr>
+        <w:tabs>
+          <w:tab w:val="left" w:pos="1560"/>
+        </w:tabs>
+        <w:rPr>
+          <w:sz w:val="28"/>
+          <w:szCs w:val="24"/>
+          <w:lang w:val="en-US"/>
+        </w:rPr>
+      </w:pPr>
+    </w:p>
+    <w:p>
+      <w:pPr>
+        <w:rPr>
+          <w:sz w:val="28"/>
+          <w:szCs w:val="24"/>
+          <w:lang w:val="en-US"/>
+        </w:rPr>
+      </w:pPr>
+      <w:r>
+        <w:rPr>
+          <w:sz w:val="28"/>
+          <w:szCs w:val="24"/>
+          <w:lang w:val="en-US"/>
+        </w:rPr>
+        <w:br w:type="page"/>
+      </w:r>
+    </w:p>
+    <w:p>
+      <w:pPr>
+        <w:tabs>
+          <w:tab w:val="left" w:pos="1560"/>
+        </w:tabs>
+        <w:rPr>
+          <w:b/>
+          <w:bCs/>
+          <w:sz w:val="28"/>
+          <w:szCs w:val="24"/>
+          <w:lang w:val="en-US"/>
+        </w:rPr>
+      </w:pPr>
+      <w:r>
+        <w:rPr>
+          <w:b/>
+          <w:bCs/>
+          <w:sz w:val="28"/>
+          <w:szCs w:val="24"/>
+          <w:lang w:val="en-US"/>
+        </w:rPr>
+        <w:lastRenderedPageBreak/>
+        <w:t>BDD Approach / Framework</w:t>
+      </w:r>
+    </w:p>
+    <w:p>
+      <w:pPr>
+        <w:pStyle w:val="ListParagraph"/>
+        <w:numPr>
+          <w:ilvl w:val="0"/>
+          <w:numId w:val="44"/>
+        </w:numPr>
+        <w:tabs>
+          <w:tab w:val="left" w:pos="1560"/>
+        </w:tabs>
+        <w:rPr>
+          <w:sz w:val="28"/>
+          <w:szCs w:val="24"/>
+          <w:lang w:val="en-US"/>
+        </w:rPr>
+      </w:pPr>
+      <w:r>
+        <w:rPr>
+          <w:sz w:val="28"/>
+          <w:szCs w:val="24"/>
+          <w:lang w:val="en-US"/>
+        </w:rPr>
+        <w:t>BA, QA team and development team will gather the requirements from client.</w:t>
+      </w:r>
+    </w:p>
+    <w:p>
+      <w:pPr>
+        <w:pStyle w:val="ListParagraph"/>
+        <w:numPr>
+          <w:ilvl w:val="0"/>
+          <w:numId w:val="44"/>
+        </w:numPr>
+        <w:tabs>
+          <w:tab w:val="left" w:pos="1560"/>
+        </w:tabs>
+        <w:rPr>
+          <w:sz w:val="28"/>
+          <w:szCs w:val="24"/>
+          <w:lang w:val="en-US"/>
+        </w:rPr>
+      </w:pPr>
+      <w:r>
+        <w:rPr>
+          <w:sz w:val="28"/>
+          <w:szCs w:val="24"/>
+          <w:lang w:val="en-US"/>
+        </w:rPr>
+        <w:t>These requirements will be shared with QA team.</w:t>
+      </w:r>
+    </w:p>
+    <w:p>
+      <w:pPr>
+        <w:pStyle w:val="ListParagraph"/>
+        <w:numPr>
+          <w:ilvl w:val="0"/>
+          <w:numId w:val="44"/>
+        </w:numPr>
+        <w:tabs>
+          <w:tab w:val="left" w:pos="1560"/>
+        </w:tabs>
+        <w:rPr>
+          <w:sz w:val="28"/>
+          <w:szCs w:val="24"/>
+          <w:lang w:val="en-US"/>
+        </w:rPr>
+      </w:pPr>
+      <w:r>
+        <w:rPr>
+          <w:sz w:val="28"/>
+          <w:szCs w:val="24"/>
+          <w:lang w:val="en-US"/>
+        </w:rPr>
+        <w:t xml:space="preserve">QA team will create </w:t>
+      </w:r>
+      <w:r>
+        <w:rPr>
+          <w:b/>
+          <w:bCs/>
+          <w:sz w:val="28"/>
+          <w:szCs w:val="24"/>
+          <w:lang w:val="en-US"/>
+        </w:rPr>
+        <w:t>Feature File (1</w:t>
+      </w:r>
+      <w:r>
+        <w:rPr>
+          <w:b/>
+          <w:bCs/>
+          <w:sz w:val="28"/>
+          <w:szCs w:val="24"/>
+          <w:vertAlign w:val="superscript"/>
+          <w:lang w:val="en-US"/>
+        </w:rPr>
+        <w:t>st</w:t>
+      </w:r>
+      <w:r>
+        <w:rPr>
+          <w:b/>
+          <w:bCs/>
+          <w:sz w:val="28"/>
+          <w:szCs w:val="24"/>
+          <w:lang w:val="en-US"/>
+        </w:rPr>
+        <w:t xml:space="preserve"> component of BDD)</w:t>
+      </w:r>
+    </w:p>
+    <w:p>
+      <w:pPr>
+        <w:pStyle w:val="ListParagraph"/>
+        <w:numPr>
+          <w:ilvl w:val="0"/>
+          <w:numId w:val="44"/>
+        </w:numPr>
+        <w:tabs>
+          <w:tab w:val="left" w:pos="1560"/>
+        </w:tabs>
+        <w:rPr>
+          <w:sz w:val="28"/>
+          <w:szCs w:val="24"/>
+          <w:lang w:val="en-US"/>
+        </w:rPr>
+      </w:pPr>
+      <w:r>
+        <w:rPr>
+          <w:sz w:val="28"/>
+          <w:szCs w:val="24"/>
+          <w:lang w:val="en-US"/>
+        </w:rPr>
+        <w:t>Feature file is</w:t>
+      </w:r>
+    </w:p>
+    <w:p>
+      <w:pPr>
+        <w:pStyle w:val="ListParagraph"/>
+        <w:numPr>
+          <w:ilvl w:val="1"/>
+          <w:numId w:val="44"/>
+        </w:numPr>
+        <w:tabs>
+          <w:tab w:val="left" w:pos="1560"/>
+        </w:tabs>
+        <w:rPr>
+          <w:sz w:val="28"/>
+          <w:szCs w:val="24"/>
+          <w:lang w:val="en-US"/>
+        </w:rPr>
+      </w:pPr>
+      <w:r>
+        <w:rPr>
+          <w:sz w:val="28"/>
+          <w:szCs w:val="24"/>
+          <w:lang w:val="en-US"/>
+        </w:rPr>
+        <w:t>Collection of test scenarios</w:t>
+      </w:r>
+    </w:p>
+    <w:p>
+      <w:pPr>
+        <w:pStyle w:val="ListParagraph"/>
+        <w:numPr>
+          <w:ilvl w:val="1"/>
+          <w:numId w:val="44"/>
+        </w:numPr>
+        <w:tabs>
+          <w:tab w:val="left" w:pos="1560"/>
+        </w:tabs>
+        <w:rPr>
+          <w:sz w:val="28"/>
+          <w:szCs w:val="24"/>
+          <w:lang w:val="en-US"/>
+        </w:rPr>
+      </w:pPr>
+      <w:r>
+        <w:rPr>
+          <w:sz w:val="28"/>
+          <w:szCs w:val="24"/>
+          <w:lang w:val="en-US"/>
+        </w:rPr>
+        <w:t>Created using Gherkin language.</w:t>
+      </w:r>
+    </w:p>
+    <w:p>
+      <w:pPr>
+        <w:pStyle w:val="ListParagraph"/>
+        <w:numPr>
+          <w:ilvl w:val="1"/>
+          <w:numId w:val="44"/>
+        </w:numPr>
+        <w:tabs>
+          <w:tab w:val="left" w:pos="1560"/>
+        </w:tabs>
+        <w:rPr>
+          <w:sz w:val="28"/>
+          <w:szCs w:val="24"/>
+          <w:lang w:val="en-US"/>
+        </w:rPr>
+      </w:pPr>
+      <w:r>
+        <w:rPr>
+          <w:sz w:val="28"/>
+          <w:szCs w:val="24"/>
+          <w:lang w:val="en-US"/>
+        </w:rPr>
+        <w:t>Contains Keywords</w:t>
+      </w:r>
+    </w:p>
+    <w:p>
+      <w:pPr>
+        <w:pStyle w:val="ListParagraph"/>
+        <w:numPr>
+          <w:ilvl w:val="0"/>
+          <w:numId w:val="44"/>
+        </w:numPr>
+        <w:tabs>
+          <w:tab w:val="left" w:pos="1560"/>
+        </w:tabs>
+        <w:rPr>
+          <w:sz w:val="28"/>
+          <w:szCs w:val="24"/>
+          <w:lang w:val="en-US"/>
+        </w:rPr>
+      </w:pPr>
+      <w:r>
+        <w:rPr>
+          <w:sz w:val="28"/>
+          <w:szCs w:val="24"/>
+          <w:lang w:val="en-US"/>
+        </w:rPr>
+        <w:t>This feature file will be shared with</w:t>
+      </w:r>
+    </w:p>
+    <w:p>
+      <w:pPr>
+        <w:pStyle w:val="ListParagraph"/>
+        <w:numPr>
+          <w:ilvl w:val="1"/>
+          <w:numId w:val="44"/>
+        </w:numPr>
+        <w:tabs>
+          <w:tab w:val="left" w:pos="1560"/>
+        </w:tabs>
+        <w:rPr>
+          <w:sz w:val="28"/>
+          <w:szCs w:val="24"/>
+          <w:lang w:val="en-US"/>
+        </w:rPr>
+      </w:pPr>
+      <w:r>
+        <w:rPr>
+          <w:sz w:val="28"/>
+          <w:szCs w:val="24"/>
+          <w:lang w:val="en-US"/>
+        </w:rPr>
+        <w:t>Developer</w:t>
+      </w:r>
+    </w:p>
+    <w:p>
+      <w:pPr>
+        <w:pStyle w:val="ListParagraph"/>
+        <w:numPr>
+          <w:ilvl w:val="1"/>
+          <w:numId w:val="44"/>
+        </w:numPr>
+        <w:tabs>
+          <w:tab w:val="left" w:pos="1560"/>
+        </w:tabs>
+        <w:rPr>
+          <w:sz w:val="28"/>
+          <w:szCs w:val="24"/>
+          <w:lang w:val="en-US"/>
+        </w:rPr>
+      </w:pPr>
+      <w:r>
+        <w:rPr>
+          <w:sz w:val="28"/>
+          <w:szCs w:val="24"/>
+          <w:lang w:val="en-US"/>
+        </w:rPr>
+        <w:t>Manual Tester</w:t>
+      </w:r>
+    </w:p>
+    <w:p>
+      <w:pPr>
+        <w:pStyle w:val="ListParagraph"/>
+        <w:numPr>
+          <w:ilvl w:val="1"/>
+          <w:numId w:val="44"/>
+        </w:numPr>
+        <w:tabs>
+          <w:tab w:val="left" w:pos="1560"/>
+        </w:tabs>
+        <w:rPr>
+          <w:sz w:val="28"/>
+          <w:szCs w:val="24"/>
+          <w:lang w:val="en-US"/>
+        </w:rPr>
+      </w:pPr>
+      <w:r>
+        <w:rPr>
+          <w:sz w:val="28"/>
+          <w:szCs w:val="24"/>
+          <w:lang w:val="en-US"/>
+        </w:rPr>
+        <w:t>Automation Tester</w:t>
+      </w:r>
+    </w:p>
+    <w:p>
+      <w:pPr>
+        <w:pStyle w:val="ListParagraph"/>
+        <w:numPr>
+          <w:ilvl w:val="0"/>
+          <w:numId w:val="44"/>
+        </w:numPr>
+        <w:tabs>
+          <w:tab w:val="left" w:pos="1560"/>
+        </w:tabs>
+        <w:rPr>
+          <w:sz w:val="28"/>
+          <w:szCs w:val="24"/>
+          <w:lang w:val="en-US"/>
+        </w:rPr>
+      </w:pPr>
+      <w:r>
+        <w:rPr>
+          <w:sz w:val="28"/>
+          <w:szCs w:val="24"/>
+          <w:lang w:val="en-US"/>
+        </w:rPr>
+        <w:t xml:space="preserve">Automation tester will execute this feature file and they will get </w:t>
+      </w:r>
+      <w:r>
+        <w:rPr>
+          <w:b/>
+          <w:bCs/>
+          <w:sz w:val="28"/>
+          <w:szCs w:val="24"/>
+          <w:lang w:val="en-US"/>
+        </w:rPr>
+        <w:t>Step Definition / Glue Code (2</w:t>
+      </w:r>
+      <w:r>
+        <w:rPr>
+          <w:b/>
+          <w:bCs/>
+          <w:sz w:val="28"/>
+          <w:szCs w:val="24"/>
+          <w:vertAlign w:val="superscript"/>
+          <w:lang w:val="en-US"/>
+        </w:rPr>
+        <w:t>nd</w:t>
+      </w:r>
+      <w:r>
+        <w:rPr>
+          <w:b/>
+          <w:bCs/>
+          <w:sz w:val="28"/>
+          <w:szCs w:val="24"/>
+          <w:lang w:val="en-US"/>
+        </w:rPr>
+        <w:t xml:space="preserve"> Component of BDD)</w:t>
+      </w:r>
+    </w:p>
+    <w:p>
+      <w:pPr>
+        <w:pStyle w:val="ListParagraph"/>
+        <w:numPr>
+          <w:ilvl w:val="1"/>
+          <w:numId w:val="44"/>
+        </w:numPr>
+        <w:tabs>
+          <w:tab w:val="left" w:pos="1560"/>
+        </w:tabs>
+        <w:rPr>
+          <w:sz w:val="28"/>
+          <w:szCs w:val="24"/>
+          <w:lang w:val="en-US"/>
+        </w:rPr>
+      </w:pPr>
+      <w:r>
+        <w:rPr>
+          <w:sz w:val="28"/>
+          <w:szCs w:val="24"/>
+          <w:lang w:val="en-US"/>
+        </w:rPr>
+        <w:t>Step Definition / Glue code contains the automation script in the form of methods.</w:t>
+      </w:r>
+    </w:p>
+    <w:p>
+      <w:pPr>
+        <w:pStyle w:val="ListParagraph"/>
+        <w:numPr>
+          <w:ilvl w:val="0"/>
+          <w:numId w:val="44"/>
+        </w:numPr>
+        <w:tabs>
+          <w:tab w:val="left" w:pos="1560"/>
+        </w:tabs>
+        <w:rPr>
+          <w:sz w:val="28"/>
+          <w:szCs w:val="24"/>
+          <w:lang w:val="en-US"/>
+        </w:rPr>
+      </w:pPr>
+      <w:r>
+        <w:rPr>
+          <w:b/>
+          <w:bCs/>
+          <w:sz w:val="28"/>
+          <w:szCs w:val="24"/>
+          <w:lang w:val="en-US"/>
+        </w:rPr>
+        <w:t>Runner Class (3</w:t>
+      </w:r>
+      <w:r>
+        <w:rPr>
+          <w:b/>
+          <w:bCs/>
+          <w:sz w:val="28"/>
+          <w:szCs w:val="24"/>
+          <w:vertAlign w:val="superscript"/>
+          <w:lang w:val="en-US"/>
+        </w:rPr>
+        <w:t>rd</w:t>
+      </w:r>
+      <w:r>
+        <w:rPr>
+          <w:b/>
+          <w:bCs/>
+          <w:sz w:val="28"/>
+          <w:szCs w:val="24"/>
+          <w:lang w:val="en-US"/>
+        </w:rPr>
+        <w:t xml:space="preserve"> Component of BDD) </w:t>
+      </w:r>
+      <w:r>
+        <w:rPr>
+          <w:sz w:val="28"/>
+          <w:szCs w:val="24"/>
+          <w:lang w:val="en-US"/>
+        </w:rPr>
+        <w:t>is used to execute the automation script create inside Step Definition</w:t>
+      </w:r>
+    </w:p>
+    <w:p>
+      <w:pPr>
+        <w:tabs>
+          <w:tab w:val="left" w:pos="1560"/>
+        </w:tabs>
+        <w:rPr>
+          <w:sz w:val="28"/>
+          <w:szCs w:val="24"/>
+          <w:lang w:val="en-US"/>
+        </w:rPr>
+      </w:pPr>
+    </w:p>
+    <w:p>
+      <w:pPr>
+        <w:tabs>
+          <w:tab w:val="left" w:pos="1560"/>
+        </w:tabs>
+        <w:rPr>
+          <w:b/>
+          <w:bCs/>
+          <w:sz w:val="28"/>
+          <w:szCs w:val="24"/>
+          <w:lang w:val="en-US"/>
+        </w:rPr>
+      </w:pPr>
+      <w:r>
+        <w:rPr>
+          <w:b/>
+          <w:bCs/>
+          <w:sz w:val="28"/>
+          <w:szCs w:val="24"/>
+          <w:lang w:val="en-US"/>
+        </w:rPr>
+        <w:t>Cucumber is the implementation of BDD Approach</w:t>
+      </w:r>
+    </w:p>
+    <w:p>
+      <w:pPr>
+        <w:pBdr>
+          <w:bottom w:val="single" w:sz="6" w:space="1" w:color="auto"/>
+        </w:pBdr>
+        <w:tabs>
+          <w:tab w:val="left" w:pos="1560"/>
+        </w:tabs>
+        <w:rPr>
+          <w:b/>
+          <w:bCs/>
+          <w:sz w:val="28"/>
+          <w:szCs w:val="24"/>
+          <w:lang w:val="en-US"/>
+        </w:rPr>
+      </w:pPr>
+    </w:p>
+    <w:p>
+      <w:pPr>
+        <w:tabs>
+          <w:tab w:val="left" w:pos="1560"/>
+        </w:tabs>
+        <w:rPr>
+          <w:b/>
+          <w:bCs/>
+          <w:sz w:val="28"/>
+          <w:szCs w:val="24"/>
+          <w:lang w:val="en-US"/>
+        </w:rPr>
+      </w:pPr>
+      <w:r>
+        <w:rPr>
+          <w:b/>
+          <w:bCs/>
+          <w:sz w:val="28"/>
+          <w:szCs w:val="24"/>
+          <w:lang w:val="en-US"/>
+        </w:rPr>
+        <w:t>Feature File</w:t>
+      </w:r>
+    </w:p>
+    <w:p>
+      <w:pPr>
+        <w:pStyle w:val="ListParagraph"/>
+        <w:numPr>
+          <w:ilvl w:val="0"/>
+          <w:numId w:val="44"/>
+        </w:numPr>
+        <w:tabs>
+          <w:tab w:val="left" w:pos="1560"/>
+        </w:tabs>
+        <w:rPr>
+          <w:sz w:val="28"/>
+          <w:szCs w:val="24"/>
+          <w:lang w:val="en-US"/>
+        </w:rPr>
+      </w:pPr>
+      <w:r>
+        <w:rPr>
+          <w:sz w:val="28"/>
+          <w:szCs w:val="24"/>
+          <w:lang w:val="en-US"/>
+        </w:rPr>
+        <w:t>Collection of test scenarios</w:t>
+      </w:r>
+    </w:p>
+    <w:p>
+      <w:pPr>
+        <w:pStyle w:val="ListParagraph"/>
+        <w:numPr>
+          <w:ilvl w:val="0"/>
+          <w:numId w:val="44"/>
+        </w:numPr>
+        <w:tabs>
+          <w:tab w:val="left" w:pos="1560"/>
+        </w:tabs>
+        <w:rPr>
+          <w:sz w:val="28"/>
+          <w:szCs w:val="24"/>
+          <w:lang w:val="en-US"/>
+        </w:rPr>
+      </w:pPr>
+      <w:r>
+        <w:rPr>
+          <w:sz w:val="28"/>
+          <w:szCs w:val="24"/>
+          <w:lang w:val="en-US"/>
+        </w:rPr>
+        <w:t>Created using Gherkin language.</w:t>
+      </w:r>
+    </w:p>
+    <w:p>
+      <w:pPr>
+        <w:pStyle w:val="ListParagraph"/>
+        <w:numPr>
+          <w:ilvl w:val="0"/>
+          <w:numId w:val="44"/>
+        </w:numPr>
+        <w:tabs>
+          <w:tab w:val="left" w:pos="1560"/>
+        </w:tabs>
+        <w:rPr>
+          <w:sz w:val="28"/>
+          <w:szCs w:val="24"/>
+          <w:lang w:val="en-US"/>
+        </w:rPr>
+      </w:pPr>
+      <w:r>
+        <w:rPr>
+          <w:sz w:val="28"/>
+          <w:szCs w:val="24"/>
+          <w:lang w:val="en-US"/>
+        </w:rPr>
+        <w:t>Gherkin Language is similar to English</w:t>
+      </w:r>
+    </w:p>
+    <w:p>
+      <w:pPr>
+        <w:pStyle w:val="ListParagraph"/>
+        <w:numPr>
+          <w:ilvl w:val="0"/>
+          <w:numId w:val="44"/>
+        </w:numPr>
+        <w:tabs>
+          <w:tab w:val="left" w:pos="1560"/>
+        </w:tabs>
+        <w:rPr>
+          <w:sz w:val="28"/>
+          <w:szCs w:val="24"/>
+          <w:lang w:val="en-US"/>
+        </w:rPr>
+      </w:pPr>
+      <w:r>
+        <w:rPr>
+          <w:sz w:val="28"/>
+          <w:szCs w:val="24"/>
+          <w:lang w:val="en-US"/>
+        </w:rPr>
+        <w:t>Contains Keywords</w:t>
+      </w:r>
+    </w:p>
+    <w:p>
+      <w:pPr>
+        <w:pStyle w:val="ListParagraph"/>
+        <w:numPr>
+          <w:ilvl w:val="1"/>
+          <w:numId w:val="44"/>
+        </w:numPr>
+        <w:tabs>
+          <w:tab w:val="left" w:pos="1560"/>
+        </w:tabs>
+        <w:rPr>
+          <w:sz w:val="28"/>
+          <w:szCs w:val="24"/>
+          <w:lang w:val="en-US"/>
+        </w:rPr>
+      </w:pPr>
+      <w:r>
+        <w:rPr>
+          <w:sz w:val="28"/>
+          <w:szCs w:val="24"/>
+          <w:lang w:val="en-US"/>
+        </w:rPr>
+        <w:t xml:space="preserve">Feature: </w:t>
+      </w:r>
+      <w:r>
+        <w:rPr>
+          <w:sz w:val="28"/>
+          <w:szCs w:val="24"/>
+          <w:lang w:val="en-US"/>
+        </w:rPr>
+        <w:sym w:font="Wingdings" w:char="F0E0"/>
+      </w:r>
+      <w:r>
+        <w:rPr>
+          <w:sz w:val="28"/>
+          <w:szCs w:val="24"/>
+          <w:lang w:val="en-US"/>
+        </w:rPr>
+        <w:t xml:space="preserve"> Represents requirement</w:t>
+      </w:r>
+    </w:p>
+    <w:p>
+      <w:pPr>
+        <w:pStyle w:val="ListParagraph"/>
+        <w:numPr>
+          <w:ilvl w:val="1"/>
+          <w:numId w:val="44"/>
+        </w:numPr>
+        <w:tabs>
+          <w:tab w:val="left" w:pos="1560"/>
+        </w:tabs>
+        <w:rPr>
+          <w:sz w:val="28"/>
+          <w:szCs w:val="24"/>
+          <w:lang w:val="en-US"/>
+        </w:rPr>
+      </w:pPr>
+      <w:r>
+        <w:rPr>
+          <w:sz w:val="28"/>
+          <w:szCs w:val="24"/>
+          <w:lang w:val="en-US"/>
+        </w:rPr>
+        <w:t xml:space="preserve">Scenario: </w:t>
+      </w:r>
+      <w:r>
+        <w:rPr>
+          <w:sz w:val="28"/>
+          <w:szCs w:val="24"/>
+          <w:lang w:val="en-US"/>
+        </w:rPr>
+        <w:sym w:font="Wingdings" w:char="F0E0"/>
+      </w:r>
+      <w:r>
+        <w:rPr>
+          <w:sz w:val="28"/>
+          <w:szCs w:val="24"/>
+          <w:lang w:val="en-US"/>
+        </w:rPr>
+        <w:t xml:space="preserve"> </w:t>
+      </w:r>
+      <w:r>
+        <w:rPr>
+          <w:sz w:val="28"/>
+          <w:szCs w:val="24"/>
+          <w:lang w:val="en-US"/>
+        </w:rPr>
+        <w:t>Represents test objective (test condition)</w:t>
+      </w:r>
+    </w:p>
+    <w:p>
+      <w:pPr>
+        <w:pStyle w:val="ListParagraph"/>
+        <w:numPr>
+          <w:ilvl w:val="1"/>
+          <w:numId w:val="44"/>
+        </w:numPr>
+        <w:tabs>
+          <w:tab w:val="left" w:pos="1560"/>
+        </w:tabs>
+        <w:rPr>
+          <w:sz w:val="28"/>
+          <w:szCs w:val="24"/>
+          <w:lang w:val="en-US"/>
+        </w:rPr>
+      </w:pPr>
+      <w:r>
+        <w:rPr>
+          <w:sz w:val="28"/>
+          <w:szCs w:val="24"/>
+          <w:lang w:val="en-US"/>
+        </w:rPr>
+        <w:t xml:space="preserve">Given </w:t>
+      </w:r>
+      <w:r>
+        <w:rPr>
+          <w:sz w:val="28"/>
+          <w:szCs w:val="24"/>
+          <w:lang w:val="en-US"/>
+        </w:rPr>
+        <w:sym w:font="Wingdings" w:char="F0E0"/>
+      </w:r>
+      <w:r>
+        <w:rPr>
+          <w:sz w:val="28"/>
+          <w:szCs w:val="24"/>
+          <w:lang w:val="en-US"/>
+        </w:rPr>
+        <w:t xml:space="preserve"> Represents pre-requisite</w:t>
+      </w:r>
+    </w:p>
+    <w:p>
+      <w:pPr>
+        <w:pStyle w:val="ListParagraph"/>
+        <w:numPr>
+          <w:ilvl w:val="1"/>
+          <w:numId w:val="44"/>
+        </w:numPr>
+        <w:tabs>
+          <w:tab w:val="left" w:pos="1560"/>
+        </w:tabs>
+        <w:rPr>
+          <w:sz w:val="28"/>
+          <w:szCs w:val="24"/>
+          <w:lang w:val="en-US"/>
+        </w:rPr>
+      </w:pPr>
+      <w:r>
+        <w:rPr>
+          <w:sz w:val="28"/>
+          <w:szCs w:val="24"/>
+          <w:lang w:val="en-US"/>
+        </w:rPr>
+        <w:t xml:space="preserve">When </w:t>
+      </w:r>
+      <w:r>
+        <w:rPr>
+          <w:sz w:val="28"/>
+          <w:szCs w:val="24"/>
+          <w:lang w:val="en-US"/>
+        </w:rPr>
+        <w:sym w:font="Wingdings" w:char="F0E0"/>
+      </w:r>
+      <w:r>
+        <w:rPr>
+          <w:sz w:val="28"/>
+          <w:szCs w:val="24"/>
+          <w:lang w:val="en-US"/>
+        </w:rPr>
+        <w:t xml:space="preserve"> </w:t>
+      </w:r>
+      <w:r>
+        <w:rPr>
+          <w:sz w:val="28"/>
+          <w:szCs w:val="24"/>
+          <w:lang w:val="en-US"/>
+        </w:rPr>
+        <w:t>Represents the steps. Every step can be implemented via separate When statement</w:t>
+      </w:r>
+    </w:p>
+    <w:p>
+      <w:pPr>
+        <w:pStyle w:val="ListParagraph"/>
+        <w:numPr>
+          <w:ilvl w:val="1"/>
+          <w:numId w:val="44"/>
+        </w:numPr>
+        <w:tabs>
+          <w:tab w:val="left" w:pos="1560"/>
+        </w:tabs>
+        <w:rPr>
+          <w:sz w:val="28"/>
+          <w:szCs w:val="24"/>
+          <w:lang w:val="en-US"/>
+        </w:rPr>
+      </w:pPr>
+      <w:r>
+        <w:rPr>
+          <w:sz w:val="28"/>
+          <w:szCs w:val="24"/>
+          <w:lang w:val="en-US"/>
+        </w:rPr>
+        <w:t xml:space="preserve">And </w:t>
+      </w:r>
+      <w:r>
+        <w:rPr>
+          <w:sz w:val="28"/>
+          <w:szCs w:val="24"/>
+          <w:lang w:val="en-US"/>
+        </w:rPr>
+        <w:sym w:font="Wingdings" w:char="F0E0"/>
+      </w:r>
+      <w:r>
+        <w:rPr>
+          <w:sz w:val="28"/>
+          <w:szCs w:val="24"/>
+          <w:lang w:val="en-US"/>
+        </w:rPr>
+        <w:t xml:space="preserve"> Used to combine multiple When statements</w:t>
+      </w:r>
+    </w:p>
+    <w:p>
+      <w:pPr>
+        <w:pStyle w:val="ListParagraph"/>
+        <w:numPr>
+          <w:ilvl w:val="1"/>
+          <w:numId w:val="44"/>
+        </w:numPr>
+        <w:tabs>
+          <w:tab w:val="left" w:pos="1560"/>
+        </w:tabs>
+        <w:rPr>
+          <w:sz w:val="28"/>
+          <w:szCs w:val="24"/>
+          <w:lang w:val="en-US"/>
+        </w:rPr>
+      </w:pPr>
+      <w:r>
+        <w:rPr>
+          <w:sz w:val="28"/>
+          <w:szCs w:val="24"/>
+          <w:lang w:val="en-US"/>
+        </w:rPr>
+        <w:t xml:space="preserve">Then </w:t>
+      </w:r>
+      <w:r>
+        <w:rPr>
+          <w:sz w:val="28"/>
+          <w:szCs w:val="24"/>
+          <w:lang w:val="en-US"/>
+        </w:rPr>
+        <w:sym w:font="Wingdings" w:char="F0E0"/>
+      </w:r>
+      <w:r>
+        <w:rPr>
+          <w:sz w:val="28"/>
+          <w:szCs w:val="24"/>
+          <w:lang w:val="en-US"/>
+        </w:rPr>
+        <w:t xml:space="preserve"> </w:t>
+      </w:r>
+      <w:r>
+        <w:rPr>
+          <w:sz w:val="28"/>
+          <w:szCs w:val="24"/>
+          <w:lang w:val="en-US"/>
+        </w:rPr>
+        <w:t>Represents expected result</w:t>
+      </w:r>
+    </w:p>
+    <w:p>
+      <w:pPr>
+        <w:pStyle w:val="ListParagraph"/>
+        <w:numPr>
+          <w:ilvl w:val="1"/>
+          <w:numId w:val="44"/>
+        </w:numPr>
+        <w:tabs>
+          <w:tab w:val="left" w:pos="1560"/>
+        </w:tabs>
+        <w:rPr>
+          <w:sz w:val="28"/>
+          <w:szCs w:val="24"/>
+          <w:lang w:val="en-US"/>
+        </w:rPr>
+      </w:pPr>
+      <w:r>
+        <w:rPr>
+          <w:sz w:val="28"/>
+          <w:szCs w:val="24"/>
+          <w:lang w:val="en-US"/>
+        </w:rPr>
+        <w:lastRenderedPageBreak/>
+        <w:t xml:space="preserve">Background: </w:t>
+      </w:r>
+      <w:r>
+        <w:rPr>
+          <w:sz w:val="28"/>
+          <w:szCs w:val="24"/>
+          <w:lang w:val="en-US"/>
+        </w:rPr>
+        <w:sym w:font="Wingdings" w:char="F0E0"/>
+      </w:r>
+      <w:r>
+        <w:rPr>
+          <w:sz w:val="28"/>
+          <w:szCs w:val="24"/>
+          <w:lang w:val="en-US"/>
+        </w:rPr>
+        <w:t xml:space="preserve"> </w:t>
+      </w:r>
+      <w:r>
+        <w:rPr>
+          <w:sz w:val="28"/>
+          <w:szCs w:val="24"/>
+          <w:lang w:val="en-US"/>
+        </w:rPr>
+        <w:t>Used to avoid multiple Given statements when you are adding multiple test scenarios in feature file</w:t>
+      </w:r>
+    </w:p>
+    <w:p>
+      <w:pPr>
+        <w:pStyle w:val="ListParagraph"/>
+        <w:numPr>
+          <w:ilvl w:val="1"/>
+          <w:numId w:val="44"/>
+        </w:numPr>
+        <w:tabs>
+          <w:tab w:val="left" w:pos="1560"/>
+        </w:tabs>
+        <w:rPr>
+          <w:sz w:val="28"/>
+          <w:szCs w:val="24"/>
+          <w:lang w:val="en-US"/>
+        </w:rPr>
+      </w:pPr>
+      <w:r>
+        <w:rPr>
+          <w:sz w:val="28"/>
+          <w:szCs w:val="24"/>
+          <w:lang w:val="en-US"/>
+        </w:rPr>
+        <w:t xml:space="preserve">Examples: </w:t>
+      </w:r>
+      <w:r>
+        <w:rPr>
+          <w:sz w:val="28"/>
+          <w:szCs w:val="24"/>
+          <w:lang w:val="en-US"/>
+        </w:rPr>
+        <w:sym w:font="Wingdings" w:char="F0E0"/>
+      </w:r>
+      <w:r>
+        <w:rPr>
+          <w:sz w:val="28"/>
+          <w:szCs w:val="24"/>
+          <w:lang w:val="en-US"/>
+        </w:rPr>
+        <w:t xml:space="preserve"> Used in Data Driven Testing to pass the data</w:t>
+      </w:r>
+    </w:p>
+    <w:p>
+      <w:pPr>
+        <w:pStyle w:val="ListParagraph"/>
+        <w:numPr>
+          <w:ilvl w:val="1"/>
+          <w:numId w:val="44"/>
+        </w:numPr>
+        <w:pBdr>
+          <w:bottom w:val="single" w:sz="6" w:space="1" w:color="auto"/>
+        </w:pBdr>
+        <w:tabs>
+          <w:tab w:val="left" w:pos="1560"/>
+        </w:tabs>
+        <w:rPr>
+          <w:sz w:val="28"/>
+          <w:szCs w:val="24"/>
+          <w:lang w:val="en-US"/>
+        </w:rPr>
+      </w:pPr>
+      <w:r>
+        <w:rPr>
+          <w:sz w:val="28"/>
+          <w:szCs w:val="24"/>
+          <w:lang w:val="en-US"/>
+        </w:rPr>
+        <w:t xml:space="preserve">Scenario Outline </w:t>
+      </w:r>
+      <w:r>
+        <w:rPr>
+          <w:sz w:val="28"/>
+          <w:szCs w:val="24"/>
+          <w:lang w:val="en-US"/>
+        </w:rPr>
+        <w:sym w:font="Wingdings" w:char="F0E0"/>
+      </w:r>
+      <w:r>
+        <w:rPr>
+          <w:sz w:val="28"/>
+          <w:szCs w:val="24"/>
+          <w:lang w:val="en-US"/>
+        </w:rPr>
+        <w:t xml:space="preserve"> </w:t>
+      </w:r>
+      <w:r>
+        <w:rPr>
+          <w:sz w:val="28"/>
+          <w:szCs w:val="24"/>
+          <w:lang w:val="en-US"/>
+        </w:rPr>
+        <w:t>Used in Data</w:t>
+      </w:r>
+      <w:r>
+        <w:rPr>
+          <w:sz w:val="28"/>
+          <w:szCs w:val="24"/>
+          <w:lang w:val="en-US"/>
+        </w:rPr>
+        <w:t xml:space="preserve"> Driven Testing to accept the data</w:t>
+      </w:r>
+    </w:p>
+    <w:p>
+      <w:pPr>
+        <w:tabs>
+          <w:tab w:val="left" w:pos="1560"/>
+        </w:tabs>
+        <w:rPr>
+          <w:sz w:val="28"/>
+          <w:szCs w:val="24"/>
+          <w:lang w:val="en-US"/>
+        </w:rPr>
+      </w:pPr>
+    </w:p>
+    <w:p>
+      <w:pPr>
+        <w:tabs>
+          <w:tab w:val="left" w:pos="1560"/>
+        </w:tabs>
+        <w:rPr>
+          <w:b/>
+          <w:bCs/>
+          <w:sz w:val="28"/>
+          <w:szCs w:val="24"/>
+          <w:lang w:val="en-US"/>
+        </w:rPr>
+      </w:pPr>
+      <w:r>
+        <w:rPr>
+          <w:b/>
+          <w:bCs/>
+          <w:sz w:val="28"/>
+          <w:szCs w:val="24"/>
+          <w:lang w:val="en-US"/>
+        </w:rPr>
+        <w:t>Creating Cucumber Project</w:t>
+      </w:r>
+    </w:p>
+    <w:p>
+      <w:pPr>
+        <w:pStyle w:val="ListParagraph"/>
+        <w:numPr>
+          <w:ilvl w:val="0"/>
+          <w:numId w:val="45"/>
+        </w:numPr>
+        <w:tabs>
+          <w:tab w:val="left" w:pos="1560"/>
+        </w:tabs>
+        <w:rPr>
+          <w:sz w:val="28"/>
+          <w:szCs w:val="24"/>
+          <w:lang w:val="en-US"/>
+        </w:rPr>
+      </w:pPr>
+      <w:r>
+        <w:rPr>
+          <w:sz w:val="28"/>
+          <w:szCs w:val="24"/>
+          <w:lang w:val="en-US"/>
+        </w:rPr>
+        <w:t xml:space="preserve">Click on File </w:t>
+      </w:r>
+      <w:r>
+        <w:rPr>
+          <w:sz w:val="28"/>
+          <w:szCs w:val="24"/>
+          <w:lang w:val="en-US"/>
+        </w:rPr>
+        <w:sym w:font="Wingdings" w:char="F0E0"/>
+      </w:r>
+      <w:r>
+        <w:rPr>
+          <w:sz w:val="28"/>
+          <w:szCs w:val="24"/>
+          <w:lang w:val="en-US"/>
+        </w:rPr>
+        <w:t xml:space="preserve"> New </w:t>
+      </w:r>
+      <w:r>
+        <w:rPr>
+          <w:sz w:val="28"/>
+          <w:szCs w:val="24"/>
+          <w:lang w:val="en-US"/>
+        </w:rPr>
+        <w:sym w:font="Wingdings" w:char="F0E0"/>
+      </w:r>
+      <w:r>
+        <w:rPr>
+          <w:sz w:val="28"/>
+          <w:szCs w:val="24"/>
+          <w:lang w:val="en-US"/>
+        </w:rPr>
+        <w:t xml:space="preserve"> Maven Project</w:t>
+      </w:r>
+    </w:p>
+    <w:p>
+      <w:pPr>
+        <w:pStyle w:val="ListParagraph"/>
+        <w:numPr>
+          <w:ilvl w:val="0"/>
+          <w:numId w:val="45"/>
+        </w:numPr>
+        <w:tabs>
+          <w:tab w:val="left" w:pos="1560"/>
+        </w:tabs>
+        <w:rPr>
+          <w:sz w:val="28"/>
+          <w:szCs w:val="24"/>
+          <w:lang w:val="en-US"/>
+        </w:rPr>
+      </w:pPr>
+      <w:r>
+        <w:rPr>
+          <w:sz w:val="28"/>
+          <w:szCs w:val="24"/>
+          <w:lang w:val="en-US"/>
+        </w:rPr>
+        <w:t>Select 3</w:t>
+      </w:r>
+      <w:r>
+        <w:rPr>
+          <w:sz w:val="28"/>
+          <w:szCs w:val="24"/>
+          <w:vertAlign w:val="superscript"/>
+          <w:lang w:val="en-US"/>
+        </w:rPr>
+        <w:t>rd</w:t>
+      </w:r>
+      <w:r>
+        <w:rPr>
+          <w:sz w:val="28"/>
+          <w:szCs w:val="24"/>
+          <w:lang w:val="en-US"/>
+        </w:rPr>
+        <w:t xml:space="preserve"> check box (Add project to working set)</w:t>
+      </w:r>
+    </w:p>
+    <w:p>
+      <w:pPr>
+        <w:pStyle w:val="ListParagraph"/>
+        <w:numPr>
+          <w:ilvl w:val="0"/>
+          <w:numId w:val="45"/>
+        </w:numPr>
+        <w:tabs>
+          <w:tab w:val="left" w:pos="1560"/>
+        </w:tabs>
+        <w:rPr>
+          <w:sz w:val="28"/>
+          <w:szCs w:val="24"/>
+          <w:lang w:val="en-US"/>
+        </w:rPr>
+      </w:pPr>
+      <w:r>
+        <w:rPr>
+          <w:sz w:val="28"/>
+          <w:szCs w:val="24"/>
+          <w:lang w:val="en-US"/>
+        </w:rPr>
+        <w:t>Click on Next</w:t>
+      </w:r>
+    </w:p>
+    <w:p>
+      <w:pPr>
+        <w:pStyle w:val="ListParagraph"/>
+        <w:numPr>
+          <w:ilvl w:val="0"/>
+          <w:numId w:val="45"/>
+        </w:numPr>
+        <w:tabs>
+          <w:tab w:val="left" w:pos="1560"/>
+        </w:tabs>
+        <w:rPr>
+          <w:sz w:val="28"/>
+          <w:szCs w:val="24"/>
+          <w:lang w:val="en-US"/>
+        </w:rPr>
+      </w:pPr>
+      <w:r>
+        <w:rPr>
+          <w:sz w:val="28"/>
+          <w:szCs w:val="24"/>
+          <w:lang w:val="en-US"/>
+        </w:rPr>
+        <w:t xml:space="preserve">Add a filter as </w:t>
+      </w:r>
+      <w:proofErr w:type="spellStart"/>
+      <w:r>
+        <w:rPr>
+          <w:b/>
+          <w:bCs/>
+          <w:sz w:val="28"/>
+          <w:szCs w:val="24"/>
+          <w:lang w:val="en-US"/>
+        </w:rPr>
+        <w:t>io.cucumber</w:t>
+      </w:r>
+      <w:proofErr w:type="spellEnd"/>
+    </w:p>
+    <w:p>
+      <w:pPr>
+        <w:pStyle w:val="ListParagraph"/>
+        <w:numPr>
+          <w:ilvl w:val="0"/>
+          <w:numId w:val="45"/>
+        </w:numPr>
+        <w:tabs>
+          <w:tab w:val="left" w:pos="1560"/>
+        </w:tabs>
+        <w:rPr>
+          <w:sz w:val="28"/>
+          <w:szCs w:val="24"/>
+          <w:lang w:val="en-US"/>
+        </w:rPr>
+      </w:pPr>
+      <w:r>
+        <w:rPr>
+          <w:sz w:val="28"/>
+          <w:szCs w:val="24"/>
+          <w:lang w:val="en-US"/>
+        </w:rPr>
+        <w:t>Select the archetype and click on Next button</w:t>
+      </w:r>
+    </w:p>
+    <w:p>
+      <w:pPr>
+        <w:pStyle w:val="ListParagraph"/>
+        <w:numPr>
+          <w:ilvl w:val="0"/>
+          <w:numId w:val="45"/>
+        </w:numPr>
+        <w:tabs>
+          <w:tab w:val="left" w:pos="1560"/>
+        </w:tabs>
+        <w:rPr>
+          <w:sz w:val="28"/>
+          <w:szCs w:val="24"/>
+          <w:lang w:val="en-US"/>
+        </w:rPr>
+      </w:pPr>
+      <w:r>
+        <w:rPr>
+          <w:sz w:val="28"/>
+          <w:szCs w:val="24"/>
+          <w:lang w:val="en-US"/>
+        </w:rPr>
+        <w:t>Give group id and artifact id (Both should be same)</w:t>
+      </w:r>
+    </w:p>
+    <w:p>
+      <w:pPr>
+        <w:pStyle w:val="ListParagraph"/>
+        <w:numPr>
+          <w:ilvl w:val="0"/>
+          <w:numId w:val="45"/>
+        </w:numPr>
+        <w:tabs>
+          <w:tab w:val="left" w:pos="1560"/>
+        </w:tabs>
+        <w:rPr>
+          <w:sz w:val="28"/>
+          <w:szCs w:val="24"/>
+          <w:lang w:val="en-US"/>
+        </w:rPr>
+      </w:pPr>
+      <w:r>
+        <w:rPr>
+          <w:sz w:val="28"/>
+          <w:szCs w:val="24"/>
+          <w:lang w:val="en-US"/>
+        </w:rPr>
+        <w:t>Click on Finish</w:t>
+      </w:r>
+    </w:p>
+    <w:p>
+      <w:pPr>
+        <w:pStyle w:val="ListParagraph"/>
+        <w:numPr>
+          <w:ilvl w:val="0"/>
+          <w:numId w:val="45"/>
+        </w:numPr>
+        <w:tabs>
+          <w:tab w:val="left" w:pos="1560"/>
+        </w:tabs>
+        <w:rPr>
+          <w:sz w:val="28"/>
+          <w:szCs w:val="24"/>
+          <w:lang w:val="en-US"/>
+        </w:rPr>
+      </w:pPr>
+      <w:r>
+        <w:rPr>
+          <w:sz w:val="28"/>
+          <w:szCs w:val="24"/>
+          <w:lang w:val="en-US"/>
+        </w:rPr>
+        <w:t>After creating project</w:t>
+      </w:r>
+    </w:p>
+    <w:p>
+      <w:pPr>
+        <w:pStyle w:val="ListParagraph"/>
+        <w:numPr>
+          <w:ilvl w:val="1"/>
+          <w:numId w:val="45"/>
+        </w:numPr>
+        <w:tabs>
+          <w:tab w:val="left" w:pos="1560"/>
+        </w:tabs>
+        <w:rPr>
+          <w:sz w:val="28"/>
+          <w:szCs w:val="24"/>
+          <w:lang w:val="en-US"/>
+        </w:rPr>
+      </w:pPr>
+      <w:r>
+        <w:rPr>
+          <w:sz w:val="28"/>
+          <w:szCs w:val="24"/>
+          <w:lang w:val="en-US"/>
+        </w:rPr>
+        <w:t xml:space="preserve">Delete the readymade package from </w:t>
+      </w:r>
+      <w:proofErr w:type="spellStart"/>
+      <w:r>
+        <w:rPr>
+          <w:sz w:val="28"/>
+          <w:szCs w:val="24"/>
+          <w:lang w:val="en-US"/>
+        </w:rPr>
+        <w:t>src</w:t>
+      </w:r>
+      <w:proofErr w:type="spellEnd"/>
+      <w:r>
+        <w:rPr>
+          <w:sz w:val="28"/>
+          <w:szCs w:val="24"/>
+          <w:lang w:val="en-US"/>
+        </w:rPr>
+        <w:t>/test/java</w:t>
+      </w:r>
+    </w:p>
+    <w:p>
+      <w:pPr>
+        <w:pStyle w:val="ListParagraph"/>
+        <w:numPr>
+          <w:ilvl w:val="0"/>
+          <w:numId w:val="45"/>
+        </w:numPr>
+        <w:tabs>
+          <w:tab w:val="left" w:pos="1560"/>
+        </w:tabs>
+        <w:rPr>
+          <w:sz w:val="28"/>
+          <w:szCs w:val="24"/>
+          <w:lang w:val="en-US"/>
+        </w:rPr>
+      </w:pPr>
+      <w:r>
+        <w:rPr>
+          <w:sz w:val="28"/>
+          <w:szCs w:val="24"/>
+          <w:lang w:val="en-US"/>
+        </w:rPr>
+        <w:t>Open pom.xml file</w:t>
+      </w:r>
+    </w:p>
+    <w:p>
+      <w:pPr>
+        <w:pStyle w:val="ListParagraph"/>
+        <w:numPr>
+          <w:ilvl w:val="0"/>
+          <w:numId w:val="45"/>
+        </w:numPr>
+        <w:tabs>
+          <w:tab w:val="left" w:pos="1560"/>
+        </w:tabs>
+        <w:rPr>
+          <w:sz w:val="28"/>
+          <w:szCs w:val="24"/>
+          <w:lang w:val="en-US"/>
+        </w:rPr>
+      </w:pPr>
+      <w:r>
+        <w:rPr>
+          <w:sz w:val="28"/>
+          <w:szCs w:val="24"/>
+          <w:lang w:val="en-US"/>
+        </w:rPr>
+        <w:t>Delete the code from &lt;properties&gt; (line no 12) till &lt;/dependencies&gt; (line no)</w:t>
+      </w:r>
+    </w:p>
+    <w:p>
+      <w:pPr>
+        <w:pStyle w:val="ListParagraph"/>
+        <w:numPr>
+          <w:ilvl w:val="0"/>
+          <w:numId w:val="45"/>
+        </w:numPr>
+        <w:tabs>
+          <w:tab w:val="left" w:pos="1560"/>
+        </w:tabs>
+        <w:rPr>
+          <w:sz w:val="28"/>
+          <w:szCs w:val="24"/>
+          <w:lang w:val="en-US"/>
+        </w:rPr>
+      </w:pPr>
+      <w:r>
+        <w:rPr>
+          <w:sz w:val="28"/>
+          <w:szCs w:val="24"/>
+          <w:lang w:val="en-US"/>
+        </w:rPr>
+        <w:t xml:space="preserve">Open </w:t>
+      </w:r>
+      <w:hyperlink r:id="rId16" w:history="1">
+        <w:r>
+          <w:rPr>
+            <w:rStyle w:val="Hyperlink"/>
+            <w:sz w:val="28"/>
+            <w:szCs w:val="24"/>
+            <w:lang w:val="en-US"/>
+          </w:rPr>
+          <w:t>https://github.com/cucumber/cucumber-java-skeleton/commit/d7249b50c570816eba27ce94557e1de7e9b0f97</w:t>
+        </w:r>
+      </w:hyperlink>
+      <w:r>
+        <w:rPr>
+          <w:sz w:val="28"/>
+          <w:szCs w:val="24"/>
+          <w:lang w:val="en-US"/>
+        </w:rPr>
+        <w:t xml:space="preserve"> in browser</w:t>
+      </w:r>
+    </w:p>
+    <w:p>
+      <w:pPr>
+        <w:pStyle w:val="ListParagraph"/>
+        <w:numPr>
+          <w:ilvl w:val="0"/>
+          <w:numId w:val="45"/>
+        </w:numPr>
+        <w:tabs>
+          <w:tab w:val="left" w:pos="1560"/>
+        </w:tabs>
+        <w:rPr>
+          <w:sz w:val="28"/>
+          <w:szCs w:val="24"/>
+          <w:lang w:val="en-US"/>
+        </w:rPr>
+      </w:pPr>
+      <w:r>
+        <w:rPr>
+          <w:sz w:val="28"/>
+          <w:szCs w:val="24"/>
+          <w:lang w:val="en-US"/>
+        </w:rPr>
+        <w:t>copy the code from &lt;properties&gt; (line no 11) till &lt;/dependencies&gt; (line no 41)</w:t>
+      </w:r>
+    </w:p>
+    <w:p>
+      <w:pPr>
+        <w:pStyle w:val="ListParagraph"/>
+        <w:numPr>
+          <w:ilvl w:val="0"/>
+          <w:numId w:val="45"/>
+        </w:numPr>
+        <w:tabs>
+          <w:tab w:val="left" w:pos="1560"/>
+        </w:tabs>
+        <w:rPr>
+          <w:sz w:val="28"/>
+          <w:szCs w:val="24"/>
+          <w:lang w:val="en-US"/>
+        </w:rPr>
+      </w:pPr>
+      <w:r>
+        <w:rPr>
+          <w:sz w:val="28"/>
+          <w:szCs w:val="24"/>
+          <w:lang w:val="en-US"/>
+        </w:rPr>
+        <w:t>and paste this code in pom.xml file where you have deleted the code in earlier step</w:t>
+      </w:r>
+    </w:p>
+    <w:p>
+      <w:pPr>
+        <w:pBdr>
+          <w:top w:val="single" w:sz="6" w:space="1" w:color="auto"/>
+          <w:bottom w:val="single" w:sz="6" w:space="1" w:color="auto"/>
+        </w:pBdr>
+        <w:tabs>
+          <w:tab w:val="left" w:pos="1560"/>
+        </w:tabs>
+        <w:rPr>
+          <w:sz w:val="28"/>
+          <w:szCs w:val="24"/>
+          <w:lang w:val="en-US"/>
+        </w:rPr>
+      </w:pPr>
+      <w:r>
+        <w:rPr>
+          <w:sz w:val="28"/>
+          <w:szCs w:val="24"/>
+          <w:lang w:val="en-US"/>
+        </w:rPr>
+        <w:t>Feature File</w:t>
+      </w:r>
+    </w:p>
+    <w:p>
+      <w:pPr>
+        <w:tabs>
+          <w:tab w:val="left" w:pos="1560"/>
+        </w:tabs>
+        <w:rPr>
+          <w:sz w:val="28"/>
+          <w:szCs w:val="24"/>
+          <w:lang w:val="en-US"/>
+        </w:rPr>
+      </w:pPr>
+      <w:r>
+        <w:rPr>
+          <w:sz w:val="28"/>
+          <w:szCs w:val="24"/>
+          <w:lang w:val="en-US"/>
+        </w:rPr>
+        <w:t>Requirement – Verify title of Google</w:t>
+      </w:r>
+    </w:p>
+    <w:p>
+      <w:pPr>
+        <w:pStyle w:val="ListParagraph"/>
+        <w:numPr>
+          <w:ilvl w:val="0"/>
+          <w:numId w:val="46"/>
+        </w:numPr>
+        <w:tabs>
+          <w:tab w:val="left" w:pos="1560"/>
+        </w:tabs>
+        <w:rPr>
+          <w:sz w:val="28"/>
+          <w:szCs w:val="24"/>
+          <w:lang w:val="en-US"/>
+        </w:rPr>
+      </w:pPr>
+      <w:r>
+        <w:rPr>
+          <w:sz w:val="28"/>
+          <w:szCs w:val="24"/>
+          <w:lang w:val="en-US"/>
+        </w:rPr>
+        <w:t>Open Google</w:t>
+      </w:r>
+    </w:p>
+    <w:p>
+      <w:pPr>
+        <w:pStyle w:val="ListParagraph"/>
+        <w:numPr>
+          <w:ilvl w:val="0"/>
+          <w:numId w:val="46"/>
+        </w:numPr>
+        <w:tabs>
+          <w:tab w:val="left" w:pos="1560"/>
+        </w:tabs>
+        <w:rPr>
+          <w:sz w:val="28"/>
+          <w:szCs w:val="24"/>
+          <w:lang w:val="en-US"/>
+        </w:rPr>
+      </w:pPr>
+      <w:r>
+        <w:rPr>
+          <w:sz w:val="28"/>
+          <w:szCs w:val="24"/>
+          <w:lang w:val="en-US"/>
+        </w:rPr>
+        <w:t>Read the title</w:t>
+      </w:r>
+    </w:p>
+    <w:p>
+      <w:pPr>
+        <w:pStyle w:val="ListParagraph"/>
+        <w:numPr>
+          <w:ilvl w:val="0"/>
+          <w:numId w:val="46"/>
+        </w:numPr>
+        <w:tabs>
+          <w:tab w:val="left" w:pos="1560"/>
+        </w:tabs>
+        <w:rPr>
+          <w:sz w:val="28"/>
+          <w:szCs w:val="24"/>
+          <w:lang w:val="en-US"/>
+        </w:rPr>
+      </w:pPr>
+      <w:r>
+        <w:rPr>
+          <w:sz w:val="28"/>
+          <w:szCs w:val="24"/>
+          <w:lang w:val="en-US"/>
+        </w:rPr>
+        <w:t>Title should be Google</w:t>
+      </w:r>
+    </w:p>
+    <w:p>
+      <w:pPr>
+        <w:tabs>
+          <w:tab w:val="left" w:pos="1560"/>
+        </w:tabs>
+        <w:rPr>
+          <w:sz w:val="28"/>
+          <w:szCs w:val="24"/>
+          <w:lang w:val="en-US"/>
+        </w:rPr>
+      </w:pPr>
+      <w:r>
+        <w:rPr>
+          <w:sz w:val="28"/>
+          <w:szCs w:val="24"/>
+          <w:lang w:val="en-US"/>
+        </w:rPr>
+        <w:t>Feature File</w:t>
+      </w:r>
+    </w:p>
+    <w:p>
+      <w:pPr>
+        <w:tabs>
+          <w:tab w:val="left" w:pos="1560"/>
+        </w:tabs>
+        <w:rPr>
+          <w:sz w:val="28"/>
+          <w:szCs w:val="24"/>
+          <w:lang w:val="en-US"/>
+        </w:rPr>
+      </w:pPr>
+      <w:r>
+        <w:rPr>
+          <w:sz w:val="28"/>
+          <w:szCs w:val="24"/>
+          <w:lang w:val="en-US"/>
+        </w:rPr>
+        <w:t xml:space="preserve">Feature: </w:t>
+      </w:r>
+      <w:r>
+        <w:rPr>
+          <w:sz w:val="28"/>
+          <w:szCs w:val="24"/>
+          <w:lang w:val="en-US"/>
+        </w:rPr>
+        <w:t>Google title</w:t>
+      </w:r>
+    </w:p>
+    <w:p>
+      <w:pPr>
+        <w:tabs>
+          <w:tab w:val="left" w:pos="1560"/>
+        </w:tabs>
+        <w:rPr>
+          <w:sz w:val="28"/>
+          <w:szCs w:val="24"/>
+          <w:lang w:val="en-US"/>
+        </w:rPr>
+      </w:pPr>
+      <w:r>
+        <w:rPr>
+          <w:sz w:val="28"/>
+          <w:szCs w:val="24"/>
+          <w:lang w:val="en-US"/>
+        </w:rPr>
+        <w:t>Scenario: To verify title of Google</w:t>
+      </w:r>
+    </w:p>
+    <w:p>
+      <w:pPr>
+        <w:tabs>
+          <w:tab w:val="left" w:pos="1560"/>
+        </w:tabs>
+        <w:rPr>
+          <w:sz w:val="28"/>
+          <w:szCs w:val="24"/>
+          <w:lang w:val="en-US"/>
+        </w:rPr>
+      </w:pPr>
+      <w:r>
+        <w:rPr>
+          <w:sz w:val="28"/>
+          <w:szCs w:val="24"/>
+          <w:lang w:val="en-US"/>
+        </w:rPr>
+        <w:lastRenderedPageBreak/>
+        <w:t>Given Launch Google</w:t>
+      </w:r>
+    </w:p>
+    <w:p>
+      <w:pPr>
+        <w:tabs>
+          <w:tab w:val="left" w:pos="1560"/>
+        </w:tabs>
+        <w:rPr>
+          <w:sz w:val="28"/>
+          <w:szCs w:val="24"/>
+          <w:lang w:val="en-US"/>
+        </w:rPr>
+      </w:pPr>
+      <w:r>
+        <w:rPr>
+          <w:sz w:val="28"/>
+          <w:szCs w:val="24"/>
+          <w:lang w:val="en-US"/>
+        </w:rPr>
+        <w:t>When Read the title</w:t>
+      </w:r>
+    </w:p>
+    <w:p>
+      <w:pPr>
+        <w:pBdr>
+          <w:bottom w:val="single" w:sz="6" w:space="1" w:color="auto"/>
+        </w:pBdr>
+        <w:tabs>
+          <w:tab w:val="left" w:pos="1560"/>
+        </w:tabs>
+        <w:rPr>
+          <w:sz w:val="28"/>
+          <w:szCs w:val="24"/>
+          <w:lang w:val="en-US"/>
+        </w:rPr>
+      </w:pPr>
+      <w:r>
+        <w:rPr>
+          <w:sz w:val="28"/>
+          <w:szCs w:val="24"/>
+          <w:lang w:val="en-US"/>
+        </w:rPr>
+        <w:t>Then Title should be Google</w:t>
+      </w:r>
+    </w:p>
+    <w:p>
+      <w:pPr>
         <w:tabs>
           <w:tab w:val="left" w:pos="1560"/>
         </w:tabs>
@@ -16445,6 +18510,18 @@
       </w:pPr>
       <w:bookmarkStart w:id="0" w:name="_GoBack"/>
       <w:bookmarkEnd w:id="0"/>
+    </w:p>
+    <w:p>
+      <w:pPr>
+        <w:tabs>
+          <w:tab w:val="left" w:pos="1560"/>
+        </w:tabs>
+        <w:rPr>
+          <w:sz w:val="28"/>
+          <w:szCs w:val="24"/>
+          <w:lang w:val="en-US"/>
+        </w:rPr>
+      </w:pPr>
     </w:p>
     <w:sectPr>
       <w:pgSz w:w="11906" w:h="16838"/>
@@ -17202,6 +19279,232 @@
     </w:lvl>
   </w:abstractNum>
   <w:abstractNum w:abstractNumId="7">
+    <w:nsid w:val="17887E81"/>
+    <w:multiLevelType w:val="hybridMultilevel"/>
+    <w:tmpl w:val="F448FA1A"/>
+    <w:lvl w:ilvl="0" w:tplc="40090001">
+      <w:start w:val="1"/>
+      <w:numFmt w:val="bullet"/>
+      <w:lvlText w:val=""/>
+      <w:lvlJc w:val="left"/>
+      <w:pPr>
+        <w:ind w:left="720" w:hanging="360"/>
+      </w:pPr>
+      <w:rPr>
+        <w:rFonts w:ascii="Symbol" w:hAnsi="Symbol" w:hint="default"/>
+      </w:rPr>
+    </w:lvl>
+    <w:lvl w:ilvl="1" w:tplc="40090003">
+      <w:start w:val="1"/>
+      <w:numFmt w:val="bullet"/>
+      <w:lvlText w:val="o"/>
+      <w:lvlJc w:val="left"/>
+      <w:pPr>
+        <w:ind w:left="1440" w:hanging="360"/>
+      </w:pPr>
+      <w:rPr>
+        <w:rFonts w:ascii="Courier New" w:hAnsi="Courier New" w:cs="Courier New" w:hint="default"/>
+      </w:rPr>
+    </w:lvl>
+    <w:lvl w:ilvl="2" w:tplc="40090005" w:tentative="1">
+      <w:start w:val="1"/>
+      <w:numFmt w:val="bullet"/>
+      <w:lvlText w:val=""/>
+      <w:lvlJc w:val="left"/>
+      <w:pPr>
+        <w:ind w:left="2160" w:hanging="360"/>
+      </w:pPr>
+      <w:rPr>
+        <w:rFonts w:ascii="Wingdings" w:hAnsi="Wingdings" w:hint="default"/>
+      </w:rPr>
+    </w:lvl>
+    <w:lvl w:ilvl="3" w:tplc="40090001" w:tentative="1">
+      <w:start w:val="1"/>
+      <w:numFmt w:val="bullet"/>
+      <w:lvlText w:val=""/>
+      <w:lvlJc w:val="left"/>
+      <w:pPr>
+        <w:ind w:left="2880" w:hanging="360"/>
+      </w:pPr>
+      <w:rPr>
+        <w:rFonts w:ascii="Symbol" w:hAnsi="Symbol" w:hint="default"/>
+      </w:rPr>
+    </w:lvl>
+    <w:lvl w:ilvl="4" w:tplc="40090003" w:tentative="1">
+      <w:start w:val="1"/>
+      <w:numFmt w:val="bullet"/>
+      <w:lvlText w:val="o"/>
+      <w:lvlJc w:val="left"/>
+      <w:pPr>
+        <w:ind w:left="3600" w:hanging="360"/>
+      </w:pPr>
+      <w:rPr>
+        <w:rFonts w:ascii="Courier New" w:hAnsi="Courier New" w:cs="Courier New" w:hint="default"/>
+      </w:rPr>
+    </w:lvl>
+    <w:lvl w:ilvl="5" w:tplc="40090005" w:tentative="1">
+      <w:start w:val="1"/>
+      <w:numFmt w:val="bullet"/>
+      <w:lvlText w:val=""/>
+      <w:lvlJc w:val="left"/>
+      <w:pPr>
+        <w:ind w:left="4320" w:hanging="360"/>
+      </w:pPr>
+      <w:rPr>
+        <w:rFonts w:ascii="Wingdings" w:hAnsi="Wingdings" w:hint="default"/>
+      </w:rPr>
+    </w:lvl>
+    <w:lvl w:ilvl="6" w:tplc="40090001" w:tentative="1">
+      <w:start w:val="1"/>
+      <w:numFmt w:val="bullet"/>
+      <w:lvlText w:val=""/>
+      <w:lvlJc w:val="left"/>
+      <w:pPr>
+        <w:ind w:left="5040" w:hanging="360"/>
+      </w:pPr>
+      <w:rPr>
+        <w:rFonts w:ascii="Symbol" w:hAnsi="Symbol" w:hint="default"/>
+      </w:rPr>
+    </w:lvl>
+    <w:lvl w:ilvl="7" w:tplc="40090003" w:tentative="1">
+      <w:start w:val="1"/>
+      <w:numFmt w:val="bullet"/>
+      <w:lvlText w:val="o"/>
+      <w:lvlJc w:val="left"/>
+      <w:pPr>
+        <w:ind w:left="5760" w:hanging="360"/>
+      </w:pPr>
+      <w:rPr>
+        <w:rFonts w:ascii="Courier New" w:hAnsi="Courier New" w:cs="Courier New" w:hint="default"/>
+      </w:rPr>
+    </w:lvl>
+    <w:lvl w:ilvl="8" w:tplc="40090005" w:tentative="1">
+      <w:start w:val="1"/>
+      <w:numFmt w:val="bullet"/>
+      <w:lvlText w:val=""/>
+      <w:lvlJc w:val="left"/>
+      <w:pPr>
+        <w:ind w:left="6480" w:hanging="360"/>
+      </w:pPr>
+      <w:rPr>
+        <w:rFonts w:ascii="Wingdings" w:hAnsi="Wingdings" w:hint="default"/>
+      </w:rPr>
+    </w:lvl>
+  </w:abstractNum>
+  <w:abstractNum w:abstractNumId="8">
+    <w:nsid w:val="1E9B63EE"/>
+    <w:multiLevelType w:val="hybridMultilevel"/>
+    <w:tmpl w:val="CC24F4FC"/>
+    <w:lvl w:ilvl="0" w:tplc="40090001">
+      <w:start w:val="1"/>
+      <w:numFmt w:val="bullet"/>
+      <w:lvlText w:val=""/>
+      <w:lvlJc w:val="left"/>
+      <w:pPr>
+        <w:ind w:left="720" w:hanging="360"/>
+      </w:pPr>
+      <w:rPr>
+        <w:rFonts w:ascii="Symbol" w:hAnsi="Symbol" w:hint="default"/>
+      </w:rPr>
+    </w:lvl>
+    <w:lvl w:ilvl="1" w:tplc="40090003">
+      <w:start w:val="1"/>
+      <w:numFmt w:val="bullet"/>
+      <w:lvlText w:val="o"/>
+      <w:lvlJc w:val="left"/>
+      <w:pPr>
+        <w:ind w:left="1440" w:hanging="360"/>
+      </w:pPr>
+      <w:rPr>
+        <w:rFonts w:ascii="Courier New" w:hAnsi="Courier New" w:cs="Courier New" w:hint="default"/>
+      </w:rPr>
+    </w:lvl>
+    <w:lvl w:ilvl="2" w:tplc="40090005">
+      <w:start w:val="1"/>
+      <w:numFmt w:val="bullet"/>
+      <w:lvlText w:val=""/>
+      <w:lvlJc w:val="left"/>
+      <w:pPr>
+        <w:ind w:left="2160" w:hanging="360"/>
+      </w:pPr>
+      <w:rPr>
+        <w:rFonts w:ascii="Wingdings" w:hAnsi="Wingdings" w:hint="default"/>
+      </w:rPr>
+    </w:lvl>
+    <w:lvl w:ilvl="3" w:tplc="40090001" w:tentative="1">
+      <w:start w:val="1"/>
+      <w:numFmt w:val="bullet"/>
+      <w:lvlText w:val=""/>
+      <w:lvlJc w:val="left"/>
+      <w:pPr>
+        <w:ind w:left="2880" w:hanging="360"/>
+      </w:pPr>
+      <w:rPr>
+        <w:rFonts w:ascii="Symbol" w:hAnsi="Symbol" w:hint="default"/>
+      </w:rPr>
+    </w:lvl>
+    <w:lvl w:ilvl="4" w:tplc="40090003" w:tentative="1">
+      <w:start w:val="1"/>
+      <w:numFmt w:val="bullet"/>
+      <w:lvlText w:val="o"/>
+      <w:lvlJc w:val="left"/>
+      <w:pPr>
+        <w:ind w:left="3600" w:hanging="360"/>
+      </w:pPr>
+      <w:rPr>
+        <w:rFonts w:ascii="Courier New" w:hAnsi="Courier New" w:cs="Courier New" w:hint="default"/>
+      </w:rPr>
+    </w:lvl>
+    <w:lvl w:ilvl="5" w:tplc="40090005" w:tentative="1">
+      <w:start w:val="1"/>
+      <w:numFmt w:val="bullet"/>
+      <w:lvlText w:val=""/>
+      <w:lvlJc w:val="left"/>
+      <w:pPr>
+        <w:ind w:left="4320" w:hanging="360"/>
+      </w:pPr>
+      <w:rPr>
+        <w:rFonts w:ascii="Wingdings" w:hAnsi="Wingdings" w:hint="default"/>
+      </w:rPr>
+    </w:lvl>
+    <w:lvl w:ilvl="6" w:tplc="40090001" w:tentative="1">
+      <w:start w:val="1"/>
+      <w:numFmt w:val="bullet"/>
+      <w:lvlText w:val=""/>
+      <w:lvlJc w:val="left"/>
+      <w:pPr>
+        <w:ind w:left="5040" w:hanging="360"/>
+      </w:pPr>
+      <w:rPr>
+        <w:rFonts w:ascii="Symbol" w:hAnsi="Symbol" w:hint="default"/>
+      </w:rPr>
+    </w:lvl>
+    <w:lvl w:ilvl="7" w:tplc="40090003" w:tentative="1">
+      <w:start w:val="1"/>
+      <w:numFmt w:val="bullet"/>
+      <w:lvlText w:val="o"/>
+      <w:lvlJc w:val="left"/>
+      <w:pPr>
+        <w:ind w:left="5760" w:hanging="360"/>
+      </w:pPr>
+      <w:rPr>
+        <w:rFonts w:ascii="Courier New" w:hAnsi="Courier New" w:cs="Courier New" w:hint="default"/>
+      </w:rPr>
+    </w:lvl>
+    <w:lvl w:ilvl="8" w:tplc="40090005" w:tentative="1">
+      <w:start w:val="1"/>
+      <w:numFmt w:val="bullet"/>
+      <w:lvlText w:val=""/>
+      <w:lvlJc w:val="left"/>
+      <w:pPr>
+        <w:ind w:left="6480" w:hanging="360"/>
+      </w:pPr>
+      <w:rPr>
+        <w:rFonts w:ascii="Wingdings" w:hAnsi="Wingdings" w:hint="default"/>
+      </w:rPr>
+    </w:lvl>
+  </w:abstractNum>
+  <w:abstractNum w:abstractNumId="9">
     <w:nsid w:val="1F5D6F6F"/>
     <w:multiLevelType w:val="hybridMultilevel"/>
     <w:tmpl w:val="2C66BBE6"/>
@@ -17314,7 +19617,7 @@
       </w:rPr>
     </w:lvl>
   </w:abstractNum>
-  <w:abstractNum w:abstractNumId="8">
+  <w:abstractNum w:abstractNumId="10">
     <w:nsid w:val="1FFE0324"/>
     <w:multiLevelType w:val="hybridMultilevel"/>
     <w:tmpl w:val="562439F6"/>
@@ -17427,7 +19730,7 @@
       </w:rPr>
     </w:lvl>
   </w:abstractNum>
-  <w:abstractNum w:abstractNumId="9">
+  <w:abstractNum w:abstractNumId="11">
     <w:nsid w:val="21270C12"/>
     <w:multiLevelType w:val="hybridMultilevel"/>
     <w:tmpl w:val="77C8B216"/>
@@ -17540,7 +19843,7 @@
       </w:rPr>
     </w:lvl>
   </w:abstractNum>
-  <w:abstractNum w:abstractNumId="10">
+  <w:abstractNum w:abstractNumId="12">
     <w:nsid w:val="26EA2626"/>
     <w:multiLevelType w:val="hybridMultilevel"/>
     <w:tmpl w:val="6D525678"/>
@@ -17626,7 +19929,7 @@
       </w:pPr>
     </w:lvl>
   </w:abstractNum>
-  <w:abstractNum w:abstractNumId="11">
+  <w:abstractNum w:abstractNumId="13">
     <w:nsid w:val="2BD5541D"/>
     <w:multiLevelType w:val="hybridMultilevel"/>
     <w:tmpl w:val="45505B90"/>
@@ -17739,7 +20042,7 @@
       </w:rPr>
     </w:lvl>
   </w:abstractNum>
-  <w:abstractNum w:abstractNumId="12">
+  <w:abstractNum w:abstractNumId="14">
     <w:nsid w:val="2C310AF1"/>
     <w:multiLevelType w:val="hybridMultilevel"/>
     <w:tmpl w:val="D80E52EC"/>
@@ -17852,7 +20155,7 @@
       </w:rPr>
     </w:lvl>
   </w:abstractNum>
-  <w:abstractNum w:abstractNumId="13">
+  <w:abstractNum w:abstractNumId="15">
     <w:nsid w:val="2DF83EE9"/>
     <w:multiLevelType w:val="hybridMultilevel"/>
     <w:tmpl w:val="5C824650"/>
@@ -17965,7 +20268,7 @@
       </w:rPr>
     </w:lvl>
   </w:abstractNum>
-  <w:abstractNum w:abstractNumId="14">
+  <w:abstractNum w:abstractNumId="16">
     <w:nsid w:val="2ED85F35"/>
     <w:multiLevelType w:val="hybridMultilevel"/>
     <w:tmpl w:val="D396C416"/>
@@ -18054,7 +20357,7 @@
       </w:pPr>
     </w:lvl>
   </w:abstractNum>
-  <w:abstractNum w:abstractNumId="15">
+  <w:abstractNum w:abstractNumId="17">
     <w:nsid w:val="2F5B6010"/>
     <w:multiLevelType w:val="hybridMultilevel"/>
     <w:tmpl w:val="303E3506"/>
@@ -18167,7 +20470,7 @@
       </w:rPr>
     </w:lvl>
   </w:abstractNum>
-  <w:abstractNum w:abstractNumId="16">
+  <w:abstractNum w:abstractNumId="18">
     <w:nsid w:val="344C7AD5"/>
     <w:multiLevelType w:val="hybridMultilevel"/>
     <w:tmpl w:val="3AB6C236"/>
@@ -18280,7 +20583,7 @@
       </w:rPr>
     </w:lvl>
   </w:abstractNum>
-  <w:abstractNum w:abstractNumId="17">
+  <w:abstractNum w:abstractNumId="19">
     <w:nsid w:val="372A7643"/>
     <w:multiLevelType w:val="hybridMultilevel"/>
     <w:tmpl w:val="72661F18"/>
@@ -18393,7 +20696,7 @@
       </w:rPr>
     </w:lvl>
   </w:abstractNum>
-  <w:abstractNum w:abstractNumId="18">
+  <w:abstractNum w:abstractNumId="20">
     <w:nsid w:val="398E3101"/>
     <w:multiLevelType w:val="hybridMultilevel"/>
     <w:tmpl w:val="5972D984"/>
@@ -18479,7 +20782,7 @@
       </w:pPr>
     </w:lvl>
   </w:abstractNum>
-  <w:abstractNum w:abstractNumId="19">
+  <w:abstractNum w:abstractNumId="21">
     <w:nsid w:val="39FE7F6B"/>
     <w:multiLevelType w:val="hybridMultilevel"/>
     <w:tmpl w:val="DB76FF82"/>
@@ -18565,7 +20868,7 @@
       </w:pPr>
     </w:lvl>
   </w:abstractNum>
-  <w:abstractNum w:abstractNumId="20">
+  <w:abstractNum w:abstractNumId="22">
     <w:nsid w:val="3CDB6A66"/>
     <w:multiLevelType w:val="hybridMultilevel"/>
     <w:tmpl w:val="64685F9A"/>
@@ -18654,7 +20957,7 @@
       </w:pPr>
     </w:lvl>
   </w:abstractNum>
-  <w:abstractNum w:abstractNumId="21">
+  <w:abstractNum w:abstractNumId="23">
     <w:nsid w:val="3CE011C3"/>
     <w:multiLevelType w:val="hybridMultilevel"/>
     <w:tmpl w:val="31EA3DA2"/>
@@ -18743,7 +21046,7 @@
       </w:pPr>
     </w:lvl>
   </w:abstractNum>
-  <w:abstractNum w:abstractNumId="22">
+  <w:abstractNum w:abstractNumId="24">
     <w:nsid w:val="42DB17C6"/>
     <w:multiLevelType w:val="hybridMultilevel"/>
     <w:tmpl w:val="B638096C"/>
@@ -18832,7 +21135,7 @@
       </w:pPr>
     </w:lvl>
   </w:abstractNum>
-  <w:abstractNum w:abstractNumId="23">
+  <w:abstractNum w:abstractNumId="25">
     <w:nsid w:val="44424C1B"/>
     <w:multiLevelType w:val="hybridMultilevel"/>
     <w:tmpl w:val="EBDAADA4"/>
@@ -18945,7 +21248,7 @@
       </w:rPr>
     </w:lvl>
   </w:abstractNum>
-  <w:abstractNum w:abstractNumId="24">
+  <w:abstractNum w:abstractNumId="26">
     <w:nsid w:val="46DF09B1"/>
     <w:multiLevelType w:val="hybridMultilevel"/>
     <w:tmpl w:val="FB0236F0"/>
@@ -19058,7 +21361,7 @@
       </w:rPr>
     </w:lvl>
   </w:abstractNum>
-  <w:abstractNum w:abstractNumId="25">
+  <w:abstractNum w:abstractNumId="27">
     <w:nsid w:val="47F70A7E"/>
     <w:multiLevelType w:val="hybridMultilevel"/>
     <w:tmpl w:val="BCF8131E"/>
@@ -19147,7 +21450,7 @@
       </w:pPr>
     </w:lvl>
   </w:abstractNum>
-  <w:abstractNum w:abstractNumId="26">
+  <w:abstractNum w:abstractNumId="28">
     <w:nsid w:val="4FAE1062"/>
     <w:multiLevelType w:val="hybridMultilevel"/>
     <w:tmpl w:val="C1A67A02"/>
@@ -19236,7 +21539,7 @@
       </w:pPr>
     </w:lvl>
   </w:abstractNum>
-  <w:abstractNum w:abstractNumId="27">
+  <w:abstractNum w:abstractNumId="29">
     <w:nsid w:val="50CF4F8C"/>
     <w:multiLevelType w:val="hybridMultilevel"/>
     <w:tmpl w:val="082E2B26"/>
@@ -19349,7 +21652,7 @@
       </w:rPr>
     </w:lvl>
   </w:abstractNum>
-  <w:abstractNum w:abstractNumId="28">
+  <w:abstractNum w:abstractNumId="30">
     <w:nsid w:val="56DC0393"/>
     <w:multiLevelType w:val="hybridMultilevel"/>
     <w:tmpl w:val="BFA6E070"/>
@@ -19462,7 +21765,7 @@
       </w:rPr>
     </w:lvl>
   </w:abstractNum>
-  <w:abstractNum w:abstractNumId="29">
+  <w:abstractNum w:abstractNumId="31">
     <w:nsid w:val="5D2E0595"/>
     <w:multiLevelType w:val="hybridMultilevel"/>
     <w:tmpl w:val="BD76ED2E"/>
@@ -19575,7 +21878,96 @@
       </w:rPr>
     </w:lvl>
   </w:abstractNum>
-  <w:abstractNum w:abstractNumId="30">
+  <w:abstractNum w:abstractNumId="32">
+    <w:nsid w:val="6264615A"/>
+    <w:multiLevelType w:val="hybridMultilevel"/>
+    <w:tmpl w:val="BEBCD1E2"/>
+    <w:lvl w:ilvl="0" w:tplc="4009000F">
+      <w:start w:val="1"/>
+      <w:numFmt w:val="decimal"/>
+      <w:lvlText w:val="%1."/>
+      <w:lvlJc w:val="left"/>
+      <w:pPr>
+        <w:ind w:left="720" w:hanging="360"/>
+      </w:pPr>
+      <w:rPr>
+        <w:rFonts w:hint="default"/>
+      </w:rPr>
+    </w:lvl>
+    <w:lvl w:ilvl="1" w:tplc="40090019" w:tentative="1">
+      <w:start w:val="1"/>
+      <w:numFmt w:val="lowerLetter"/>
+      <w:lvlText w:val="%2."/>
+      <w:lvlJc w:val="left"/>
+      <w:pPr>
+        <w:ind w:left="1440" w:hanging="360"/>
+      </w:pPr>
+    </w:lvl>
+    <w:lvl w:ilvl="2" w:tplc="4009001B" w:tentative="1">
+      <w:start w:val="1"/>
+      <w:numFmt w:val="lowerRoman"/>
+      <w:lvlText w:val="%3."/>
+      <w:lvlJc w:val="right"/>
+      <w:pPr>
+        <w:ind w:left="2160" w:hanging="180"/>
+      </w:pPr>
+    </w:lvl>
+    <w:lvl w:ilvl="3" w:tplc="4009000F" w:tentative="1">
+      <w:start w:val="1"/>
+      <w:numFmt w:val="decimal"/>
+      <w:lvlText w:val="%4."/>
+      <w:lvlJc w:val="left"/>
+      <w:pPr>
+        <w:ind w:left="2880" w:hanging="360"/>
+      </w:pPr>
+    </w:lvl>
+    <w:lvl w:ilvl="4" w:tplc="40090019" w:tentative="1">
+      <w:start w:val="1"/>
+      <w:numFmt w:val="lowerLetter"/>
+      <w:lvlText w:val="%5."/>
+      <w:lvlJc w:val="left"/>
+      <w:pPr>
+        <w:ind w:left="3600" w:hanging="360"/>
+      </w:pPr>
+    </w:lvl>
+    <w:lvl w:ilvl="5" w:tplc="4009001B" w:tentative="1">
+      <w:start w:val="1"/>
+      <w:numFmt w:val="lowerRoman"/>
+      <w:lvlText w:val="%6."/>
+      <w:lvlJc w:val="right"/>
+      <w:pPr>
+        <w:ind w:left="4320" w:hanging="180"/>
+      </w:pPr>
+    </w:lvl>
+    <w:lvl w:ilvl="6" w:tplc="4009000F" w:tentative="1">
+      <w:start w:val="1"/>
+      <w:numFmt w:val="decimal"/>
+      <w:lvlText w:val="%7."/>
+      <w:lvlJc w:val="left"/>
+      <w:pPr>
+        <w:ind w:left="5040" w:hanging="360"/>
+      </w:pPr>
+    </w:lvl>
+    <w:lvl w:ilvl="7" w:tplc="40090019" w:tentative="1">
+      <w:start w:val="1"/>
+      <w:numFmt w:val="lowerLetter"/>
+      <w:lvlText w:val="%8."/>
+      <w:lvlJc w:val="left"/>
+      <w:pPr>
+        <w:ind w:left="5760" w:hanging="360"/>
+      </w:pPr>
+    </w:lvl>
+    <w:lvl w:ilvl="8" w:tplc="4009001B" w:tentative="1">
+      <w:start w:val="1"/>
+      <w:numFmt w:val="lowerRoman"/>
+      <w:lvlText w:val="%9."/>
+      <w:lvlJc w:val="right"/>
+      <w:pPr>
+        <w:ind w:left="6480" w:hanging="180"/>
+      </w:pPr>
+    </w:lvl>
+  </w:abstractNum>
+  <w:abstractNum w:abstractNumId="33">
     <w:nsid w:val="64B248FF"/>
     <w:multiLevelType w:val="hybridMultilevel"/>
     <w:tmpl w:val="47BA2214"/>
@@ -19688,7 +22080,7 @@
       </w:rPr>
     </w:lvl>
   </w:abstractNum>
-  <w:abstractNum w:abstractNumId="31">
+  <w:abstractNum w:abstractNumId="34">
     <w:nsid w:val="64D75A0A"/>
     <w:multiLevelType w:val="hybridMultilevel"/>
     <w:tmpl w:val="F93653D8"/>
@@ -19801,7 +22193,7 @@
       </w:rPr>
     </w:lvl>
   </w:abstractNum>
-  <w:abstractNum w:abstractNumId="32">
+  <w:abstractNum w:abstractNumId="35">
     <w:nsid w:val="65A70915"/>
     <w:multiLevelType w:val="hybridMultilevel"/>
     <w:tmpl w:val="F4BEB16C"/>
@@ -19890,7 +22282,7 @@
       </w:pPr>
     </w:lvl>
   </w:abstractNum>
-  <w:abstractNum w:abstractNumId="33">
+  <w:abstractNum w:abstractNumId="36">
     <w:nsid w:val="667572E6"/>
     <w:multiLevelType w:val="hybridMultilevel"/>
     <w:tmpl w:val="375E6AAA"/>
@@ -19979,7 +22371,7 @@
       </w:pPr>
     </w:lvl>
   </w:abstractNum>
-  <w:abstractNum w:abstractNumId="34">
+  <w:abstractNum w:abstractNumId="37">
     <w:nsid w:val="6794711A"/>
     <w:multiLevelType w:val="hybridMultilevel"/>
     <w:tmpl w:val="7D58095C"/>
@@ -20092,7 +22484,7 @@
       </w:rPr>
     </w:lvl>
   </w:abstractNum>
-  <w:abstractNum w:abstractNumId="35">
+  <w:abstractNum w:abstractNumId="38">
     <w:nsid w:val="6D6046F6"/>
     <w:multiLevelType w:val="hybridMultilevel"/>
     <w:tmpl w:val="6644C14E"/>
@@ -20181,7 +22573,7 @@
       </w:pPr>
     </w:lvl>
   </w:abstractNum>
-  <w:abstractNum w:abstractNumId="36">
+  <w:abstractNum w:abstractNumId="39">
     <w:nsid w:val="6FB6583E"/>
     <w:multiLevelType w:val="hybridMultilevel"/>
     <w:tmpl w:val="F83A92A4"/>
@@ -20294,7 +22686,7 @@
       </w:rPr>
     </w:lvl>
   </w:abstractNum>
-  <w:abstractNum w:abstractNumId="37">
+  <w:abstractNum w:abstractNumId="40">
     <w:nsid w:val="74A07B48"/>
     <w:multiLevelType w:val="hybridMultilevel"/>
     <w:tmpl w:val="9EE4049A"/>
@@ -20407,7 +22799,96 @@
       </w:rPr>
     </w:lvl>
   </w:abstractNum>
-  <w:abstractNum w:abstractNumId="38">
+  <w:abstractNum w:abstractNumId="41">
+    <w:nsid w:val="75D41A19"/>
+    <w:multiLevelType w:val="hybridMultilevel"/>
+    <w:tmpl w:val="8C2E2B00"/>
+    <w:lvl w:ilvl="0" w:tplc="4009000F">
+      <w:start w:val="1"/>
+      <w:numFmt w:val="decimal"/>
+      <w:lvlText w:val="%1."/>
+      <w:lvlJc w:val="left"/>
+      <w:pPr>
+        <w:ind w:left="720" w:hanging="360"/>
+      </w:pPr>
+      <w:rPr>
+        <w:rFonts w:hint="default"/>
+      </w:rPr>
+    </w:lvl>
+    <w:lvl w:ilvl="1" w:tplc="40090019" w:tentative="1">
+      <w:start w:val="1"/>
+      <w:numFmt w:val="lowerLetter"/>
+      <w:lvlText w:val="%2."/>
+      <w:lvlJc w:val="left"/>
+      <w:pPr>
+        <w:ind w:left="1440" w:hanging="360"/>
+      </w:pPr>
+    </w:lvl>
+    <w:lvl w:ilvl="2" w:tplc="4009001B" w:tentative="1">
+      <w:start w:val="1"/>
+      <w:numFmt w:val="lowerRoman"/>
+      <w:lvlText w:val="%3."/>
+      <w:lvlJc w:val="right"/>
+      <w:pPr>
+        <w:ind w:left="2160" w:hanging="180"/>
+      </w:pPr>
+    </w:lvl>
+    <w:lvl w:ilvl="3" w:tplc="4009000F" w:tentative="1">
+      <w:start w:val="1"/>
+      <w:numFmt w:val="decimal"/>
+      <w:lvlText w:val="%4."/>
+      <w:lvlJc w:val="left"/>
+      <w:pPr>
+        <w:ind w:left="2880" w:hanging="360"/>
+      </w:pPr>
+    </w:lvl>
+    <w:lvl w:ilvl="4" w:tplc="40090019" w:tentative="1">
+      <w:start w:val="1"/>
+      <w:numFmt w:val="lowerLetter"/>
+      <w:lvlText w:val="%5."/>
+      <w:lvlJc w:val="left"/>
+      <w:pPr>
+        <w:ind w:left="3600" w:hanging="360"/>
+      </w:pPr>
+    </w:lvl>
+    <w:lvl w:ilvl="5" w:tplc="4009001B" w:tentative="1">
+      <w:start w:val="1"/>
+      <w:numFmt w:val="lowerRoman"/>
+      <w:lvlText w:val="%6."/>
+      <w:lvlJc w:val="right"/>
+      <w:pPr>
+        <w:ind w:left="4320" w:hanging="180"/>
+      </w:pPr>
+    </w:lvl>
+    <w:lvl w:ilvl="6" w:tplc="4009000F" w:tentative="1">
+      <w:start w:val="1"/>
+      <w:numFmt w:val="decimal"/>
+      <w:lvlText w:val="%7."/>
+      <w:lvlJc w:val="left"/>
+      <w:pPr>
+        <w:ind w:left="5040" w:hanging="360"/>
+      </w:pPr>
+    </w:lvl>
+    <w:lvl w:ilvl="7" w:tplc="40090019" w:tentative="1">
+      <w:start w:val="1"/>
+      <w:numFmt w:val="lowerLetter"/>
+      <w:lvlText w:val="%8."/>
+      <w:lvlJc w:val="left"/>
+      <w:pPr>
+        <w:ind w:left="5760" w:hanging="360"/>
+      </w:pPr>
+    </w:lvl>
+    <w:lvl w:ilvl="8" w:tplc="4009001B" w:tentative="1">
+      <w:start w:val="1"/>
+      <w:numFmt w:val="lowerRoman"/>
+      <w:lvlText w:val="%9."/>
+      <w:lvlJc w:val="right"/>
+      <w:pPr>
+        <w:ind w:left="6480" w:hanging="180"/>
+      </w:pPr>
+    </w:lvl>
+  </w:abstractNum>
+  <w:abstractNum w:abstractNumId="42">
     <w:nsid w:val="7782158E"/>
     <w:multiLevelType w:val="hybridMultilevel"/>
     <w:tmpl w:val="6068CD52"/>
@@ -20520,7 +23001,96 @@
       </w:rPr>
     </w:lvl>
   </w:abstractNum>
-  <w:abstractNum w:abstractNumId="39">
+  <w:abstractNum w:abstractNumId="43">
+    <w:nsid w:val="77BB0C1A"/>
+    <w:multiLevelType w:val="hybridMultilevel"/>
+    <w:tmpl w:val="8A9AA4F4"/>
+    <w:lvl w:ilvl="0" w:tplc="4009000F">
+      <w:start w:val="1"/>
+      <w:numFmt w:val="decimal"/>
+      <w:lvlText w:val="%1."/>
+      <w:lvlJc w:val="left"/>
+      <w:pPr>
+        <w:ind w:left="720" w:hanging="360"/>
+      </w:pPr>
+      <w:rPr>
+        <w:rFonts w:hint="default"/>
+      </w:rPr>
+    </w:lvl>
+    <w:lvl w:ilvl="1" w:tplc="40090019" w:tentative="1">
+      <w:start w:val="1"/>
+      <w:numFmt w:val="lowerLetter"/>
+      <w:lvlText w:val="%2."/>
+      <w:lvlJc w:val="left"/>
+      <w:pPr>
+        <w:ind w:left="1440" w:hanging="360"/>
+      </w:pPr>
+    </w:lvl>
+    <w:lvl w:ilvl="2" w:tplc="4009001B" w:tentative="1">
+      <w:start w:val="1"/>
+      <w:numFmt w:val="lowerRoman"/>
+      <w:lvlText w:val="%3."/>
+      <w:lvlJc w:val="right"/>
+      <w:pPr>
+        <w:ind w:left="2160" w:hanging="180"/>
+      </w:pPr>
+    </w:lvl>
+    <w:lvl w:ilvl="3" w:tplc="4009000F" w:tentative="1">
+      <w:start w:val="1"/>
+      <w:numFmt w:val="decimal"/>
+      <w:lvlText w:val="%4."/>
+      <w:lvlJc w:val="left"/>
+      <w:pPr>
+        <w:ind w:left="2880" w:hanging="360"/>
+      </w:pPr>
+    </w:lvl>
+    <w:lvl w:ilvl="4" w:tplc="40090019" w:tentative="1">
+      <w:start w:val="1"/>
+      <w:numFmt w:val="lowerLetter"/>
+      <w:lvlText w:val="%5."/>
+      <w:lvlJc w:val="left"/>
+      <w:pPr>
+        <w:ind w:left="3600" w:hanging="360"/>
+      </w:pPr>
+    </w:lvl>
+    <w:lvl w:ilvl="5" w:tplc="4009001B" w:tentative="1">
+      <w:start w:val="1"/>
+      <w:numFmt w:val="lowerRoman"/>
+      <w:lvlText w:val="%6."/>
+      <w:lvlJc w:val="right"/>
+      <w:pPr>
+        <w:ind w:left="4320" w:hanging="180"/>
+      </w:pPr>
+    </w:lvl>
+    <w:lvl w:ilvl="6" w:tplc="4009000F" w:tentative="1">
+      <w:start w:val="1"/>
+      <w:numFmt w:val="decimal"/>
+      <w:lvlText w:val="%7."/>
+      <w:lvlJc w:val="left"/>
+      <w:pPr>
+        <w:ind w:left="5040" w:hanging="360"/>
+      </w:pPr>
+    </w:lvl>
+    <w:lvl w:ilvl="7" w:tplc="40090019" w:tentative="1">
+      <w:start w:val="1"/>
+      <w:numFmt w:val="lowerLetter"/>
+      <w:lvlText w:val="%8."/>
+      <w:lvlJc w:val="left"/>
+      <w:pPr>
+        <w:ind w:left="5760" w:hanging="360"/>
+      </w:pPr>
+    </w:lvl>
+    <w:lvl w:ilvl="8" w:tplc="4009001B" w:tentative="1">
+      <w:start w:val="1"/>
+      <w:numFmt w:val="lowerRoman"/>
+      <w:lvlText w:val="%9."/>
+      <w:lvlJc w:val="right"/>
+      <w:pPr>
+        <w:ind w:left="6480" w:hanging="180"/>
+      </w:pPr>
+    </w:lvl>
+  </w:abstractNum>
+  <w:abstractNum w:abstractNumId="44">
     <w:nsid w:val="797C6995"/>
     <w:multiLevelType w:val="hybridMultilevel"/>
     <w:tmpl w:val="71483934"/>
@@ -20633,7 +23203,7 @@
       </w:rPr>
     </w:lvl>
   </w:abstractNum>
-  <w:abstractNum w:abstractNumId="40">
+  <w:abstractNum w:abstractNumId="45">
     <w:nsid w:val="7D1867D1"/>
     <w:multiLevelType w:val="hybridMultilevel"/>
     <w:tmpl w:val="378A0E78"/>
@@ -20747,19 +23317,19 @@
     </w:lvl>
   </w:abstractNum>
   <w:num w:numId="1">
-    <w:abstractNumId w:val="16"/>
+    <w:abstractNumId w:val="18"/>
   </w:num>
   <w:num w:numId="2">
-    <w:abstractNumId w:val="40"/>
+    <w:abstractNumId w:val="45"/>
   </w:num>
   <w:num w:numId="3">
     <w:abstractNumId w:val="0"/>
   </w:num>
   <w:num w:numId="4">
-    <w:abstractNumId w:val="18"/>
+    <w:abstractNumId w:val="20"/>
   </w:num>
   <w:num w:numId="5">
-    <w:abstractNumId w:val="15"/>
+    <w:abstractNumId w:val="17"/>
   </w:num>
   <w:num w:numId="6">
     <w:abstractNumId w:val="2"/>
@@ -20768,106 +23338,121 @@
     <w:abstractNumId w:val="1"/>
   </w:num>
   <w:num w:numId="8">
-    <w:abstractNumId w:val="11"/>
+    <w:abstractNumId w:val="13"/>
   </w:num>
   <w:num w:numId="9">
-    <w:abstractNumId w:val="36"/>
+    <w:abstractNumId w:val="39"/>
   </w:num>
   <w:num w:numId="10">
-    <w:abstractNumId w:val="8"/>
+    <w:abstractNumId w:val="10"/>
   </w:num>
   <w:num w:numId="11">
-    <w:abstractNumId w:val="28"/>
+    <w:abstractNumId w:val="30"/>
   </w:num>
   <w:num w:numId="12">
-    <w:abstractNumId w:val="30"/>
+    <w:abstractNumId w:val="33"/>
   </w:num>
   <w:num w:numId="13">
-    <w:abstractNumId w:val="10"/>
+    <w:abstractNumId w:val="12"/>
   </w:num>
   <w:num w:numId="14">
-    <w:abstractNumId w:val="25"/>
+    <w:abstractNumId w:val="27"/>
   </w:num>
   <w:num w:numId="15">
     <w:abstractNumId w:val="3"/>
   </w:num>
   <w:num w:numId="16">
-    <w:abstractNumId w:val="33"/>
+    <w:abstractNumId w:val="36"/>
   </w:num>
   <w:num w:numId="17">
-    <w:abstractNumId w:val="32"/>
+    <w:abstractNumId w:val="35"/>
   </w:num>
   <w:num w:numId="18">
-    <w:abstractNumId w:val="34"/>
+    <w:abstractNumId w:val="37"/>
   </w:num>
   <w:num w:numId="19">
+    <w:abstractNumId w:val="42"/>
+  </w:num>
+  <w:num w:numId="20">
+    <w:abstractNumId w:val="9"/>
+  </w:num>
+  <w:num w:numId="21">
+    <w:abstractNumId w:val="44"/>
+  </w:num>
+  <w:num w:numId="22">
+    <w:abstractNumId w:val="29"/>
+  </w:num>
+  <w:num w:numId="23">
+    <w:abstractNumId w:val="26"/>
+  </w:num>
+  <w:num w:numId="24">
+    <w:abstractNumId w:val="31"/>
+  </w:num>
+  <w:num w:numId="25">
+    <w:abstractNumId w:val="11"/>
+  </w:num>
+  <w:num w:numId="26">
     <w:abstractNumId w:val="38"/>
   </w:num>
-  <w:num w:numId="20">
-    <w:abstractNumId w:val="7"/>
-  </w:num>
-  <w:num w:numId="21">
-    <w:abstractNumId w:val="39"/>
-  </w:num>
-  <w:num w:numId="22">
-    <w:abstractNumId w:val="27"/>
-  </w:num>
-  <w:num w:numId="23">
-    <w:abstractNumId w:val="24"/>
-  </w:num>
-  <w:num w:numId="24">
-    <w:abstractNumId w:val="29"/>
-  </w:num>
-  <w:num w:numId="25">
-    <w:abstractNumId w:val="9"/>
-  </w:num>
-  <w:num w:numId="26">
-    <w:abstractNumId w:val="35"/>
-  </w:num>
   <w:num w:numId="27">
-    <w:abstractNumId w:val="13"/>
+    <w:abstractNumId w:val="15"/>
   </w:num>
   <w:num w:numId="28">
     <w:abstractNumId w:val="6"/>
   </w:num>
   <w:num w:numId="29">
-    <w:abstractNumId w:val="22"/>
+    <w:abstractNumId w:val="24"/>
   </w:num>
   <w:num w:numId="30">
-    <w:abstractNumId w:val="21"/>
+    <w:abstractNumId w:val="23"/>
   </w:num>
   <w:num w:numId="31">
-    <w:abstractNumId w:val="26"/>
+    <w:abstractNumId w:val="28"/>
   </w:num>
   <w:num w:numId="32">
     <w:abstractNumId w:val="5"/>
   </w:num>
   <w:num w:numId="33">
-    <w:abstractNumId w:val="14"/>
+    <w:abstractNumId w:val="16"/>
   </w:num>
   <w:num w:numId="34">
-    <w:abstractNumId w:val="20"/>
+    <w:abstractNumId w:val="22"/>
   </w:num>
   <w:num w:numId="35">
-    <w:abstractNumId w:val="17"/>
+    <w:abstractNumId w:val="19"/>
   </w:num>
   <w:num w:numId="36">
-    <w:abstractNumId w:val="31"/>
+    <w:abstractNumId w:val="34"/>
   </w:num>
   <w:num w:numId="37">
-    <w:abstractNumId w:val="23"/>
+    <w:abstractNumId w:val="25"/>
   </w:num>
   <w:num w:numId="38">
-    <w:abstractNumId w:val="12"/>
+    <w:abstractNumId w:val="14"/>
   </w:num>
   <w:num w:numId="39">
     <w:abstractNumId w:val="4"/>
   </w:num>
   <w:num w:numId="40">
-    <w:abstractNumId w:val="37"/>
+    <w:abstractNumId w:val="40"/>
   </w:num>
   <w:num w:numId="41">
-    <w:abstractNumId w:val="19"/>
+    <w:abstractNumId w:val="21"/>
+  </w:num>
+  <w:num w:numId="42">
+    <w:abstractNumId w:val="32"/>
+  </w:num>
+  <w:num w:numId="43">
+    <w:abstractNumId w:val="41"/>
+  </w:num>
+  <w:num w:numId="44">
+    <w:abstractNumId w:val="8"/>
+  </w:num>
+  <w:num w:numId="45">
+    <w:abstractNumId w:val="7"/>
+  </w:num>
+  <w:num w:numId="46">
+    <w:abstractNumId w:val="43"/>
   </w:num>
 </w:numbering>
 </file>
@@ -22448,31 +25033,31 @@
     </dgm:pt>
   </dgm:ptLst>
   <dgm:cxnLst>
-    <dgm:cxn modelId="{750B9BD9-64F7-45FD-9C1A-01C8C90DB3ED}" type="presOf" srcId="{D8AAE93C-983F-46D6-ABF6-FC8E801A362E}" destId="{449D7EB5-0D9D-4DAC-B391-FB2402C39ABC}" srcOrd="0" destOrd="0" presId="urn:microsoft.com/office/officeart/2005/8/layout/process1"/>
+    <dgm:cxn modelId="{03965B52-AD4E-45CE-860E-57714AE6790C}" type="presOf" srcId="{D8AAE93C-983F-46D6-ABF6-FC8E801A362E}" destId="{449D7EB5-0D9D-4DAC-B391-FB2402C39ABC}" srcOrd="0" destOrd="0" presId="urn:microsoft.com/office/officeart/2005/8/layout/process1"/>
+    <dgm:cxn modelId="{5C1E10DE-0398-4B9E-B89B-FFD96BADC131}" type="presOf" srcId="{6C124C00-0E2C-42A5-B356-FCFE12C422EE}" destId="{AEA95148-3CF9-4188-ACFA-34C472C532BE}" srcOrd="1" destOrd="0" presId="urn:microsoft.com/office/officeart/2005/8/layout/process1"/>
+    <dgm:cxn modelId="{E58D5C7C-2358-4C0A-82CA-58B925EA593A}" type="presOf" srcId="{66AF4BFC-0875-4B90-9E82-F0F301500281}" destId="{09BDDF38-02A3-46F0-94CF-D671EECCB993}" srcOrd="0" destOrd="0" presId="urn:microsoft.com/office/officeart/2005/8/layout/process1"/>
+    <dgm:cxn modelId="{6FF57EFC-E141-44A0-A3D3-FD2628E4C13B}" type="presOf" srcId="{66AF4BFC-0875-4B90-9E82-F0F301500281}" destId="{A0BD6892-BF4E-4D26-B32D-4AC8D13032DE}" srcOrd="1" destOrd="0" presId="urn:microsoft.com/office/officeart/2005/8/layout/process1"/>
     <dgm:cxn modelId="{4E00299D-3BDF-41B7-A234-E37BB604D85F}" srcId="{252D6598-1225-44AB-8AAB-B516106B59E1}" destId="{49728974-DA1C-46AA-A2B0-D3394453E5CC}" srcOrd="1" destOrd="0" parTransId="{2F909F4C-E59D-48F8-B67A-5D6A03CEBAEE}" sibTransId="{E9687206-84AC-4F83-A6A2-9EFDC3ABD0FB}"/>
-    <dgm:cxn modelId="{355AC907-1692-4CAA-9792-535DCB8D9390}" type="presOf" srcId="{363330DA-09EC-450B-A72E-6DA34D1AB715}" destId="{37E28D18-C070-47FF-8301-A041A91EDEF2}" srcOrd="0" destOrd="0" presId="urn:microsoft.com/office/officeart/2005/8/layout/process1"/>
-    <dgm:cxn modelId="{378A5CB2-CC11-4012-8CC9-31CFE2176BAD}" type="presOf" srcId="{30AFFC78-5808-45ED-AAC6-491EC3980094}" destId="{F266C578-88AA-4EC2-8142-53A5B6139B0D}" srcOrd="0" destOrd="0" presId="urn:microsoft.com/office/officeart/2005/8/layout/process1"/>
+    <dgm:cxn modelId="{8B1C7B09-B3F1-4BF1-A139-6A9A57BD9135}" type="presOf" srcId="{252D6598-1225-44AB-8AAB-B516106B59E1}" destId="{2446BD26-396F-420D-B091-265286D97786}" srcOrd="0" destOrd="0" presId="urn:microsoft.com/office/officeart/2005/8/layout/process1"/>
+    <dgm:cxn modelId="{172EDB3F-C072-4543-A274-98D7B154DFBD}" type="presOf" srcId="{363330DA-09EC-450B-A72E-6DA34D1AB715}" destId="{37E28D18-C070-47FF-8301-A041A91EDEF2}" srcOrd="0" destOrd="0" presId="urn:microsoft.com/office/officeart/2005/8/layout/process1"/>
+    <dgm:cxn modelId="{236FB8DB-9375-4105-A4FE-F7EC72E9F6F9}" type="presOf" srcId="{49728974-DA1C-46AA-A2B0-D3394453E5CC}" destId="{CF1E89C8-AA78-4B1C-8D7C-AA8E38C034CE}" srcOrd="0" destOrd="0" presId="urn:microsoft.com/office/officeart/2005/8/layout/process1"/>
     <dgm:cxn modelId="{2659B5CA-FCEC-47A0-A347-15E4CED75EE1}" srcId="{252D6598-1225-44AB-8AAB-B516106B59E1}" destId="{30AFFC78-5808-45ED-AAC6-491EC3980094}" srcOrd="0" destOrd="0" parTransId="{15AA4179-7B4E-411C-A1D6-081E6042F5DA}" sibTransId="{6C124C00-0E2C-42A5-B356-FCFE12C422EE}"/>
-    <dgm:cxn modelId="{430876CC-DBAB-46AB-BFBD-346ACA4FFB9F}" type="presOf" srcId="{6C124C00-0E2C-42A5-B356-FCFE12C422EE}" destId="{A5E00DF4-BEC8-4A62-B851-2A7F83FC9D35}" srcOrd="0" destOrd="0" presId="urn:microsoft.com/office/officeart/2005/8/layout/process1"/>
-    <dgm:cxn modelId="{1E42F695-7922-4F73-9C50-DAB3E4E4D4A5}" type="presOf" srcId="{E9687206-84AC-4F83-A6A2-9EFDC3ABD0FB}" destId="{6E444586-2D87-4F9A-9400-F626352FE57E}" srcOrd="1" destOrd="0" presId="urn:microsoft.com/office/officeart/2005/8/layout/process1"/>
-    <dgm:cxn modelId="{19AE8917-4C92-483E-AA0F-87085ABBD2B2}" type="presOf" srcId="{E9687206-84AC-4F83-A6A2-9EFDC3ABD0FB}" destId="{72E9BEC7-D7FE-4BD7-BACA-0668A095A9EF}" srcOrd="0" destOrd="0" presId="urn:microsoft.com/office/officeart/2005/8/layout/process1"/>
+    <dgm:cxn modelId="{1D26BC88-3E93-4174-B5E4-4B9A452E8F45}" type="presOf" srcId="{6C124C00-0E2C-42A5-B356-FCFE12C422EE}" destId="{A5E00DF4-BEC8-4A62-B851-2A7F83FC9D35}" srcOrd="0" destOrd="0" presId="urn:microsoft.com/office/officeart/2005/8/layout/process1"/>
+    <dgm:cxn modelId="{664558BB-E8B7-414A-95A7-6F6650196E91}" type="presOf" srcId="{30AFFC78-5808-45ED-AAC6-491EC3980094}" destId="{F266C578-88AA-4EC2-8142-53A5B6139B0D}" srcOrd="0" destOrd="0" presId="urn:microsoft.com/office/officeart/2005/8/layout/process1"/>
     <dgm:cxn modelId="{8BADACC1-11B7-4449-8CEF-27159F593338}" srcId="{252D6598-1225-44AB-8AAB-B516106B59E1}" destId="{D8AAE93C-983F-46D6-ABF6-FC8E801A362E}" srcOrd="3" destOrd="0" parTransId="{E327365F-F469-481B-89E5-1C83ABC9E692}" sibTransId="{B97F4576-B840-4726-92AE-9C44A7C27E74}"/>
     <dgm:cxn modelId="{D0AB89FD-DD46-4E02-92EC-A604D66D139C}" srcId="{252D6598-1225-44AB-8AAB-B516106B59E1}" destId="{363330DA-09EC-450B-A72E-6DA34D1AB715}" srcOrd="2" destOrd="0" parTransId="{560647A9-7192-429E-B7E3-DFDF675B6572}" sibTransId="{66AF4BFC-0875-4B90-9E82-F0F301500281}"/>
-    <dgm:cxn modelId="{3ED2C85B-9CE0-4C09-9822-FA90FB7134F6}" type="presOf" srcId="{49728974-DA1C-46AA-A2B0-D3394453E5CC}" destId="{CF1E89C8-AA78-4B1C-8D7C-AA8E38C034CE}" srcOrd="0" destOrd="0" presId="urn:microsoft.com/office/officeart/2005/8/layout/process1"/>
-    <dgm:cxn modelId="{C8FF469B-4B65-48BF-AC26-EBF515115E62}" type="presOf" srcId="{66AF4BFC-0875-4B90-9E82-F0F301500281}" destId="{A0BD6892-BF4E-4D26-B32D-4AC8D13032DE}" srcOrd="1" destOrd="0" presId="urn:microsoft.com/office/officeart/2005/8/layout/process1"/>
-    <dgm:cxn modelId="{097D786B-8D61-4069-B092-6C94345FF1B3}" type="presOf" srcId="{6C124C00-0E2C-42A5-B356-FCFE12C422EE}" destId="{AEA95148-3CF9-4188-ACFA-34C472C532BE}" srcOrd="1" destOrd="0" presId="urn:microsoft.com/office/officeart/2005/8/layout/process1"/>
-    <dgm:cxn modelId="{B4DA24F9-64B6-450F-9669-72BFFE6ED2D3}" type="presOf" srcId="{252D6598-1225-44AB-8AAB-B516106B59E1}" destId="{2446BD26-396F-420D-B091-265286D97786}" srcOrd="0" destOrd="0" presId="urn:microsoft.com/office/officeart/2005/8/layout/process1"/>
-    <dgm:cxn modelId="{DA43E3A6-200A-406D-8375-8FF9913253FD}" type="presOf" srcId="{66AF4BFC-0875-4B90-9E82-F0F301500281}" destId="{09BDDF38-02A3-46F0-94CF-D671EECCB993}" srcOrd="0" destOrd="0" presId="urn:microsoft.com/office/officeart/2005/8/layout/process1"/>
-    <dgm:cxn modelId="{BAB92F87-C97C-4388-8B18-0BCE45E706FB}" type="presParOf" srcId="{2446BD26-396F-420D-B091-265286D97786}" destId="{F266C578-88AA-4EC2-8142-53A5B6139B0D}" srcOrd="0" destOrd="0" presId="urn:microsoft.com/office/officeart/2005/8/layout/process1"/>
-    <dgm:cxn modelId="{692204A2-998A-4F1C-AB31-A475E4DDCC18}" type="presParOf" srcId="{2446BD26-396F-420D-B091-265286D97786}" destId="{A5E00DF4-BEC8-4A62-B851-2A7F83FC9D35}" srcOrd="1" destOrd="0" presId="urn:microsoft.com/office/officeart/2005/8/layout/process1"/>
-    <dgm:cxn modelId="{BBAC5943-8C8F-4572-BB5F-CBEFF4AF75FE}" type="presParOf" srcId="{A5E00DF4-BEC8-4A62-B851-2A7F83FC9D35}" destId="{AEA95148-3CF9-4188-ACFA-34C472C532BE}" srcOrd="0" destOrd="0" presId="urn:microsoft.com/office/officeart/2005/8/layout/process1"/>
-    <dgm:cxn modelId="{547D8314-44C9-4437-B062-903FB95D61A4}" type="presParOf" srcId="{2446BD26-396F-420D-B091-265286D97786}" destId="{CF1E89C8-AA78-4B1C-8D7C-AA8E38C034CE}" srcOrd="2" destOrd="0" presId="urn:microsoft.com/office/officeart/2005/8/layout/process1"/>
-    <dgm:cxn modelId="{30B9C01F-77BB-44FF-B20B-737C93702509}" type="presParOf" srcId="{2446BD26-396F-420D-B091-265286D97786}" destId="{72E9BEC7-D7FE-4BD7-BACA-0668A095A9EF}" srcOrd="3" destOrd="0" presId="urn:microsoft.com/office/officeart/2005/8/layout/process1"/>
-    <dgm:cxn modelId="{FE466AC3-7062-4BBA-985E-D6512CEFC1D3}" type="presParOf" srcId="{72E9BEC7-D7FE-4BD7-BACA-0668A095A9EF}" destId="{6E444586-2D87-4F9A-9400-F626352FE57E}" srcOrd="0" destOrd="0" presId="urn:microsoft.com/office/officeart/2005/8/layout/process1"/>
-    <dgm:cxn modelId="{6783F660-9AF6-4A5C-829A-5B17BC72A06D}" type="presParOf" srcId="{2446BD26-396F-420D-B091-265286D97786}" destId="{37E28D18-C070-47FF-8301-A041A91EDEF2}" srcOrd="4" destOrd="0" presId="urn:microsoft.com/office/officeart/2005/8/layout/process1"/>
-    <dgm:cxn modelId="{24FFA05D-DAD0-41C6-BEDC-FE46675A2B95}" type="presParOf" srcId="{2446BD26-396F-420D-B091-265286D97786}" destId="{09BDDF38-02A3-46F0-94CF-D671EECCB993}" srcOrd="5" destOrd="0" presId="urn:microsoft.com/office/officeart/2005/8/layout/process1"/>
-    <dgm:cxn modelId="{9EC62F64-7DB6-4FB3-AF4C-A9881E6767EF}" type="presParOf" srcId="{09BDDF38-02A3-46F0-94CF-D671EECCB993}" destId="{A0BD6892-BF4E-4D26-B32D-4AC8D13032DE}" srcOrd="0" destOrd="0" presId="urn:microsoft.com/office/officeart/2005/8/layout/process1"/>
-    <dgm:cxn modelId="{BA10B03E-B006-41BC-901D-496553B25E36}" type="presParOf" srcId="{2446BD26-396F-420D-B091-265286D97786}" destId="{449D7EB5-0D9D-4DAC-B391-FB2402C39ABC}" srcOrd="6" destOrd="0" presId="urn:microsoft.com/office/officeart/2005/8/layout/process1"/>
+    <dgm:cxn modelId="{E06CBCE1-7614-438E-ADFA-C4F62D152E1B}" type="presOf" srcId="{E9687206-84AC-4F83-A6A2-9EFDC3ABD0FB}" destId="{72E9BEC7-D7FE-4BD7-BACA-0668A095A9EF}" srcOrd="0" destOrd="0" presId="urn:microsoft.com/office/officeart/2005/8/layout/process1"/>
+    <dgm:cxn modelId="{7A69C1A6-26E9-4182-915E-3E4BD4186092}" type="presOf" srcId="{E9687206-84AC-4F83-A6A2-9EFDC3ABD0FB}" destId="{6E444586-2D87-4F9A-9400-F626352FE57E}" srcOrd="1" destOrd="0" presId="urn:microsoft.com/office/officeart/2005/8/layout/process1"/>
+    <dgm:cxn modelId="{3A983056-46E0-46D1-88E2-95EEF00F5667}" type="presParOf" srcId="{2446BD26-396F-420D-B091-265286D97786}" destId="{F266C578-88AA-4EC2-8142-53A5B6139B0D}" srcOrd="0" destOrd="0" presId="urn:microsoft.com/office/officeart/2005/8/layout/process1"/>
+    <dgm:cxn modelId="{220AD50C-FC61-49CD-8F9C-7A93D9E4DFD3}" type="presParOf" srcId="{2446BD26-396F-420D-B091-265286D97786}" destId="{A5E00DF4-BEC8-4A62-B851-2A7F83FC9D35}" srcOrd="1" destOrd="0" presId="urn:microsoft.com/office/officeart/2005/8/layout/process1"/>
+    <dgm:cxn modelId="{DD9E1EFD-5552-406F-A040-943EA773E2AC}" type="presParOf" srcId="{A5E00DF4-BEC8-4A62-B851-2A7F83FC9D35}" destId="{AEA95148-3CF9-4188-ACFA-34C472C532BE}" srcOrd="0" destOrd="0" presId="urn:microsoft.com/office/officeart/2005/8/layout/process1"/>
+    <dgm:cxn modelId="{2C265540-ABFF-426F-B0D6-32ADDD188151}" type="presParOf" srcId="{2446BD26-396F-420D-B091-265286D97786}" destId="{CF1E89C8-AA78-4B1C-8D7C-AA8E38C034CE}" srcOrd="2" destOrd="0" presId="urn:microsoft.com/office/officeart/2005/8/layout/process1"/>
+    <dgm:cxn modelId="{2B46F8F1-51C0-44DA-8441-D3578095317A}" type="presParOf" srcId="{2446BD26-396F-420D-B091-265286D97786}" destId="{72E9BEC7-D7FE-4BD7-BACA-0668A095A9EF}" srcOrd="3" destOrd="0" presId="urn:microsoft.com/office/officeart/2005/8/layout/process1"/>
+    <dgm:cxn modelId="{E4563011-233D-4914-9756-A272AB0DE2FD}" type="presParOf" srcId="{72E9BEC7-D7FE-4BD7-BACA-0668A095A9EF}" destId="{6E444586-2D87-4F9A-9400-F626352FE57E}" srcOrd="0" destOrd="0" presId="urn:microsoft.com/office/officeart/2005/8/layout/process1"/>
+    <dgm:cxn modelId="{3F32F474-51A1-4BE0-982E-FADA17F74BE6}" type="presParOf" srcId="{2446BD26-396F-420D-B091-265286D97786}" destId="{37E28D18-C070-47FF-8301-A041A91EDEF2}" srcOrd="4" destOrd="0" presId="urn:microsoft.com/office/officeart/2005/8/layout/process1"/>
+    <dgm:cxn modelId="{37E25916-9F39-43A3-88C4-BF261F880DE2}" type="presParOf" srcId="{2446BD26-396F-420D-B091-265286D97786}" destId="{09BDDF38-02A3-46F0-94CF-D671EECCB993}" srcOrd="5" destOrd="0" presId="urn:microsoft.com/office/officeart/2005/8/layout/process1"/>
+    <dgm:cxn modelId="{84973A8E-CAE2-4F1F-B2F4-E9BD9B846E4F}" type="presParOf" srcId="{09BDDF38-02A3-46F0-94CF-D671EECCB993}" destId="{A0BD6892-BF4E-4D26-B32D-4AC8D13032DE}" srcOrd="0" destOrd="0" presId="urn:microsoft.com/office/officeart/2005/8/layout/process1"/>
+    <dgm:cxn modelId="{BB9E3D7C-0F58-4513-BC66-C09BDA9630AA}" type="presParOf" srcId="{2446BD26-396F-420D-B091-265286D97786}" destId="{449D7EB5-0D9D-4DAC-B391-FB2402C39ABC}" srcOrd="6" destOrd="0" presId="urn:microsoft.com/office/officeart/2005/8/layout/process1"/>
   </dgm:cxnLst>
   <dgm:bg/>
   <dgm:whole/>

</xml_diff>

<commit_message>
Date: 02 Apr 2026
</commit_message>
<xml_diff>
--- a/Notes_SA2512006.docx
+++ b/Notes_SA2512006.docx
@@ -16931,6 +16931,31 @@
       <w:pPr>
         <w:pStyle w:val="ListParagraph"/>
         <w:numPr>
+          <w:ilvl w:val="1"/>
+          <w:numId w:val="44"/>
+        </w:numPr>
+        <w:tabs>
+          <w:tab w:val="left" w:pos="1560"/>
+        </w:tabs>
+        <w:rPr>
+          <w:sz w:val="28"/>
+          <w:szCs w:val="24"/>
+          <w:lang w:val="en-US"/>
+        </w:rPr>
+      </w:pPr>
+      <w:r>
+        <w:rPr>
+          <w:sz w:val="28"/>
+          <w:szCs w:val="24"/>
+          <w:lang w:val="en-US"/>
+        </w:rPr>
+        <w:t xml:space="preserve">Having .feature extension. </w:t>
+      </w:r>
+    </w:p>
+    <w:p>
+      <w:pPr>
+        <w:pStyle w:val="ListParagraph"/>
+        <w:numPr>
           <w:ilvl w:val="0"/>
           <w:numId w:val="44"/>
         </w:numPr>
@@ -17584,6 +17609,7 @@
           <w:szCs w:val="24"/>
           <w:lang w:val="en-US"/>
         </w:rPr>
+        <w:lastRenderedPageBreak/>
         <w:t xml:space="preserve">Then </w:t>
       </w:r>
       <w:r>
@@ -17633,7 +17659,6 @@
           <w:szCs w:val="24"/>
           <w:lang w:val="en-US"/>
         </w:rPr>
-        <w:lastRenderedPageBreak/>
         <w:t xml:space="preserve">Background: </w:t>
       </w:r>
       <w:r>
@@ -17743,23 +17768,7 @@
           <w:szCs w:val="24"/>
           <w:lang w:val="en-US"/>
         </w:rPr>
-        <w:t xml:space="preserve"> </w:t>
-      </w:r>
-      <w:r>
-        <w:rPr>
-          <w:sz w:val="28"/>
-          <w:szCs w:val="24"/>
-          <w:lang w:val="en-US"/>
-        </w:rPr>
-        <w:t>Used in Data</w:t>
-      </w:r>
-      <w:r>
-        <w:rPr>
-          <w:sz w:val="28"/>
-          <w:szCs w:val="24"/>
-          <w:lang w:val="en-US"/>
-        </w:rPr>
-        <w:t xml:space="preserve"> Driven Testing to accept the data</w:t>
+        <w:t xml:space="preserve"> Used in Data Driven Testing to accept the data</w:t>
       </w:r>
     </w:p>
     <w:p>
@@ -18248,6 +18257,227 @@
     </w:p>
     <w:p>
       <w:pPr>
+        <w:pStyle w:val="ListParagraph"/>
+        <w:numPr>
+          <w:ilvl w:val="0"/>
+          <w:numId w:val="45"/>
+        </w:numPr>
+        <w:tabs>
+          <w:tab w:val="left" w:pos="1560"/>
+        </w:tabs>
+        <w:rPr>
+          <w:sz w:val="28"/>
+          <w:szCs w:val="24"/>
+          <w:lang w:val="en-US"/>
+        </w:rPr>
+      </w:pPr>
+      <w:r>
+        <w:rPr>
+          <w:sz w:val="28"/>
+          <w:szCs w:val="24"/>
+          <w:lang w:val="en-US"/>
+        </w:rPr>
+        <w:t>in pom.xml file delete following lines</w:t>
+      </w:r>
+    </w:p>
+    <w:p>
+      <w:pPr>
+        <w:pStyle w:val="ListParagraph"/>
+        <w:numPr>
+          <w:ilvl w:val="1"/>
+          <w:numId w:val="45"/>
+        </w:numPr>
+        <w:tabs>
+          <w:tab w:val="left" w:pos="1560"/>
+        </w:tabs>
+        <w:rPr>
+          <w:sz w:val="24"/>
+          <w:lang w:val="en-US"/>
+        </w:rPr>
+      </w:pPr>
+      <w:r>
+        <w:rPr>
+          <w:rFonts w:ascii="Consolas" w:hAnsi="Consolas" w:cs="Consolas"/>
+          <w:color w:val="000000"/>
+          <w:sz w:val="24"/>
+          <w:szCs w:val="24"/>
+          <w:shd w:val="clear" w:color="auto" w:fill="E8F2FE"/>
+        </w:rPr>
+        <w:t>&lt;</w:t>
+      </w:r>
+      <w:r>
+        <w:rPr>
+          <w:rFonts w:ascii="Consolas" w:hAnsi="Consolas" w:cs="Consolas"/>
+          <w:color w:val="268BD2"/>
+          <w:sz w:val="24"/>
+          <w:szCs w:val="24"/>
+          <w:shd w:val="clear" w:color="auto" w:fill="E8F2FE"/>
+        </w:rPr>
+        <w:t>cucumber.version</w:t>
+      </w:r>
+      <w:r>
+        <w:rPr>
+          <w:rFonts w:ascii="Consolas" w:hAnsi="Consolas" w:cs="Consolas"/>
+          <w:color w:val="000000"/>
+          <w:sz w:val="24"/>
+          <w:szCs w:val="24"/>
+          <w:shd w:val="clear" w:color="auto" w:fill="E8F2FE"/>
+        </w:rPr>
+        <w:t>&gt;6.8.2&lt;/</w:t>
+      </w:r>
+      <w:r>
+        <w:rPr>
+          <w:rFonts w:ascii="Consolas" w:hAnsi="Consolas" w:cs="Consolas"/>
+          <w:color w:val="268BD2"/>
+          <w:sz w:val="24"/>
+          <w:szCs w:val="24"/>
+          <w:shd w:val="clear" w:color="auto" w:fill="E8F2FE"/>
+        </w:rPr>
+        <w:t>cucumber.version</w:t>
+      </w:r>
+      <w:r>
+        <w:rPr>
+          <w:rFonts w:ascii="Consolas" w:hAnsi="Consolas" w:cs="Consolas"/>
+          <w:color w:val="000000"/>
+          <w:sz w:val="24"/>
+          <w:szCs w:val="24"/>
+          <w:shd w:val="clear" w:color="auto" w:fill="E8F2FE"/>
+        </w:rPr>
+        <w:t>&gt;</w:t>
+      </w:r>
+    </w:p>
+    <w:p>
+      <w:pPr>
+        <w:pStyle w:val="ListParagraph"/>
+        <w:numPr>
+          <w:ilvl w:val="1"/>
+          <w:numId w:val="45"/>
+        </w:numPr>
+        <w:tabs>
+          <w:tab w:val="left" w:pos="1560"/>
+        </w:tabs>
+        <w:rPr>
+          <w:sz w:val="24"/>
+          <w:lang w:val="en-US"/>
+        </w:rPr>
+      </w:pPr>
+      <w:r>
+        <w:rPr>
+          <w:rFonts w:ascii="Consolas" w:hAnsi="Consolas" w:cs="Consolas"/>
+          <w:color w:val="000000"/>
+          <w:sz w:val="24"/>
+          <w:szCs w:val="24"/>
+        </w:rPr>
+        <w:t>&lt;</w:t>
+      </w:r>
+      <w:proofErr w:type="spellStart"/>
+      <w:r>
+        <w:rPr>
+          <w:rFonts w:ascii="Consolas" w:hAnsi="Consolas" w:cs="Consolas"/>
+          <w:color w:val="268BD2"/>
+          <w:sz w:val="24"/>
+          <w:szCs w:val="24"/>
+        </w:rPr>
+        <w:t>maven.compiler.version</w:t>
+      </w:r>
+      <w:proofErr w:type="spellEnd"/>
+      <w:r>
+        <w:rPr>
+          <w:rFonts w:ascii="Consolas" w:hAnsi="Consolas" w:cs="Consolas"/>
+          <w:color w:val="000000"/>
+          <w:sz w:val="24"/>
+          <w:szCs w:val="24"/>
+        </w:rPr>
+        <w:t>&gt;3.8.1&lt;/</w:t>
+      </w:r>
+      <w:proofErr w:type="spellStart"/>
+      <w:r>
+        <w:rPr>
+          <w:rFonts w:ascii="Consolas" w:hAnsi="Consolas" w:cs="Consolas"/>
+          <w:color w:val="268BD2"/>
+          <w:sz w:val="24"/>
+          <w:szCs w:val="24"/>
+        </w:rPr>
+        <w:t>maven.compiler.version</w:t>
+      </w:r>
+      <w:proofErr w:type="spellEnd"/>
+      <w:r>
+        <w:rPr>
+          <w:rFonts w:ascii="Consolas" w:hAnsi="Consolas" w:cs="Consolas"/>
+          <w:color w:val="000000"/>
+          <w:sz w:val="24"/>
+          <w:szCs w:val="24"/>
+        </w:rPr>
+        <w:t>&gt;</w:t>
+      </w:r>
+    </w:p>
+    <w:p>
+      <w:pPr>
+        <w:pStyle w:val="ListParagraph"/>
+        <w:numPr>
+          <w:ilvl w:val="1"/>
+          <w:numId w:val="45"/>
+        </w:numPr>
+        <w:tabs>
+          <w:tab w:val="left" w:pos="1560"/>
+        </w:tabs>
+        <w:rPr>
+          <w:sz w:val="24"/>
+          <w:lang w:val="en-US"/>
+        </w:rPr>
+      </w:pPr>
+      <w:r>
+        <w:rPr>
+          <w:rFonts w:ascii="Consolas" w:hAnsi="Consolas" w:cs="Consolas"/>
+          <w:color w:val="000000"/>
+          <w:sz w:val="24"/>
+          <w:szCs w:val="24"/>
+        </w:rPr>
+        <w:t>&lt;</w:t>
+      </w:r>
+      <w:proofErr w:type="spellStart"/>
+      <w:r>
+        <w:rPr>
+          <w:rFonts w:ascii="Consolas" w:hAnsi="Consolas" w:cs="Consolas"/>
+          <w:color w:val="268BD2"/>
+          <w:sz w:val="24"/>
+          <w:szCs w:val="24"/>
+        </w:rPr>
+        <w:t>maven.surefire.version</w:t>
+      </w:r>
+      <w:proofErr w:type="spellEnd"/>
+      <w:r>
+        <w:rPr>
+          <w:rFonts w:ascii="Consolas" w:hAnsi="Consolas" w:cs="Consolas"/>
+          <w:color w:val="000000"/>
+          <w:sz w:val="24"/>
+          <w:szCs w:val="24"/>
+        </w:rPr>
+        <w:t>&gt;2.22.2&lt;/</w:t>
+      </w:r>
+      <w:proofErr w:type="spellStart"/>
+      <w:r>
+        <w:rPr>
+          <w:rFonts w:ascii="Consolas" w:hAnsi="Consolas" w:cs="Consolas"/>
+          <w:color w:val="268BD2"/>
+          <w:sz w:val="24"/>
+          <w:szCs w:val="24"/>
+        </w:rPr>
+        <w:t>maven.surefire.version</w:t>
+      </w:r>
+      <w:proofErr w:type="spellEnd"/>
+      <w:r>
+        <w:rPr>
+          <w:rFonts w:ascii="Consolas" w:hAnsi="Consolas" w:cs="Consolas"/>
+          <w:color w:val="000000"/>
+          <w:sz w:val="24"/>
+          <w:szCs w:val="24"/>
+        </w:rPr>
+        <w:t>&gt;</w:t>
+      </w:r>
+    </w:p>
+    <w:p>
+      <w:pPr>
         <w:pBdr>
           <w:top w:val="single" w:sz="6" w:space="1" w:color="auto"/>
           <w:bottom w:val="single" w:sz="6" w:space="1" w:color="auto"/>
@@ -18362,6 +18592,7 @@
           <w:szCs w:val="24"/>
           <w:lang w:val="en-US"/>
         </w:rPr>
+        <w:lastRenderedPageBreak/>
         <w:t>Title should be Google</w:t>
       </w:r>
     </w:p>
@@ -18450,7 +18681,6 @@
           <w:szCs w:val="24"/>
           <w:lang w:val="en-US"/>
         </w:rPr>
-        <w:lastRenderedPageBreak/>
         <w:t>Given Launch Google</w:t>
       </w:r>
     </w:p>
@@ -18508,20 +18738,384 @@
           <w:lang w:val="en-US"/>
         </w:rPr>
       </w:pPr>
+    </w:p>
+    <w:p>
+      <w:pPr>
+        <w:tabs>
+          <w:tab w:val="left" w:pos="1560"/>
+        </w:tabs>
+        <w:rPr>
+          <w:sz w:val="28"/>
+          <w:szCs w:val="24"/>
+          <w:lang w:val="en-US"/>
+        </w:rPr>
+      </w:pPr>
+    </w:p>
+    <w:p>
+      <w:pPr>
+        <w:tabs>
+          <w:tab w:val="left" w:pos="1560"/>
+        </w:tabs>
+        <w:rPr>
+          <w:b/>
+          <w:bCs/>
+          <w:sz w:val="28"/>
+          <w:szCs w:val="24"/>
+          <w:lang w:val="en-US"/>
+        </w:rPr>
+      </w:pPr>
+      <w:r>
+        <w:rPr>
+          <w:b/>
+          <w:bCs/>
+          <w:sz w:val="28"/>
+          <w:szCs w:val="24"/>
+          <w:lang w:val="en-US"/>
+        </w:rPr>
+        <w:t>Tags in Cucumber</w:t>
+      </w:r>
+    </w:p>
+    <w:p>
+      <w:pPr>
+        <w:pStyle w:val="ListParagraph"/>
+        <w:numPr>
+          <w:ilvl w:val="0"/>
+          <w:numId w:val="47"/>
+        </w:numPr>
+        <w:tabs>
+          <w:tab w:val="left" w:pos="1560"/>
+        </w:tabs>
+        <w:rPr>
+          <w:b/>
+          <w:bCs/>
+          <w:sz w:val="28"/>
+          <w:szCs w:val="24"/>
+          <w:lang w:val="en-US"/>
+        </w:rPr>
+      </w:pPr>
+      <w:r>
+        <w:rPr>
+          <w:sz w:val="28"/>
+          <w:szCs w:val="24"/>
+          <w:lang w:val="en-US"/>
+        </w:rPr>
+        <w:t>Tags allows you to execute or skip single / multiple test scenarios</w:t>
+      </w:r>
+    </w:p>
+    <w:p>
+      <w:pPr>
+        <w:pStyle w:val="ListParagraph"/>
+        <w:numPr>
+          <w:ilvl w:val="0"/>
+          <w:numId w:val="47"/>
+        </w:numPr>
+        <w:tabs>
+          <w:tab w:val="left" w:pos="1560"/>
+        </w:tabs>
+        <w:rPr>
+          <w:b/>
+          <w:bCs/>
+          <w:sz w:val="28"/>
+          <w:szCs w:val="24"/>
+          <w:lang w:val="en-US"/>
+        </w:rPr>
+      </w:pPr>
+      <w:r>
+        <w:rPr>
+          <w:sz w:val="28"/>
+          <w:szCs w:val="24"/>
+          <w:lang w:val="en-US"/>
+        </w:rPr>
+        <w:t>Tags needs to be specified in feature file only</w:t>
+      </w:r>
+    </w:p>
+    <w:p>
+      <w:pPr>
+        <w:pStyle w:val="ListParagraph"/>
+        <w:numPr>
+          <w:ilvl w:val="0"/>
+          <w:numId w:val="47"/>
+        </w:numPr>
+        <w:tabs>
+          <w:tab w:val="left" w:pos="1560"/>
+        </w:tabs>
+        <w:rPr>
+          <w:b/>
+          <w:bCs/>
+          <w:sz w:val="28"/>
+          <w:szCs w:val="24"/>
+          <w:lang w:val="en-US"/>
+        </w:rPr>
+      </w:pPr>
+      <w:r>
+        <w:rPr>
+          <w:sz w:val="28"/>
+          <w:szCs w:val="24"/>
+          <w:lang w:val="en-US"/>
+        </w:rPr>
+        <w:t>Tags are the words that starts with @</w:t>
+      </w:r>
+    </w:p>
+    <w:p>
+      <w:pPr>
+        <w:pStyle w:val="ListParagraph"/>
+        <w:numPr>
+          <w:ilvl w:val="0"/>
+          <w:numId w:val="47"/>
+        </w:numPr>
+        <w:tabs>
+          <w:tab w:val="left" w:pos="1560"/>
+        </w:tabs>
+        <w:rPr>
+          <w:b/>
+          <w:bCs/>
+          <w:sz w:val="28"/>
+          <w:szCs w:val="24"/>
+          <w:lang w:val="en-US"/>
+        </w:rPr>
+      </w:pPr>
+      <w:r>
+        <w:rPr>
+          <w:sz w:val="28"/>
+          <w:szCs w:val="24"/>
+          <w:lang w:val="en-US"/>
+        </w:rPr>
+        <w:t>The execution criteria needs to be specified in Runner class</w:t>
+      </w:r>
+    </w:p>
+    <w:p>
+      <w:pPr>
+        <w:tabs>
+          <w:tab w:val="left" w:pos="1560"/>
+        </w:tabs>
+        <w:rPr>
+          <w:b/>
+          <w:bCs/>
+          <w:sz w:val="28"/>
+          <w:szCs w:val="24"/>
+          <w:lang w:val="en-US"/>
+        </w:rPr>
+      </w:pPr>
+    </w:p>
+    <w:p>
+      <w:pPr>
+        <w:tabs>
+          <w:tab w:val="left" w:pos="1560"/>
+        </w:tabs>
+        <w:rPr>
+          <w:sz w:val="28"/>
+          <w:szCs w:val="24"/>
+          <w:lang w:val="en-US"/>
+        </w:rPr>
+      </w:pPr>
+    </w:p>
+    <w:p>
+      <w:pPr>
+        <w:tabs>
+          <w:tab w:val="left" w:pos="1560"/>
+        </w:tabs>
+        <w:rPr>
+          <w:b/>
+          <w:bCs/>
+          <w:sz w:val="28"/>
+          <w:szCs w:val="24"/>
+          <w:lang w:val="en-US"/>
+        </w:rPr>
+      </w:pPr>
+      <w:r>
+        <w:rPr>
+          <w:b/>
+          <w:bCs/>
+          <w:sz w:val="28"/>
+          <w:szCs w:val="24"/>
+          <w:lang w:val="en-US"/>
+        </w:rPr>
+        <w:t>Hooks in Cucumber</w:t>
+      </w:r>
+    </w:p>
+    <w:p>
+      <w:pPr>
+        <w:pStyle w:val="ListParagraph"/>
+        <w:numPr>
+          <w:ilvl w:val="0"/>
+          <w:numId w:val="48"/>
+        </w:numPr>
+        <w:tabs>
+          <w:tab w:val="left" w:pos="1560"/>
+        </w:tabs>
+        <w:rPr>
+          <w:sz w:val="28"/>
+          <w:szCs w:val="24"/>
+          <w:lang w:val="en-US"/>
+        </w:rPr>
+      </w:pPr>
+      <w:r>
+        <w:rPr>
+          <w:sz w:val="28"/>
+          <w:szCs w:val="24"/>
+          <w:lang w:val="en-US"/>
+        </w:rPr>
+        <w:t>The special methods those get executed before and after every scenario.</w:t>
+      </w:r>
+    </w:p>
+    <w:p>
+      <w:pPr>
+        <w:pStyle w:val="ListParagraph"/>
+        <w:numPr>
+          <w:ilvl w:val="0"/>
+          <w:numId w:val="48"/>
+        </w:numPr>
+        <w:tabs>
+          <w:tab w:val="left" w:pos="1560"/>
+        </w:tabs>
+        <w:rPr>
+          <w:sz w:val="28"/>
+          <w:szCs w:val="24"/>
+          <w:lang w:val="en-US"/>
+        </w:rPr>
+      </w:pPr>
+      <w:r>
+        <w:rPr>
+          <w:sz w:val="28"/>
+          <w:szCs w:val="24"/>
+          <w:lang w:val="en-US"/>
+        </w:rPr>
+        <w:t>Cucumber provides two hooks</w:t>
+      </w:r>
+    </w:p>
+    <w:p>
+      <w:pPr>
+        <w:pStyle w:val="ListParagraph"/>
+        <w:numPr>
+          <w:ilvl w:val="1"/>
+          <w:numId w:val="48"/>
+        </w:numPr>
+        <w:tabs>
+          <w:tab w:val="left" w:pos="1560"/>
+        </w:tabs>
+        <w:rPr>
+          <w:sz w:val="28"/>
+          <w:szCs w:val="24"/>
+          <w:lang w:val="en-US"/>
+        </w:rPr>
+      </w:pPr>
+      <w:r>
+        <w:rPr>
+          <w:sz w:val="28"/>
+          <w:szCs w:val="24"/>
+          <w:lang w:val="en-US"/>
+        </w:rPr>
+        <w:t xml:space="preserve">@Before </w:t>
+      </w:r>
+      <w:r>
+        <w:rPr>
+          <w:sz w:val="28"/>
+          <w:szCs w:val="24"/>
+          <w:lang w:val="en-US"/>
+        </w:rPr>
+        <w:sym w:font="Wingdings" w:char="F0E0"/>
+      </w:r>
+      <w:r>
+        <w:rPr>
+          <w:sz w:val="28"/>
+          <w:szCs w:val="24"/>
+          <w:lang w:val="en-US"/>
+        </w:rPr>
+        <w:t xml:space="preserve"> Executes before every scenario</w:t>
+      </w:r>
+    </w:p>
+    <w:p>
+      <w:pPr>
+        <w:pStyle w:val="ListParagraph"/>
+        <w:numPr>
+          <w:ilvl w:val="1"/>
+          <w:numId w:val="48"/>
+        </w:numPr>
+        <w:tabs>
+          <w:tab w:val="left" w:pos="1560"/>
+        </w:tabs>
+        <w:rPr>
+          <w:sz w:val="28"/>
+          <w:szCs w:val="24"/>
+          <w:lang w:val="en-US"/>
+        </w:rPr>
+      </w:pPr>
+      <w:r>
+        <w:rPr>
+          <w:sz w:val="28"/>
+          <w:szCs w:val="24"/>
+          <w:lang w:val="en-US"/>
+        </w:rPr>
+        <w:t xml:space="preserve">@After </w:t>
+      </w:r>
+      <w:r>
+        <w:rPr>
+          <w:sz w:val="28"/>
+          <w:szCs w:val="24"/>
+          <w:lang w:val="en-US"/>
+        </w:rPr>
+        <w:sym w:font="Wingdings" w:char="F0E0"/>
+      </w:r>
+      <w:r>
+        <w:rPr>
+          <w:sz w:val="28"/>
+          <w:szCs w:val="24"/>
+          <w:lang w:val="en-US"/>
+        </w:rPr>
+        <w:t xml:space="preserve"> Executes after every scenario</w:t>
+      </w:r>
+    </w:p>
+    <w:p>
+      <w:pPr>
+        <w:pStyle w:val="ListParagraph"/>
+        <w:numPr>
+          <w:ilvl w:val="0"/>
+          <w:numId w:val="48"/>
+        </w:numPr>
+        <w:tabs>
+          <w:tab w:val="left" w:pos="1560"/>
+        </w:tabs>
+        <w:rPr>
+          <w:sz w:val="28"/>
+          <w:szCs w:val="24"/>
+          <w:lang w:val="en-US"/>
+        </w:rPr>
+      </w:pPr>
+      <w:r>
+        <w:rPr>
+          <w:sz w:val="28"/>
+          <w:szCs w:val="24"/>
+          <w:lang w:val="en-US"/>
+        </w:rPr>
+        <w:t>Hooks are never the part of feature file or runner class</w:t>
+      </w:r>
+    </w:p>
+    <w:p>
+      <w:pPr>
+        <w:pStyle w:val="ListParagraph"/>
+        <w:numPr>
+          <w:ilvl w:val="0"/>
+          <w:numId w:val="48"/>
+        </w:numPr>
+        <w:tabs>
+          <w:tab w:val="left" w:pos="1560"/>
+        </w:tabs>
+        <w:rPr>
+          <w:sz w:val="28"/>
+          <w:szCs w:val="24"/>
+          <w:lang w:val="en-US"/>
+        </w:rPr>
+      </w:pPr>
+      <w:r>
+        <w:rPr>
+          <w:sz w:val="28"/>
+          <w:szCs w:val="24"/>
+          <w:lang w:val="en-US"/>
+        </w:rPr>
+        <w:t>Hooks can be written either in Step Definition or in a separate class</w:t>
+      </w:r>
       <w:bookmarkStart w:id="0" w:name="_GoBack"/>
       <w:bookmarkEnd w:id="0"/>
-    </w:p>
-    <w:p>
-      <w:pPr>
-        <w:tabs>
-          <w:tab w:val="left" w:pos="1560"/>
-        </w:tabs>
-        <w:rPr>
-          <w:sz w:val="28"/>
-          <w:szCs w:val="24"/>
-          <w:lang w:val="en-US"/>
-        </w:rPr>
-      </w:pPr>
     </w:p>
     <w:sectPr>
       <w:pgSz w:w="11906" w:h="16838"/>
@@ -18649,6 +19243,119 @@
     </w:lvl>
   </w:abstractNum>
   <w:abstractNum w:abstractNumId="1">
+    <w:nsid w:val="08D90AA4"/>
+    <w:multiLevelType w:val="hybridMultilevel"/>
+    <w:tmpl w:val="C3CE4E5C"/>
+    <w:lvl w:ilvl="0" w:tplc="40090001">
+      <w:start w:val="1"/>
+      <w:numFmt w:val="bullet"/>
+      <w:lvlText w:val=""/>
+      <w:lvlJc w:val="left"/>
+      <w:pPr>
+        <w:ind w:left="720" w:hanging="360"/>
+      </w:pPr>
+      <w:rPr>
+        <w:rFonts w:ascii="Symbol" w:hAnsi="Symbol" w:hint="default"/>
+      </w:rPr>
+    </w:lvl>
+    <w:lvl w:ilvl="1" w:tplc="40090003">
+      <w:start w:val="1"/>
+      <w:numFmt w:val="bullet"/>
+      <w:lvlText w:val="o"/>
+      <w:lvlJc w:val="left"/>
+      <w:pPr>
+        <w:ind w:left="1440" w:hanging="360"/>
+      </w:pPr>
+      <w:rPr>
+        <w:rFonts w:ascii="Courier New" w:hAnsi="Courier New" w:cs="Courier New" w:hint="default"/>
+      </w:rPr>
+    </w:lvl>
+    <w:lvl w:ilvl="2" w:tplc="40090005" w:tentative="1">
+      <w:start w:val="1"/>
+      <w:numFmt w:val="bullet"/>
+      <w:lvlText w:val=""/>
+      <w:lvlJc w:val="left"/>
+      <w:pPr>
+        <w:ind w:left="2160" w:hanging="360"/>
+      </w:pPr>
+      <w:rPr>
+        <w:rFonts w:ascii="Wingdings" w:hAnsi="Wingdings" w:hint="default"/>
+      </w:rPr>
+    </w:lvl>
+    <w:lvl w:ilvl="3" w:tplc="40090001" w:tentative="1">
+      <w:start w:val="1"/>
+      <w:numFmt w:val="bullet"/>
+      <w:lvlText w:val=""/>
+      <w:lvlJc w:val="left"/>
+      <w:pPr>
+        <w:ind w:left="2880" w:hanging="360"/>
+      </w:pPr>
+      <w:rPr>
+        <w:rFonts w:ascii="Symbol" w:hAnsi="Symbol" w:hint="default"/>
+      </w:rPr>
+    </w:lvl>
+    <w:lvl w:ilvl="4" w:tplc="40090003" w:tentative="1">
+      <w:start w:val="1"/>
+      <w:numFmt w:val="bullet"/>
+      <w:lvlText w:val="o"/>
+      <w:lvlJc w:val="left"/>
+      <w:pPr>
+        <w:ind w:left="3600" w:hanging="360"/>
+      </w:pPr>
+      <w:rPr>
+        <w:rFonts w:ascii="Courier New" w:hAnsi="Courier New" w:cs="Courier New" w:hint="default"/>
+      </w:rPr>
+    </w:lvl>
+    <w:lvl w:ilvl="5" w:tplc="40090005" w:tentative="1">
+      <w:start w:val="1"/>
+      <w:numFmt w:val="bullet"/>
+      <w:lvlText w:val=""/>
+      <w:lvlJc w:val="left"/>
+      <w:pPr>
+        <w:ind w:left="4320" w:hanging="360"/>
+      </w:pPr>
+      <w:rPr>
+        <w:rFonts w:ascii="Wingdings" w:hAnsi="Wingdings" w:hint="default"/>
+      </w:rPr>
+    </w:lvl>
+    <w:lvl w:ilvl="6" w:tplc="40090001" w:tentative="1">
+      <w:start w:val="1"/>
+      <w:numFmt w:val="bullet"/>
+      <w:lvlText w:val=""/>
+      <w:lvlJc w:val="left"/>
+      <w:pPr>
+        <w:ind w:left="5040" w:hanging="360"/>
+      </w:pPr>
+      <w:rPr>
+        <w:rFonts w:ascii="Symbol" w:hAnsi="Symbol" w:hint="default"/>
+      </w:rPr>
+    </w:lvl>
+    <w:lvl w:ilvl="7" w:tplc="40090003" w:tentative="1">
+      <w:start w:val="1"/>
+      <w:numFmt w:val="bullet"/>
+      <w:lvlText w:val="o"/>
+      <w:lvlJc w:val="left"/>
+      <w:pPr>
+        <w:ind w:left="5760" w:hanging="360"/>
+      </w:pPr>
+      <w:rPr>
+        <w:rFonts w:ascii="Courier New" w:hAnsi="Courier New" w:cs="Courier New" w:hint="default"/>
+      </w:rPr>
+    </w:lvl>
+    <w:lvl w:ilvl="8" w:tplc="40090005" w:tentative="1">
+      <w:start w:val="1"/>
+      <w:numFmt w:val="bullet"/>
+      <w:lvlText w:val=""/>
+      <w:lvlJc w:val="left"/>
+      <w:pPr>
+        <w:ind w:left="6480" w:hanging="360"/>
+      </w:pPr>
+      <w:rPr>
+        <w:rFonts w:ascii="Wingdings" w:hAnsi="Wingdings" w:hint="default"/>
+      </w:rPr>
+    </w:lvl>
+  </w:abstractNum>
+  <w:abstractNum w:abstractNumId="2">
     <w:nsid w:val="0E255424"/>
     <w:multiLevelType w:val="hybridMultilevel"/>
     <w:tmpl w:val="474A6FC4"/>
@@ -18761,7 +19468,7 @@
       </w:rPr>
     </w:lvl>
   </w:abstractNum>
-  <w:abstractNum w:abstractNumId="2">
+  <w:abstractNum w:abstractNumId="3">
     <w:nsid w:val="0FFB5174"/>
     <w:multiLevelType w:val="hybridMultilevel"/>
     <w:tmpl w:val="1102E846"/>
@@ -18874,7 +19581,7 @@
       </w:rPr>
     </w:lvl>
   </w:abstractNum>
-  <w:abstractNum w:abstractNumId="3">
+  <w:abstractNum w:abstractNumId="4">
     <w:nsid w:val="13BD6C92"/>
     <w:multiLevelType w:val="hybridMultilevel"/>
     <w:tmpl w:val="F9B4189C"/>
@@ -18963,7 +19670,7 @@
       </w:pPr>
     </w:lvl>
   </w:abstractNum>
-  <w:abstractNum w:abstractNumId="4">
+  <w:abstractNum w:abstractNumId="5">
     <w:nsid w:val="15855398"/>
     <w:multiLevelType w:val="hybridMultilevel"/>
     <w:tmpl w:val="42BA2EF8"/>
@@ -19052,7 +19759,7 @@
       </w:pPr>
     </w:lvl>
   </w:abstractNum>
-  <w:abstractNum w:abstractNumId="5">
+  <w:abstractNum w:abstractNumId="6">
     <w:nsid w:val="164D34B1"/>
     <w:multiLevelType w:val="hybridMultilevel"/>
     <w:tmpl w:val="31AACE24"/>
@@ -19165,7 +19872,7 @@
       </w:rPr>
     </w:lvl>
   </w:abstractNum>
-  <w:abstractNum w:abstractNumId="6">
+  <w:abstractNum w:abstractNumId="7">
     <w:nsid w:val="16AA1F84"/>
     <w:multiLevelType w:val="hybridMultilevel"/>
     <w:tmpl w:val="2DC0991A"/>
@@ -19278,7 +19985,7 @@
       </w:rPr>
     </w:lvl>
   </w:abstractNum>
-  <w:abstractNum w:abstractNumId="7">
+  <w:abstractNum w:abstractNumId="8">
     <w:nsid w:val="17887E81"/>
     <w:multiLevelType w:val="hybridMultilevel"/>
     <w:tmpl w:val="F448FA1A"/>
@@ -19391,7 +20098,7 @@
       </w:rPr>
     </w:lvl>
   </w:abstractNum>
-  <w:abstractNum w:abstractNumId="8">
+  <w:abstractNum w:abstractNumId="9">
     <w:nsid w:val="1E9B63EE"/>
     <w:multiLevelType w:val="hybridMultilevel"/>
     <w:tmpl w:val="CC24F4FC"/>
@@ -19504,7 +20211,7 @@
       </w:rPr>
     </w:lvl>
   </w:abstractNum>
-  <w:abstractNum w:abstractNumId="9">
+  <w:abstractNum w:abstractNumId="10">
     <w:nsid w:val="1F5D6F6F"/>
     <w:multiLevelType w:val="hybridMultilevel"/>
     <w:tmpl w:val="2C66BBE6"/>
@@ -19617,7 +20324,7 @@
       </w:rPr>
     </w:lvl>
   </w:abstractNum>
-  <w:abstractNum w:abstractNumId="10">
+  <w:abstractNum w:abstractNumId="11">
     <w:nsid w:val="1FFE0324"/>
     <w:multiLevelType w:val="hybridMultilevel"/>
     <w:tmpl w:val="562439F6"/>
@@ -19730,7 +20437,7 @@
       </w:rPr>
     </w:lvl>
   </w:abstractNum>
-  <w:abstractNum w:abstractNumId="11">
+  <w:abstractNum w:abstractNumId="12">
     <w:nsid w:val="21270C12"/>
     <w:multiLevelType w:val="hybridMultilevel"/>
     <w:tmpl w:val="77C8B216"/>
@@ -19843,7 +20550,7 @@
       </w:rPr>
     </w:lvl>
   </w:abstractNum>
-  <w:abstractNum w:abstractNumId="12">
+  <w:abstractNum w:abstractNumId="13">
     <w:nsid w:val="26EA2626"/>
     <w:multiLevelType w:val="hybridMultilevel"/>
     <w:tmpl w:val="6D525678"/>
@@ -19929,7 +20636,7 @@
       </w:pPr>
     </w:lvl>
   </w:abstractNum>
-  <w:abstractNum w:abstractNumId="13">
+  <w:abstractNum w:abstractNumId="14">
     <w:nsid w:val="2BD5541D"/>
     <w:multiLevelType w:val="hybridMultilevel"/>
     <w:tmpl w:val="45505B90"/>
@@ -20042,7 +20749,7 @@
       </w:rPr>
     </w:lvl>
   </w:abstractNum>
-  <w:abstractNum w:abstractNumId="14">
+  <w:abstractNum w:abstractNumId="15">
     <w:nsid w:val="2C310AF1"/>
     <w:multiLevelType w:val="hybridMultilevel"/>
     <w:tmpl w:val="D80E52EC"/>
@@ -20155,7 +20862,7 @@
       </w:rPr>
     </w:lvl>
   </w:abstractNum>
-  <w:abstractNum w:abstractNumId="15">
+  <w:abstractNum w:abstractNumId="16">
     <w:nsid w:val="2DF83EE9"/>
     <w:multiLevelType w:val="hybridMultilevel"/>
     <w:tmpl w:val="5C824650"/>
@@ -20268,7 +20975,7 @@
       </w:rPr>
     </w:lvl>
   </w:abstractNum>
-  <w:abstractNum w:abstractNumId="16">
+  <w:abstractNum w:abstractNumId="17">
     <w:nsid w:val="2ED85F35"/>
     <w:multiLevelType w:val="hybridMultilevel"/>
     <w:tmpl w:val="D396C416"/>
@@ -20357,7 +21064,7 @@
       </w:pPr>
     </w:lvl>
   </w:abstractNum>
-  <w:abstractNum w:abstractNumId="17">
+  <w:abstractNum w:abstractNumId="18">
     <w:nsid w:val="2F5B6010"/>
     <w:multiLevelType w:val="hybridMultilevel"/>
     <w:tmpl w:val="303E3506"/>
@@ -20470,7 +21177,7 @@
       </w:rPr>
     </w:lvl>
   </w:abstractNum>
-  <w:abstractNum w:abstractNumId="18">
+  <w:abstractNum w:abstractNumId="19">
     <w:nsid w:val="344C7AD5"/>
     <w:multiLevelType w:val="hybridMultilevel"/>
     <w:tmpl w:val="3AB6C236"/>
@@ -20583,7 +21290,7 @@
       </w:rPr>
     </w:lvl>
   </w:abstractNum>
-  <w:abstractNum w:abstractNumId="19">
+  <w:abstractNum w:abstractNumId="20">
     <w:nsid w:val="372A7643"/>
     <w:multiLevelType w:val="hybridMultilevel"/>
     <w:tmpl w:val="72661F18"/>
@@ -20696,7 +21403,7 @@
       </w:rPr>
     </w:lvl>
   </w:abstractNum>
-  <w:abstractNum w:abstractNumId="20">
+  <w:abstractNum w:abstractNumId="21">
     <w:nsid w:val="398E3101"/>
     <w:multiLevelType w:val="hybridMultilevel"/>
     <w:tmpl w:val="5972D984"/>
@@ -20782,7 +21489,7 @@
       </w:pPr>
     </w:lvl>
   </w:abstractNum>
-  <w:abstractNum w:abstractNumId="21">
+  <w:abstractNum w:abstractNumId="22">
     <w:nsid w:val="39FE7F6B"/>
     <w:multiLevelType w:val="hybridMultilevel"/>
     <w:tmpl w:val="DB76FF82"/>
@@ -20868,7 +21575,7 @@
       </w:pPr>
     </w:lvl>
   </w:abstractNum>
-  <w:abstractNum w:abstractNumId="22">
+  <w:abstractNum w:abstractNumId="23">
     <w:nsid w:val="3CDB6A66"/>
     <w:multiLevelType w:val="hybridMultilevel"/>
     <w:tmpl w:val="64685F9A"/>
@@ -20957,7 +21664,7 @@
       </w:pPr>
     </w:lvl>
   </w:abstractNum>
-  <w:abstractNum w:abstractNumId="23">
+  <w:abstractNum w:abstractNumId="24">
     <w:nsid w:val="3CE011C3"/>
     <w:multiLevelType w:val="hybridMultilevel"/>
     <w:tmpl w:val="31EA3DA2"/>
@@ -21046,7 +21753,7 @@
       </w:pPr>
     </w:lvl>
   </w:abstractNum>
-  <w:abstractNum w:abstractNumId="24">
+  <w:abstractNum w:abstractNumId="25">
     <w:nsid w:val="42DB17C6"/>
     <w:multiLevelType w:val="hybridMultilevel"/>
     <w:tmpl w:val="B638096C"/>
@@ -21135,7 +21842,7 @@
       </w:pPr>
     </w:lvl>
   </w:abstractNum>
-  <w:abstractNum w:abstractNumId="25">
+  <w:abstractNum w:abstractNumId="26">
     <w:nsid w:val="44424C1B"/>
     <w:multiLevelType w:val="hybridMultilevel"/>
     <w:tmpl w:val="EBDAADA4"/>
@@ -21248,7 +21955,7 @@
       </w:rPr>
     </w:lvl>
   </w:abstractNum>
-  <w:abstractNum w:abstractNumId="26">
+  <w:abstractNum w:abstractNumId="27">
     <w:nsid w:val="46DF09B1"/>
     <w:multiLevelType w:val="hybridMultilevel"/>
     <w:tmpl w:val="FB0236F0"/>
@@ -21361,7 +22068,7 @@
       </w:rPr>
     </w:lvl>
   </w:abstractNum>
-  <w:abstractNum w:abstractNumId="27">
+  <w:abstractNum w:abstractNumId="28">
     <w:nsid w:val="47F70A7E"/>
     <w:multiLevelType w:val="hybridMultilevel"/>
     <w:tmpl w:val="BCF8131E"/>
@@ -21450,7 +22157,7 @@
       </w:pPr>
     </w:lvl>
   </w:abstractNum>
-  <w:abstractNum w:abstractNumId="28">
+  <w:abstractNum w:abstractNumId="29">
     <w:nsid w:val="4FAE1062"/>
     <w:multiLevelType w:val="hybridMultilevel"/>
     <w:tmpl w:val="C1A67A02"/>
@@ -21539,7 +22246,7 @@
       </w:pPr>
     </w:lvl>
   </w:abstractNum>
-  <w:abstractNum w:abstractNumId="29">
+  <w:abstractNum w:abstractNumId="30">
     <w:nsid w:val="50CF4F8C"/>
     <w:multiLevelType w:val="hybridMultilevel"/>
     <w:tmpl w:val="082E2B26"/>
@@ -21652,7 +22359,7 @@
       </w:rPr>
     </w:lvl>
   </w:abstractNum>
-  <w:abstractNum w:abstractNumId="30">
+  <w:abstractNum w:abstractNumId="31">
     <w:nsid w:val="56DC0393"/>
     <w:multiLevelType w:val="hybridMultilevel"/>
     <w:tmpl w:val="BFA6E070"/>
@@ -21765,7 +22472,7 @@
       </w:rPr>
     </w:lvl>
   </w:abstractNum>
-  <w:abstractNum w:abstractNumId="31">
+  <w:abstractNum w:abstractNumId="32">
     <w:nsid w:val="5D2E0595"/>
     <w:multiLevelType w:val="hybridMultilevel"/>
     <w:tmpl w:val="BD76ED2E"/>
@@ -21878,7 +22585,7 @@
       </w:rPr>
     </w:lvl>
   </w:abstractNum>
-  <w:abstractNum w:abstractNumId="32">
+  <w:abstractNum w:abstractNumId="33">
     <w:nsid w:val="6264615A"/>
     <w:multiLevelType w:val="hybridMultilevel"/>
     <w:tmpl w:val="BEBCD1E2"/>
@@ -21967,7 +22674,7 @@
       </w:pPr>
     </w:lvl>
   </w:abstractNum>
-  <w:abstractNum w:abstractNumId="33">
+  <w:abstractNum w:abstractNumId="34">
     <w:nsid w:val="64B248FF"/>
     <w:multiLevelType w:val="hybridMultilevel"/>
     <w:tmpl w:val="47BA2214"/>
@@ -22080,7 +22787,7 @@
       </w:rPr>
     </w:lvl>
   </w:abstractNum>
-  <w:abstractNum w:abstractNumId="34">
+  <w:abstractNum w:abstractNumId="35">
     <w:nsid w:val="64D75A0A"/>
     <w:multiLevelType w:val="hybridMultilevel"/>
     <w:tmpl w:val="F93653D8"/>
@@ -22193,7 +22900,7 @@
       </w:rPr>
     </w:lvl>
   </w:abstractNum>
-  <w:abstractNum w:abstractNumId="35">
+  <w:abstractNum w:abstractNumId="36">
     <w:nsid w:val="65A70915"/>
     <w:multiLevelType w:val="hybridMultilevel"/>
     <w:tmpl w:val="F4BEB16C"/>
@@ -22282,7 +22989,7 @@
       </w:pPr>
     </w:lvl>
   </w:abstractNum>
-  <w:abstractNum w:abstractNumId="36">
+  <w:abstractNum w:abstractNumId="37">
     <w:nsid w:val="667572E6"/>
     <w:multiLevelType w:val="hybridMultilevel"/>
     <w:tmpl w:val="375E6AAA"/>
@@ -22371,7 +23078,7 @@
       </w:pPr>
     </w:lvl>
   </w:abstractNum>
-  <w:abstractNum w:abstractNumId="37">
+  <w:abstractNum w:abstractNumId="38">
     <w:nsid w:val="6794711A"/>
     <w:multiLevelType w:val="hybridMultilevel"/>
     <w:tmpl w:val="7D58095C"/>
@@ -22484,7 +23191,7 @@
       </w:rPr>
     </w:lvl>
   </w:abstractNum>
-  <w:abstractNum w:abstractNumId="38">
+  <w:abstractNum w:abstractNumId="39">
     <w:nsid w:val="6D6046F6"/>
     <w:multiLevelType w:val="hybridMultilevel"/>
     <w:tmpl w:val="6644C14E"/>
@@ -22573,7 +23280,7 @@
       </w:pPr>
     </w:lvl>
   </w:abstractNum>
-  <w:abstractNum w:abstractNumId="39">
+  <w:abstractNum w:abstractNumId="40">
     <w:nsid w:val="6FB6583E"/>
     <w:multiLevelType w:val="hybridMultilevel"/>
     <w:tmpl w:val="F83A92A4"/>
@@ -22686,7 +23393,7 @@
       </w:rPr>
     </w:lvl>
   </w:abstractNum>
-  <w:abstractNum w:abstractNumId="40">
+  <w:abstractNum w:abstractNumId="41">
     <w:nsid w:val="74A07B48"/>
     <w:multiLevelType w:val="hybridMultilevel"/>
     <w:tmpl w:val="9EE4049A"/>
@@ -22799,7 +23506,7 @@
       </w:rPr>
     </w:lvl>
   </w:abstractNum>
-  <w:abstractNum w:abstractNumId="41">
+  <w:abstractNum w:abstractNumId="42">
     <w:nsid w:val="75D41A19"/>
     <w:multiLevelType w:val="hybridMultilevel"/>
     <w:tmpl w:val="8C2E2B00"/>
@@ -22888,7 +23595,7 @@
       </w:pPr>
     </w:lvl>
   </w:abstractNum>
-  <w:abstractNum w:abstractNumId="42">
+  <w:abstractNum w:abstractNumId="43">
     <w:nsid w:val="7782158E"/>
     <w:multiLevelType w:val="hybridMultilevel"/>
     <w:tmpl w:val="6068CD52"/>
@@ -23001,7 +23708,7 @@
       </w:rPr>
     </w:lvl>
   </w:abstractNum>
-  <w:abstractNum w:abstractNumId="43">
+  <w:abstractNum w:abstractNumId="44">
     <w:nsid w:val="77BB0C1A"/>
     <w:multiLevelType w:val="hybridMultilevel"/>
     <w:tmpl w:val="8A9AA4F4"/>
@@ -23090,7 +23797,120 @@
       </w:pPr>
     </w:lvl>
   </w:abstractNum>
-  <w:abstractNum w:abstractNumId="44">
+  <w:abstractNum w:abstractNumId="45">
+    <w:nsid w:val="78D97A9A"/>
+    <w:multiLevelType w:val="hybridMultilevel"/>
+    <w:tmpl w:val="5832CCC8"/>
+    <w:lvl w:ilvl="0" w:tplc="40090001">
+      <w:start w:val="1"/>
+      <w:numFmt w:val="bullet"/>
+      <w:lvlText w:val=""/>
+      <w:lvlJc w:val="left"/>
+      <w:pPr>
+        <w:ind w:left="720" w:hanging="360"/>
+      </w:pPr>
+      <w:rPr>
+        <w:rFonts w:ascii="Symbol" w:hAnsi="Symbol" w:hint="default"/>
+      </w:rPr>
+    </w:lvl>
+    <w:lvl w:ilvl="1" w:tplc="40090003" w:tentative="1">
+      <w:start w:val="1"/>
+      <w:numFmt w:val="bullet"/>
+      <w:lvlText w:val="o"/>
+      <w:lvlJc w:val="left"/>
+      <w:pPr>
+        <w:ind w:left="1440" w:hanging="360"/>
+      </w:pPr>
+      <w:rPr>
+        <w:rFonts w:ascii="Courier New" w:hAnsi="Courier New" w:cs="Courier New" w:hint="default"/>
+      </w:rPr>
+    </w:lvl>
+    <w:lvl w:ilvl="2" w:tplc="40090005" w:tentative="1">
+      <w:start w:val="1"/>
+      <w:numFmt w:val="bullet"/>
+      <w:lvlText w:val=""/>
+      <w:lvlJc w:val="left"/>
+      <w:pPr>
+        <w:ind w:left="2160" w:hanging="360"/>
+      </w:pPr>
+      <w:rPr>
+        <w:rFonts w:ascii="Wingdings" w:hAnsi="Wingdings" w:hint="default"/>
+      </w:rPr>
+    </w:lvl>
+    <w:lvl w:ilvl="3" w:tplc="40090001" w:tentative="1">
+      <w:start w:val="1"/>
+      <w:numFmt w:val="bullet"/>
+      <w:lvlText w:val=""/>
+      <w:lvlJc w:val="left"/>
+      <w:pPr>
+        <w:ind w:left="2880" w:hanging="360"/>
+      </w:pPr>
+      <w:rPr>
+        <w:rFonts w:ascii="Symbol" w:hAnsi="Symbol" w:hint="default"/>
+      </w:rPr>
+    </w:lvl>
+    <w:lvl w:ilvl="4" w:tplc="40090003" w:tentative="1">
+      <w:start w:val="1"/>
+      <w:numFmt w:val="bullet"/>
+      <w:lvlText w:val="o"/>
+      <w:lvlJc w:val="left"/>
+      <w:pPr>
+        <w:ind w:left="3600" w:hanging="360"/>
+      </w:pPr>
+      <w:rPr>
+        <w:rFonts w:ascii="Courier New" w:hAnsi="Courier New" w:cs="Courier New" w:hint="default"/>
+      </w:rPr>
+    </w:lvl>
+    <w:lvl w:ilvl="5" w:tplc="40090005" w:tentative="1">
+      <w:start w:val="1"/>
+      <w:numFmt w:val="bullet"/>
+      <w:lvlText w:val=""/>
+      <w:lvlJc w:val="left"/>
+      <w:pPr>
+        <w:ind w:left="4320" w:hanging="360"/>
+      </w:pPr>
+      <w:rPr>
+        <w:rFonts w:ascii="Wingdings" w:hAnsi="Wingdings" w:hint="default"/>
+      </w:rPr>
+    </w:lvl>
+    <w:lvl w:ilvl="6" w:tplc="40090001" w:tentative="1">
+      <w:start w:val="1"/>
+      <w:numFmt w:val="bullet"/>
+      <w:lvlText w:val=""/>
+      <w:lvlJc w:val="left"/>
+      <w:pPr>
+        <w:ind w:left="5040" w:hanging="360"/>
+      </w:pPr>
+      <w:rPr>
+        <w:rFonts w:ascii="Symbol" w:hAnsi="Symbol" w:hint="default"/>
+      </w:rPr>
+    </w:lvl>
+    <w:lvl w:ilvl="7" w:tplc="40090003" w:tentative="1">
+      <w:start w:val="1"/>
+      <w:numFmt w:val="bullet"/>
+      <w:lvlText w:val="o"/>
+      <w:lvlJc w:val="left"/>
+      <w:pPr>
+        <w:ind w:left="5760" w:hanging="360"/>
+      </w:pPr>
+      <w:rPr>
+        <w:rFonts w:ascii="Courier New" w:hAnsi="Courier New" w:cs="Courier New" w:hint="default"/>
+      </w:rPr>
+    </w:lvl>
+    <w:lvl w:ilvl="8" w:tplc="40090005" w:tentative="1">
+      <w:start w:val="1"/>
+      <w:numFmt w:val="bullet"/>
+      <w:lvlText w:val=""/>
+      <w:lvlJc w:val="left"/>
+      <w:pPr>
+        <w:ind w:left="6480" w:hanging="360"/>
+      </w:pPr>
+      <w:rPr>
+        <w:rFonts w:ascii="Wingdings" w:hAnsi="Wingdings" w:hint="default"/>
+      </w:rPr>
+    </w:lvl>
+  </w:abstractNum>
+  <w:abstractNum w:abstractNumId="46">
     <w:nsid w:val="797C6995"/>
     <w:multiLevelType w:val="hybridMultilevel"/>
     <w:tmpl w:val="71483934"/>
@@ -23203,7 +24023,7 @@
       </w:rPr>
     </w:lvl>
   </w:abstractNum>
-  <w:abstractNum w:abstractNumId="45">
+  <w:abstractNum w:abstractNumId="47">
     <w:nsid w:val="7D1867D1"/>
     <w:multiLevelType w:val="hybridMultilevel"/>
     <w:tmpl w:val="378A0E78"/>
@@ -23317,142 +24137,148 @@
     </w:lvl>
   </w:abstractNum>
   <w:num w:numId="1">
-    <w:abstractNumId w:val="18"/>
+    <w:abstractNumId w:val="19"/>
   </w:num>
   <w:num w:numId="2">
-    <w:abstractNumId w:val="45"/>
+    <w:abstractNumId w:val="47"/>
   </w:num>
   <w:num w:numId="3">
     <w:abstractNumId w:val="0"/>
   </w:num>
   <w:num w:numId="4">
+    <w:abstractNumId w:val="21"/>
+  </w:num>
+  <w:num w:numId="5">
+    <w:abstractNumId w:val="18"/>
+  </w:num>
+  <w:num w:numId="6">
+    <w:abstractNumId w:val="3"/>
+  </w:num>
+  <w:num w:numId="7">
+    <w:abstractNumId w:val="2"/>
+  </w:num>
+  <w:num w:numId="8">
+    <w:abstractNumId w:val="14"/>
+  </w:num>
+  <w:num w:numId="9">
+    <w:abstractNumId w:val="40"/>
+  </w:num>
+  <w:num w:numId="10">
+    <w:abstractNumId w:val="11"/>
+  </w:num>
+  <w:num w:numId="11">
+    <w:abstractNumId w:val="31"/>
+  </w:num>
+  <w:num w:numId="12">
+    <w:abstractNumId w:val="34"/>
+  </w:num>
+  <w:num w:numId="13">
+    <w:abstractNumId w:val="13"/>
+  </w:num>
+  <w:num w:numId="14">
+    <w:abstractNumId w:val="28"/>
+  </w:num>
+  <w:num w:numId="15">
+    <w:abstractNumId w:val="4"/>
+  </w:num>
+  <w:num w:numId="16">
+    <w:abstractNumId w:val="37"/>
+  </w:num>
+  <w:num w:numId="17">
+    <w:abstractNumId w:val="36"/>
+  </w:num>
+  <w:num w:numId="18">
+    <w:abstractNumId w:val="38"/>
+  </w:num>
+  <w:num w:numId="19">
+    <w:abstractNumId w:val="43"/>
+  </w:num>
+  <w:num w:numId="20">
+    <w:abstractNumId w:val="10"/>
+  </w:num>
+  <w:num w:numId="21">
+    <w:abstractNumId w:val="46"/>
+  </w:num>
+  <w:num w:numId="22">
+    <w:abstractNumId w:val="30"/>
+  </w:num>
+  <w:num w:numId="23">
+    <w:abstractNumId w:val="27"/>
+  </w:num>
+  <w:num w:numId="24">
+    <w:abstractNumId w:val="32"/>
+  </w:num>
+  <w:num w:numId="25">
+    <w:abstractNumId w:val="12"/>
+  </w:num>
+  <w:num w:numId="26">
+    <w:abstractNumId w:val="39"/>
+  </w:num>
+  <w:num w:numId="27">
+    <w:abstractNumId w:val="16"/>
+  </w:num>
+  <w:num w:numId="28">
+    <w:abstractNumId w:val="7"/>
+  </w:num>
+  <w:num w:numId="29">
+    <w:abstractNumId w:val="25"/>
+  </w:num>
+  <w:num w:numId="30">
+    <w:abstractNumId w:val="24"/>
+  </w:num>
+  <w:num w:numId="31">
+    <w:abstractNumId w:val="29"/>
+  </w:num>
+  <w:num w:numId="32">
+    <w:abstractNumId w:val="6"/>
+  </w:num>
+  <w:num w:numId="33">
+    <w:abstractNumId w:val="17"/>
+  </w:num>
+  <w:num w:numId="34">
+    <w:abstractNumId w:val="23"/>
+  </w:num>
+  <w:num w:numId="35">
     <w:abstractNumId w:val="20"/>
   </w:num>
-  <w:num w:numId="5">
-    <w:abstractNumId w:val="17"/>
+  <w:num w:numId="36">
+    <w:abstractNumId w:val="35"/>
   </w:num>
-  <w:num w:numId="6">
-    <w:abstractNumId w:val="2"/>
+  <w:num w:numId="37">
+    <w:abstractNumId w:val="26"/>
   </w:num>
-  <w:num w:numId="7">
-    <w:abstractNumId w:val="1"/>
+  <w:num w:numId="38">
+    <w:abstractNumId w:val="15"/>
   </w:num>
-  <w:num w:numId="8">
-    <w:abstractNumId w:val="13"/>
+  <w:num w:numId="39">
+    <w:abstractNumId w:val="5"/>
   </w:num>
-  <w:num w:numId="9">
-    <w:abstractNumId w:val="39"/>
+  <w:num w:numId="40">
+    <w:abstractNumId w:val="41"/>
   </w:num>
-  <w:num w:numId="10">
-    <w:abstractNumId w:val="10"/>
+  <w:num w:numId="41">
+    <w:abstractNumId w:val="22"/>
   </w:num>
-  <w:num w:numId="11">
-    <w:abstractNumId w:val="30"/>
-  </w:num>
-  <w:num w:numId="12">
+  <w:num w:numId="42">
     <w:abstractNumId w:val="33"/>
   </w:num>
-  <w:num w:numId="13">
-    <w:abstractNumId w:val="12"/>
-  </w:num>
-  <w:num w:numId="14">
-    <w:abstractNumId w:val="27"/>
-  </w:num>
-  <w:num w:numId="15">
-    <w:abstractNumId w:val="3"/>
-  </w:num>
-  <w:num w:numId="16">
-    <w:abstractNumId w:val="36"/>
-  </w:num>
-  <w:num w:numId="17">
-    <w:abstractNumId w:val="35"/>
-  </w:num>
-  <w:num w:numId="18">
-    <w:abstractNumId w:val="37"/>
-  </w:num>
-  <w:num w:numId="19">
+  <w:num w:numId="43">
     <w:abstractNumId w:val="42"/>
   </w:num>
-  <w:num w:numId="20">
+  <w:num w:numId="44">
     <w:abstractNumId w:val="9"/>
   </w:num>
-  <w:num w:numId="21">
+  <w:num w:numId="45">
+    <w:abstractNumId w:val="8"/>
+  </w:num>
+  <w:num w:numId="46">
     <w:abstractNumId w:val="44"/>
   </w:num>
-  <w:num w:numId="22">
-    <w:abstractNumId w:val="29"/>
+  <w:num w:numId="47">
+    <w:abstractNumId w:val="45"/>
   </w:num>
-  <w:num w:numId="23">
-    <w:abstractNumId w:val="26"/>
-  </w:num>
-  <w:num w:numId="24">
-    <w:abstractNumId w:val="31"/>
-  </w:num>
-  <w:num w:numId="25">
-    <w:abstractNumId w:val="11"/>
-  </w:num>
-  <w:num w:numId="26">
-    <w:abstractNumId w:val="38"/>
-  </w:num>
-  <w:num w:numId="27">
-    <w:abstractNumId w:val="15"/>
-  </w:num>
-  <w:num w:numId="28">
-    <w:abstractNumId w:val="6"/>
-  </w:num>
-  <w:num w:numId="29">
-    <w:abstractNumId w:val="24"/>
-  </w:num>
-  <w:num w:numId="30">
-    <w:abstractNumId w:val="23"/>
-  </w:num>
-  <w:num w:numId="31">
-    <w:abstractNumId w:val="28"/>
-  </w:num>
-  <w:num w:numId="32">
-    <w:abstractNumId w:val="5"/>
-  </w:num>
-  <w:num w:numId="33">
-    <w:abstractNumId w:val="16"/>
-  </w:num>
-  <w:num w:numId="34">
-    <w:abstractNumId w:val="22"/>
-  </w:num>
-  <w:num w:numId="35">
-    <w:abstractNumId w:val="19"/>
-  </w:num>
-  <w:num w:numId="36">
-    <w:abstractNumId w:val="34"/>
-  </w:num>
-  <w:num w:numId="37">
-    <w:abstractNumId w:val="25"/>
-  </w:num>
-  <w:num w:numId="38">
-    <w:abstractNumId w:val="14"/>
-  </w:num>
-  <w:num w:numId="39">
-    <w:abstractNumId w:val="4"/>
-  </w:num>
-  <w:num w:numId="40">
-    <w:abstractNumId w:val="40"/>
-  </w:num>
-  <w:num w:numId="41">
-    <w:abstractNumId w:val="21"/>
-  </w:num>
-  <w:num w:numId="42">
-    <w:abstractNumId w:val="32"/>
-  </w:num>
-  <w:num w:numId="43">
-    <w:abstractNumId w:val="41"/>
-  </w:num>
-  <w:num w:numId="44">
-    <w:abstractNumId w:val="8"/>
-  </w:num>
-  <w:num w:numId="45">
-    <w:abstractNumId w:val="7"/>
-  </w:num>
-  <w:num w:numId="46">
-    <w:abstractNumId w:val="43"/>
+  <w:num w:numId="48">
+    <w:abstractNumId w:val="1"/>
   </w:num>
 </w:numbering>
 </file>
@@ -25033,31 +25859,31 @@
     </dgm:pt>
   </dgm:ptLst>
   <dgm:cxnLst>
-    <dgm:cxn modelId="{03965B52-AD4E-45CE-860E-57714AE6790C}" type="presOf" srcId="{D8AAE93C-983F-46D6-ABF6-FC8E801A362E}" destId="{449D7EB5-0D9D-4DAC-B391-FB2402C39ABC}" srcOrd="0" destOrd="0" presId="urn:microsoft.com/office/officeart/2005/8/layout/process1"/>
-    <dgm:cxn modelId="{5C1E10DE-0398-4B9E-B89B-FFD96BADC131}" type="presOf" srcId="{6C124C00-0E2C-42A5-B356-FCFE12C422EE}" destId="{AEA95148-3CF9-4188-ACFA-34C472C532BE}" srcOrd="1" destOrd="0" presId="urn:microsoft.com/office/officeart/2005/8/layout/process1"/>
-    <dgm:cxn modelId="{E58D5C7C-2358-4C0A-82CA-58B925EA593A}" type="presOf" srcId="{66AF4BFC-0875-4B90-9E82-F0F301500281}" destId="{09BDDF38-02A3-46F0-94CF-D671EECCB993}" srcOrd="0" destOrd="0" presId="urn:microsoft.com/office/officeart/2005/8/layout/process1"/>
-    <dgm:cxn modelId="{6FF57EFC-E141-44A0-A3D3-FD2628E4C13B}" type="presOf" srcId="{66AF4BFC-0875-4B90-9E82-F0F301500281}" destId="{A0BD6892-BF4E-4D26-B32D-4AC8D13032DE}" srcOrd="1" destOrd="0" presId="urn:microsoft.com/office/officeart/2005/8/layout/process1"/>
+    <dgm:cxn modelId="{05537926-9880-4C43-AB03-E891E3646876}" type="presOf" srcId="{363330DA-09EC-450B-A72E-6DA34D1AB715}" destId="{37E28D18-C070-47FF-8301-A041A91EDEF2}" srcOrd="0" destOrd="0" presId="urn:microsoft.com/office/officeart/2005/8/layout/process1"/>
     <dgm:cxn modelId="{4E00299D-3BDF-41B7-A234-E37BB604D85F}" srcId="{252D6598-1225-44AB-8AAB-B516106B59E1}" destId="{49728974-DA1C-46AA-A2B0-D3394453E5CC}" srcOrd="1" destOrd="0" parTransId="{2F909F4C-E59D-48F8-B67A-5D6A03CEBAEE}" sibTransId="{E9687206-84AC-4F83-A6A2-9EFDC3ABD0FB}"/>
-    <dgm:cxn modelId="{8B1C7B09-B3F1-4BF1-A139-6A9A57BD9135}" type="presOf" srcId="{252D6598-1225-44AB-8AAB-B516106B59E1}" destId="{2446BD26-396F-420D-B091-265286D97786}" srcOrd="0" destOrd="0" presId="urn:microsoft.com/office/officeart/2005/8/layout/process1"/>
-    <dgm:cxn modelId="{172EDB3F-C072-4543-A274-98D7B154DFBD}" type="presOf" srcId="{363330DA-09EC-450B-A72E-6DA34D1AB715}" destId="{37E28D18-C070-47FF-8301-A041A91EDEF2}" srcOrd="0" destOrd="0" presId="urn:microsoft.com/office/officeart/2005/8/layout/process1"/>
-    <dgm:cxn modelId="{236FB8DB-9375-4105-A4FE-F7EC72E9F6F9}" type="presOf" srcId="{49728974-DA1C-46AA-A2B0-D3394453E5CC}" destId="{CF1E89C8-AA78-4B1C-8D7C-AA8E38C034CE}" srcOrd="0" destOrd="0" presId="urn:microsoft.com/office/officeart/2005/8/layout/process1"/>
+    <dgm:cxn modelId="{FAED7B9A-4CBB-4C7A-A8B8-35A30320F4D4}" type="presOf" srcId="{6C124C00-0E2C-42A5-B356-FCFE12C422EE}" destId="{AEA95148-3CF9-4188-ACFA-34C472C532BE}" srcOrd="1" destOrd="0" presId="urn:microsoft.com/office/officeart/2005/8/layout/process1"/>
     <dgm:cxn modelId="{2659B5CA-FCEC-47A0-A347-15E4CED75EE1}" srcId="{252D6598-1225-44AB-8AAB-B516106B59E1}" destId="{30AFFC78-5808-45ED-AAC6-491EC3980094}" srcOrd="0" destOrd="0" parTransId="{15AA4179-7B4E-411C-A1D6-081E6042F5DA}" sibTransId="{6C124C00-0E2C-42A5-B356-FCFE12C422EE}"/>
-    <dgm:cxn modelId="{1D26BC88-3E93-4174-B5E4-4B9A452E8F45}" type="presOf" srcId="{6C124C00-0E2C-42A5-B356-FCFE12C422EE}" destId="{A5E00DF4-BEC8-4A62-B851-2A7F83FC9D35}" srcOrd="0" destOrd="0" presId="urn:microsoft.com/office/officeart/2005/8/layout/process1"/>
-    <dgm:cxn modelId="{664558BB-E8B7-414A-95A7-6F6650196E91}" type="presOf" srcId="{30AFFC78-5808-45ED-AAC6-491EC3980094}" destId="{F266C578-88AA-4EC2-8142-53A5B6139B0D}" srcOrd="0" destOrd="0" presId="urn:microsoft.com/office/officeart/2005/8/layout/process1"/>
+    <dgm:cxn modelId="{798FB7B6-E4A2-4D4D-9EA0-1A0ABA9501F0}" type="presOf" srcId="{66AF4BFC-0875-4B90-9E82-F0F301500281}" destId="{A0BD6892-BF4E-4D26-B32D-4AC8D13032DE}" srcOrd="1" destOrd="0" presId="urn:microsoft.com/office/officeart/2005/8/layout/process1"/>
+    <dgm:cxn modelId="{55A6478B-65D7-40EE-95E6-C613FEB108AA}" type="presOf" srcId="{66AF4BFC-0875-4B90-9E82-F0F301500281}" destId="{09BDDF38-02A3-46F0-94CF-D671EECCB993}" srcOrd="0" destOrd="0" presId="urn:microsoft.com/office/officeart/2005/8/layout/process1"/>
+    <dgm:cxn modelId="{630BB40F-C67C-4EEF-87C5-D22E5C185C4B}" type="presOf" srcId="{E9687206-84AC-4F83-A6A2-9EFDC3ABD0FB}" destId="{6E444586-2D87-4F9A-9400-F626352FE57E}" srcOrd="1" destOrd="0" presId="urn:microsoft.com/office/officeart/2005/8/layout/process1"/>
+    <dgm:cxn modelId="{39251249-B1B7-4A01-AFFD-91021B936726}" type="presOf" srcId="{252D6598-1225-44AB-8AAB-B516106B59E1}" destId="{2446BD26-396F-420D-B091-265286D97786}" srcOrd="0" destOrd="0" presId="urn:microsoft.com/office/officeart/2005/8/layout/process1"/>
     <dgm:cxn modelId="{8BADACC1-11B7-4449-8CEF-27159F593338}" srcId="{252D6598-1225-44AB-8AAB-B516106B59E1}" destId="{D8AAE93C-983F-46D6-ABF6-FC8E801A362E}" srcOrd="3" destOrd="0" parTransId="{E327365F-F469-481B-89E5-1C83ABC9E692}" sibTransId="{B97F4576-B840-4726-92AE-9C44A7C27E74}"/>
     <dgm:cxn modelId="{D0AB89FD-DD46-4E02-92EC-A604D66D139C}" srcId="{252D6598-1225-44AB-8AAB-B516106B59E1}" destId="{363330DA-09EC-450B-A72E-6DA34D1AB715}" srcOrd="2" destOrd="0" parTransId="{560647A9-7192-429E-B7E3-DFDF675B6572}" sibTransId="{66AF4BFC-0875-4B90-9E82-F0F301500281}"/>
-    <dgm:cxn modelId="{E06CBCE1-7614-438E-ADFA-C4F62D152E1B}" type="presOf" srcId="{E9687206-84AC-4F83-A6A2-9EFDC3ABD0FB}" destId="{72E9BEC7-D7FE-4BD7-BACA-0668A095A9EF}" srcOrd="0" destOrd="0" presId="urn:microsoft.com/office/officeart/2005/8/layout/process1"/>
-    <dgm:cxn modelId="{7A69C1A6-26E9-4182-915E-3E4BD4186092}" type="presOf" srcId="{E9687206-84AC-4F83-A6A2-9EFDC3ABD0FB}" destId="{6E444586-2D87-4F9A-9400-F626352FE57E}" srcOrd="1" destOrd="0" presId="urn:microsoft.com/office/officeart/2005/8/layout/process1"/>
-    <dgm:cxn modelId="{3A983056-46E0-46D1-88E2-95EEF00F5667}" type="presParOf" srcId="{2446BD26-396F-420D-B091-265286D97786}" destId="{F266C578-88AA-4EC2-8142-53A5B6139B0D}" srcOrd="0" destOrd="0" presId="urn:microsoft.com/office/officeart/2005/8/layout/process1"/>
-    <dgm:cxn modelId="{220AD50C-FC61-49CD-8F9C-7A93D9E4DFD3}" type="presParOf" srcId="{2446BD26-396F-420D-B091-265286D97786}" destId="{A5E00DF4-BEC8-4A62-B851-2A7F83FC9D35}" srcOrd="1" destOrd="0" presId="urn:microsoft.com/office/officeart/2005/8/layout/process1"/>
-    <dgm:cxn modelId="{DD9E1EFD-5552-406F-A040-943EA773E2AC}" type="presParOf" srcId="{A5E00DF4-BEC8-4A62-B851-2A7F83FC9D35}" destId="{AEA95148-3CF9-4188-ACFA-34C472C532BE}" srcOrd="0" destOrd="0" presId="urn:microsoft.com/office/officeart/2005/8/layout/process1"/>
-    <dgm:cxn modelId="{2C265540-ABFF-426F-B0D6-32ADDD188151}" type="presParOf" srcId="{2446BD26-396F-420D-B091-265286D97786}" destId="{CF1E89C8-AA78-4B1C-8D7C-AA8E38C034CE}" srcOrd="2" destOrd="0" presId="urn:microsoft.com/office/officeart/2005/8/layout/process1"/>
-    <dgm:cxn modelId="{2B46F8F1-51C0-44DA-8441-D3578095317A}" type="presParOf" srcId="{2446BD26-396F-420D-B091-265286D97786}" destId="{72E9BEC7-D7FE-4BD7-BACA-0668A095A9EF}" srcOrd="3" destOrd="0" presId="urn:microsoft.com/office/officeart/2005/8/layout/process1"/>
-    <dgm:cxn modelId="{E4563011-233D-4914-9756-A272AB0DE2FD}" type="presParOf" srcId="{72E9BEC7-D7FE-4BD7-BACA-0668A095A9EF}" destId="{6E444586-2D87-4F9A-9400-F626352FE57E}" srcOrd="0" destOrd="0" presId="urn:microsoft.com/office/officeart/2005/8/layout/process1"/>
-    <dgm:cxn modelId="{3F32F474-51A1-4BE0-982E-FADA17F74BE6}" type="presParOf" srcId="{2446BD26-396F-420D-B091-265286D97786}" destId="{37E28D18-C070-47FF-8301-A041A91EDEF2}" srcOrd="4" destOrd="0" presId="urn:microsoft.com/office/officeart/2005/8/layout/process1"/>
-    <dgm:cxn modelId="{37E25916-9F39-43A3-88C4-BF261F880DE2}" type="presParOf" srcId="{2446BD26-396F-420D-B091-265286D97786}" destId="{09BDDF38-02A3-46F0-94CF-D671EECCB993}" srcOrd="5" destOrd="0" presId="urn:microsoft.com/office/officeart/2005/8/layout/process1"/>
-    <dgm:cxn modelId="{84973A8E-CAE2-4F1F-B2F4-E9BD9B846E4F}" type="presParOf" srcId="{09BDDF38-02A3-46F0-94CF-D671EECCB993}" destId="{A0BD6892-BF4E-4D26-B32D-4AC8D13032DE}" srcOrd="0" destOrd="0" presId="urn:microsoft.com/office/officeart/2005/8/layout/process1"/>
-    <dgm:cxn modelId="{BB9E3D7C-0F58-4513-BC66-C09BDA9630AA}" type="presParOf" srcId="{2446BD26-396F-420D-B091-265286D97786}" destId="{449D7EB5-0D9D-4DAC-B391-FB2402C39ABC}" srcOrd="6" destOrd="0" presId="urn:microsoft.com/office/officeart/2005/8/layout/process1"/>
+    <dgm:cxn modelId="{B49D9CFE-ED69-4482-94AA-E6FF767AB5E6}" type="presOf" srcId="{6C124C00-0E2C-42A5-B356-FCFE12C422EE}" destId="{A5E00DF4-BEC8-4A62-B851-2A7F83FC9D35}" srcOrd="0" destOrd="0" presId="urn:microsoft.com/office/officeart/2005/8/layout/process1"/>
+    <dgm:cxn modelId="{DDEFC652-3897-445D-AC54-61224FCCB3E9}" type="presOf" srcId="{30AFFC78-5808-45ED-AAC6-491EC3980094}" destId="{F266C578-88AA-4EC2-8142-53A5B6139B0D}" srcOrd="0" destOrd="0" presId="urn:microsoft.com/office/officeart/2005/8/layout/process1"/>
+    <dgm:cxn modelId="{9F725EE1-1646-4121-8FF8-32EBA39D9AA1}" type="presOf" srcId="{E9687206-84AC-4F83-A6A2-9EFDC3ABD0FB}" destId="{72E9BEC7-D7FE-4BD7-BACA-0668A095A9EF}" srcOrd="0" destOrd="0" presId="urn:microsoft.com/office/officeart/2005/8/layout/process1"/>
+    <dgm:cxn modelId="{34C80B97-4D5D-4DF4-9950-DCAB4DB9B762}" type="presOf" srcId="{49728974-DA1C-46AA-A2B0-D3394453E5CC}" destId="{CF1E89C8-AA78-4B1C-8D7C-AA8E38C034CE}" srcOrd="0" destOrd="0" presId="urn:microsoft.com/office/officeart/2005/8/layout/process1"/>
+    <dgm:cxn modelId="{90FA9B74-4E13-4777-A9E1-C580A2B235C7}" type="presOf" srcId="{D8AAE93C-983F-46D6-ABF6-FC8E801A362E}" destId="{449D7EB5-0D9D-4DAC-B391-FB2402C39ABC}" srcOrd="0" destOrd="0" presId="urn:microsoft.com/office/officeart/2005/8/layout/process1"/>
+    <dgm:cxn modelId="{2DE0EDB0-0511-4692-B7FA-8C36B0A2060B}" type="presParOf" srcId="{2446BD26-396F-420D-B091-265286D97786}" destId="{F266C578-88AA-4EC2-8142-53A5B6139B0D}" srcOrd="0" destOrd="0" presId="urn:microsoft.com/office/officeart/2005/8/layout/process1"/>
+    <dgm:cxn modelId="{C9F056DD-FFE0-4A7E-ADBD-9E9C4FC2F965}" type="presParOf" srcId="{2446BD26-396F-420D-B091-265286D97786}" destId="{A5E00DF4-BEC8-4A62-B851-2A7F83FC9D35}" srcOrd="1" destOrd="0" presId="urn:microsoft.com/office/officeart/2005/8/layout/process1"/>
+    <dgm:cxn modelId="{A032C70D-B490-4252-B41A-419ECEA66B71}" type="presParOf" srcId="{A5E00DF4-BEC8-4A62-B851-2A7F83FC9D35}" destId="{AEA95148-3CF9-4188-ACFA-34C472C532BE}" srcOrd="0" destOrd="0" presId="urn:microsoft.com/office/officeart/2005/8/layout/process1"/>
+    <dgm:cxn modelId="{ED148CBB-9A90-467F-8143-AC449931AEE0}" type="presParOf" srcId="{2446BD26-396F-420D-B091-265286D97786}" destId="{CF1E89C8-AA78-4B1C-8D7C-AA8E38C034CE}" srcOrd="2" destOrd="0" presId="urn:microsoft.com/office/officeart/2005/8/layout/process1"/>
+    <dgm:cxn modelId="{5F7F27EE-7276-4BD7-BB9E-F45F082DA57E}" type="presParOf" srcId="{2446BD26-396F-420D-B091-265286D97786}" destId="{72E9BEC7-D7FE-4BD7-BACA-0668A095A9EF}" srcOrd="3" destOrd="0" presId="urn:microsoft.com/office/officeart/2005/8/layout/process1"/>
+    <dgm:cxn modelId="{8F9C0341-3637-4FB0-B9CE-43F1EF726345}" type="presParOf" srcId="{72E9BEC7-D7FE-4BD7-BACA-0668A095A9EF}" destId="{6E444586-2D87-4F9A-9400-F626352FE57E}" srcOrd="0" destOrd="0" presId="urn:microsoft.com/office/officeart/2005/8/layout/process1"/>
+    <dgm:cxn modelId="{89357453-E62E-420F-B904-BF6228DF436D}" type="presParOf" srcId="{2446BD26-396F-420D-B091-265286D97786}" destId="{37E28D18-C070-47FF-8301-A041A91EDEF2}" srcOrd="4" destOrd="0" presId="urn:microsoft.com/office/officeart/2005/8/layout/process1"/>
+    <dgm:cxn modelId="{52691A98-D732-4ADB-9B1D-04636DB47E02}" type="presParOf" srcId="{2446BD26-396F-420D-B091-265286D97786}" destId="{09BDDF38-02A3-46F0-94CF-D671EECCB993}" srcOrd="5" destOrd="0" presId="urn:microsoft.com/office/officeart/2005/8/layout/process1"/>
+    <dgm:cxn modelId="{C38B9506-D1E8-4CD6-9BF4-61643C7CE485}" type="presParOf" srcId="{09BDDF38-02A3-46F0-94CF-D671EECCB993}" destId="{A0BD6892-BF4E-4D26-B32D-4AC8D13032DE}" srcOrd="0" destOrd="0" presId="urn:microsoft.com/office/officeart/2005/8/layout/process1"/>
+    <dgm:cxn modelId="{8A732804-67AF-408F-81AA-E731D93424AD}" type="presParOf" srcId="{2446BD26-396F-420D-B091-265286D97786}" destId="{449D7EB5-0D9D-4DAC-B391-FB2402C39ABC}" srcOrd="6" destOrd="0" presId="urn:microsoft.com/office/officeart/2005/8/layout/process1"/>
   </dgm:cxnLst>
   <dgm:bg/>
   <dgm:whole/>

</xml_diff>